<commit_message>
Main and BF PDPs: page styles in a block at the top, so the old buy box doesn't flash on load
Co-Authored-By: Claude Opus 5.5 <noreply@anthropic.com>
Claude-Session: https://claude.ai/code/session_01VYMABjkorQn2QmgJS9ckGR
</commit_message>
<xml_diff>
--- a/handoff/MUTO_Dev_Handoff_Main_PDP_28Oct2026.docx
+++ b/handoff/MUTO_Dev_Handoff_Main_PDP_28Oct2026.docx
@@ -1894,22 +1894,22 @@
         <w:t xml:space="preserve"> </w:t>
       </w:r>
       <w:r>
-        <w:t xml:space="preserve">no gradient washes. The bands alternate flat grey (#F2F2F2) and white, set in a Custom Liquid block called</w:t>
-      </w:r>
-      <w:r>
-        <w:t xml:space="preserve"> </w:t>
-      </w:r>
-      <w:r>
-        <w:rPr>
-          <w:rStyle w:val="VerbatimChar"/>
-        </w:rPr>
-        <w:t xml:space="preserve">bands</w:t>
-      </w:r>
-      <w:r>
-        <w:t xml:space="preserve"> </w:t>
-      </w:r>
-      <w:r>
-        <w:t xml:space="preserve">at the end of the template.</w:t>
+        <w:t xml:space="preserve">no gradient washes. The bands alternate flat grey (#F2F2F2) and white, set in the</w:t>
+      </w:r>
+      <w:r>
+        <w:t xml:space="preserve"> </w:t>
+      </w:r>
+      <w:r>
+        <w:rPr>
+          <w:rStyle w:val="VerbatimChar"/>
+        </w:rPr>
+        <w:t xml:space="preserve">head_styles</w:t>
+      </w:r>
+      <w:r>
+        <w:t xml:space="preserve"> </w:t>
+      </w:r>
+      <w:r>
+        <w:t xml:space="preserve">block at the top of the template.</w:t>
       </w:r>
     </w:p>
     <w:p>
@@ -2047,7 +2047,38 @@
         <w:t xml:space="preserve"> </w:t>
       </w:r>
       <w:r>
-        <w:t xml:space="preserve">apart from the four new sections and their stylesheet. The page-specific styles and scripts are in the</w:t>
+        <w:t xml:space="preserve">apart from the four new sections and their stylesheet. The page’s own styles are in a Custom Liquid block called</w:t>
+      </w:r>
+      <w:r>
+        <w:t xml:space="preserve"> </w:t>
+      </w:r>
+      <w:r>
+        <w:rPr>
+          <w:rStyle w:val="VerbatimChar"/>
+        </w:rPr>
+        <w:t xml:space="preserve">head_styles</w:t>
+      </w:r>
+      <w:r>
+        <w:t xml:space="preserve"> </w:t>
+      </w:r>
+      <w:r>
+        <w:t xml:space="preserve">at the</w:t>
+      </w:r>
+      <w:r>
+        <w:t xml:space="preserve"> </w:t>
+      </w:r>
+      <w:r>
+        <w:rPr>
+          <w:bCs/>
+          <w:b/>
+        </w:rPr>
+        <w:t xml:space="preserve">top</w:t>
+      </w:r>
+      <w:r>
+        <w:t xml:space="preserve"> </w:t>
+      </w:r>
+      <w:r>
+        <w:t xml:space="preserve">of the template, so the buy box is styled from the first paint (with them at the bottom, the old design flashed on load). Its scripts stay in</w:t>
       </w:r>
       <w:r>
         <w:t xml:space="preserve"> </w:t>
@@ -2077,7 +2108,7 @@
         <w:t xml:space="preserve"> </w:t>
       </w:r>
       <w:r>
-        <w:t xml:space="preserve">Custom Liquid blocks.</w:t>
+        <w:t xml:space="preserve">at the bottom.</w:t>
       </w:r>
     </w:p>
     <w:p>

</xml_diff>

<commit_message>
Dev handover: green buy button and live delivery date
Co-Authored-By: Claude Opus 5.5 <noreply@anthropic.com>
Claude-Session: https://claude.ai/code/session_01VYMABjkorQn2QmgJS9ckGR
</commit_message>
<xml_diff>
--- a/handoff/MUTO_Dev_Handoff_Main_PDP_28Oct2026.docx
+++ b/handoff/MUTO_Dev_Handoff_Main_PDP_28Oct2026.docx
@@ -1873,6 +1873,103 @@
       </w:r>
       <w:r>
         <w:t xml:space="preserve">copy and the quote slider are blanked or hidden (not deleted).</w:t>
+      </w:r>
+    </w:p>
+    <w:p>
+      <w:pPr>
+        <w:numPr>
+          <w:ilvl w:val="0"/>
+          <w:numId w:val="1005"/>
+        </w:numPr>
+        <w:pStyle w:val="Compact"/>
+      </w:pPr>
+      <w:r>
+        <w:rPr>
+          <w:bCs/>
+          <w:b/>
+        </w:rPr>
+        <w:t xml:space="preserve">Buy button</w:t>
+      </w:r>
+      <w:r>
+        <w:t xml:space="preserve"> </w:t>
+      </w:r>
+      <w:r>
+        <w:t xml:space="preserve">(and the sticky bar’s) in brand green</w:t>
+      </w:r>
+      <w:r>
+        <w:t xml:space="preserve"> </w:t>
+      </w:r>
+      <w:r>
+        <w:rPr>
+          <w:bCs/>
+          <w:b/>
+        </w:rPr>
+        <w:t xml:space="preserve">#6BCE7F</w:t>
+      </w:r>
+      <w:r>
+        <w:t xml:space="preserve">, charcoal label.</w:t>
+      </w:r>
+    </w:p>
+    <w:p>
+      <w:pPr>
+        <w:numPr>
+          <w:ilvl w:val="0"/>
+          <w:numId w:val="1005"/>
+        </w:numPr>
+        <w:pStyle w:val="Compact"/>
+      </w:pPr>
+      <w:r>
+        <w:rPr>
+          <w:bCs/>
+          <w:b/>
+        </w:rPr>
+        <w:t xml:space="preserve">Delivery line</w:t>
+      </w:r>
+      <w:r>
+        <w:t xml:space="preserve"> </w:t>
+      </w:r>
+      <w:r>
+        <w:t xml:space="preserve">under the button:</w:t>
+      </w:r>
+      <w:r>
+        <w:t xml:space="preserve"> </w:t>
+      </w:r>
+      <w:r>
+        <w:t xml:space="preserve">“</w:t>
+      </w:r>
+      <w:r>
+        <w:t xml:space="preserve">● Ready to ship — arrives by</w:t>
+      </w:r>
+      <w:r>
+        <w:t xml:space="preserve"> </w:t>
+      </w:r>
+      <w:r>
+        <w:rPr>
+          <w:bCs/>
+          <w:b/>
+        </w:rPr>
+        <w:t xml:space="preserve">Thu 29th Oct</w:t>
+      </w:r>
+      <w:r>
+        <w:t xml:space="preserve">”</w:t>
+      </w:r>
+      <w:r>
+        <w:t xml:space="preserve">. The date is always the next calendar day in UK time, set by a script and rolling over at midnight. Before the script runs it says</w:t>
+      </w:r>
+      <w:r>
+        <w:t xml:space="preserve"> </w:t>
+      </w:r>
+      <w:r>
+        <w:t xml:space="preserve">“</w:t>
+      </w:r>
+      <w:r>
+        <w:t xml:space="preserve">arrives tomorrow</w:t>
+      </w:r>
+      <w:r>
+        <w:t xml:space="preserve">”</w:t>
+      </w:r>
+      <w:r>
+        <w:t xml:space="preserve">.</w:t>
       </w:r>
     </w:p>
     <w:p>

</xml_diff>

<commit_message>
Both PDPs: '90-day money-back guarantee' line inside Add to cart
Co-Authored-By: Claude Opus 5.5 <noreply@anthropic.com>
Claude-Session: https://claude.ai/code/session_01VYMABjkorQn2QmgJS9ckGR
</commit_message>
<xml_diff>
--- a/handoff/MUTO_Dev_Handoff_Main_PDP_28Oct2026.docx
+++ b/handoff/MUTO_Dev_Handoff_Main_PDP_28Oct2026.docx
@@ -1907,7 +1907,22 @@
         <w:t xml:space="preserve">#6BCE7F</w:t>
       </w:r>
       <w:r>
-        <w:t xml:space="preserve">, charcoal label.</w:t>
+        <w:t xml:space="preserve">, charcoal label, with a second line inside it: a shield and</w:t>
+      </w:r>
+      <w:r>
+        <w:t xml:space="preserve"> </w:t>
+      </w:r>
+      <w:r>
+        <w:t xml:space="preserve">“</w:t>
+      </w:r>
+      <w:r>
+        <w:t xml:space="preserve">90-day money-back guarantee</w:t>
+      </w:r>
+      <w:r>
+        <w:t xml:space="preserve">”</w:t>
+      </w:r>
+      <w:r>
+        <w:t xml:space="preserve">.</w:t>
       </w:r>
     </w:p>
     <w:p>

</xml_diff>

<commit_message>
Both PDPs: rotating customer stats under Add to cart
Co-Authored-By: Claude Opus 5.5 <noreply@anthropic.com>
Claude-Session: https://claude.ai/code/session_01VYMABjkorQn2QmgJS9ckGR
</commit_message>
<xml_diff>
--- a/handoff/MUTO_Dev_Handoff_Main_PDP_28Oct2026.docx
+++ b/handoff/MUTO_Dev_Handoff_Main_PDP_28Oct2026.docx
@@ -1920,6 +1920,100 @@
       </w:r>
       <w:r>
         <w:t xml:space="preserve">”</w:t>
+      </w:r>
+      <w:r>
+        <w:t xml:space="preserve">.</w:t>
+      </w:r>
+    </w:p>
+    <w:p>
+      <w:pPr>
+        <w:numPr>
+          <w:ilvl w:val="0"/>
+          <w:numId w:val="1005"/>
+        </w:numPr>
+        <w:pStyle w:val="Compact"/>
+      </w:pPr>
+      <w:r>
+        <w:rPr>
+          <w:bCs/>
+          <w:b/>
+        </w:rPr>
+        <w:t xml:space="preserve">Rotating stats</w:t>
+      </w:r>
+      <w:r>
+        <w:t xml:space="preserve"> </w:t>
+      </w:r>
+      <w:r>
+        <w:t xml:space="preserve">under the button, every 3.5 seconds:</w:t>
+      </w:r>
+      <w:r>
+        <w:t xml:space="preserve"> </w:t>
+      </w:r>
+      <w:r>
+        <w:t xml:space="preserve">“</w:t>
+      </w:r>
+      <w:r>
+        <w:t xml:space="preserve">94% reported better recovery</w:t>
+      </w:r>
+      <w:r>
+        <w:t xml:space="preserve">”</w:t>
+      </w:r>
+      <w:r>
+        <w:t xml:space="preserve">,</w:t>
+      </w:r>
+      <w:r>
+        <w:t xml:space="preserve"> </w:t>
+      </w:r>
+      <w:r>
+        <w:t xml:space="preserve">“</w:t>
+      </w:r>
+      <w:r>
+        <w:t xml:space="preserve">92% reported improved energy</w:t>
+      </w:r>
+      <w:r>
+        <w:t xml:space="preserve">”</w:t>
+      </w:r>
+      <w:r>
+        <w:t xml:space="preserve">,</w:t>
+      </w:r>
+      <w:r>
+        <w:t xml:space="preserve"> </w:t>
+      </w:r>
+      <w:r>
+        <w:t xml:space="preserve">“</w:t>
+      </w:r>
+      <w:r>
+        <w:t xml:space="preserve">93% bounce back quicker</w:t>
+      </w:r>
+      <w:r>
+        <w:t xml:space="preserve">”</w:t>
+      </w:r>
+      <w:r>
+        <w:t xml:space="preserve">, with a green bar that fills to each figure. Set in</w:t>
+      </w:r>
+      <w:r>
+        <w:t xml:space="preserve"> </w:t>
+      </w:r>
+      <w:r>
+        <w:rPr>
+          <w:rStyle w:val="VerbatimChar"/>
+        </w:rPr>
+        <w:t xml:space="preserve">STATS</w:t>
+      </w:r>
+      <w:r>
+        <w:t xml:space="preserve"> </w:t>
+      </w:r>
+      <w:r>
+        <w:t xml:space="preserve">in</w:t>
+      </w:r>
+      <w:r>
+        <w:t xml:space="preserve"> </w:t>
+      </w:r>
+      <w:r>
+        <w:rPr>
+          <w:rStyle w:val="VerbatimChar"/>
+        </w:rPr>
+        <w:t xml:space="preserve">make_trust.py</w:t>
       </w:r>
       <w:r>
         <w:t xml:space="preserve">.</w:t>

</xml_diff>

<commit_message>
Both PDPs: 'In collaboration with seven leading scientists' line under the subhead
Co-Authored-By: Claude Opus 5.5 <noreply@anthropic.com>
Claude-Session: https://claude.ai/code/session_01VYMABjkorQn2QmgJS9ckGR
</commit_message>
<xml_diff>
--- a/handoff/MUTO_Dev_Handoff_Main_PDP_28Oct2026.docx
+++ b/handoff/MUTO_Dev_Handoff_Main_PDP_28Oct2026.docx
@@ -1923,6 +1923,34 @@
       </w:r>
       <w:r>
         <w:t xml:space="preserve">.</w:t>
+      </w:r>
+    </w:p>
+    <w:p>
+      <w:pPr>
+        <w:numPr>
+          <w:ilvl w:val="0"/>
+          <w:numId w:val="1005"/>
+        </w:numPr>
+        <w:pStyle w:val="Compact"/>
+      </w:pPr>
+      <w:r>
+        <w:rPr>
+          <w:bCs/>
+          <w:b/>
+        </w:rPr>
+        <w:t xml:space="preserve">Under the subhead:</w:t>
+      </w:r>
+      <w:r>
+        <w:t xml:space="preserve"> </w:t>
+      </w:r>
+      <w:r>
+        <w:t xml:space="preserve">“</w:t>
+      </w:r>
+      <w:r>
+        <w:t xml:space="preserve">In collaboration with seven leading scientists from world-leading research institutions.</w:t>
+      </w:r>
+      <w:r>
+        <w:t xml:space="preserve">”</w:t>
       </w:r>
     </w:p>
     <w:p>

</xml_diff>

<commit_message>
Main and BF PDPs: no sticky add-to-cart bar; handover adds announcement-bar step
Co-Authored-By: Claude Opus 5.5 <noreply@anthropic.com>
Claude-Session: https://claude.ai/code/session_01VYMABjkorQn2QmgJS9ckGR
</commit_message>
<xml_diff>
--- a/handoff/MUTO_Dev_Handoff_Main_PDP_28Oct2026.docx
+++ b/handoff/MUTO_Dev_Handoff_Main_PDP_28Oct2026.docx
@@ -149,7 +149,7 @@
         <w:t xml:space="preserve">template changes on 2 products</w:t>
       </w:r>
       <w:r>
-        <w:t xml:space="preserve">, and</w:t>
+        <w:t xml:space="preserve">,</w:t>
       </w:r>
       <w:r>
         <w:t xml:space="preserve"> </w:t>
@@ -160,6 +160,22 @@
           <w:b/>
         </w:rPr>
         <w:t xml:space="preserve">removing the pre-sale box from 3 live templates</w:t>
+      </w:r>
+      <w:r>
+        <w:t xml:space="preserve"> </w:t>
+      </w:r>
+      <w:r>
+        <w:t xml:space="preserve">and</w:t>
+      </w:r>
+      <w:r>
+        <w:t xml:space="preserve"> </w:t>
+      </w:r>
+      <w:r>
+        <w:rPr>
+          <w:bCs/>
+          <w:b/>
+        </w:rPr>
+        <w:t xml:space="preserve">2 announcement-bar messages to take down</w:t>
       </w:r>
       <w:r>
         <w:t xml:space="preserve">. No existing theme file is overwritten.</w:t>
@@ -861,18 +877,6 @@
         <w:t xml:space="preserve">custom-reviews</w:t>
       </w:r>
       <w:r>
-        <w:t xml:space="preserve">,</w:t>
-      </w:r>
-      <w:r>
-        <w:t xml:space="preserve"> </w:t>
-      </w:r>
-      <w:r>
-        <w:rPr>
-          <w:rStyle w:val="VerbatimChar"/>
-        </w:rPr>
-        <w:t xml:space="preserve">muto-home-sticky</w:t>
-      </w:r>
-      <w:r>
         <w:t xml:space="preserve">.</w:t>
       </w:r>
     </w:p>
@@ -1473,7 +1477,139 @@
       </w:r>
     </w:p>
     <w:bookmarkEnd w:id="24"/>
-    <w:bookmarkStart w:id="26" w:name="whats-on-the-new-page"/>
+    <w:bookmarkStart w:id="25" w:name="step-4-the-announcement-bar"/>
+    <w:p>
+      <w:pPr>
+        <w:pStyle w:val="Heading1"/>
+      </w:pPr>
+      <w:r>
+        <w:t xml:space="preserve">Step 4: the announcement bar</w:t>
+      </w:r>
+    </w:p>
+    <w:p>
+      <w:pPr>
+        <w:pStyle w:val="FirstParagraph"/>
+      </w:pPr>
+      <w:r>
+        <w:t xml:space="preserve">The scrolling announcement bar at the top of every page (section</w:t>
+      </w:r>
+      <w:r>
+        <w:t xml:space="preserve"> </w:t>
+      </w:r>
+      <w:r>
+        <w:rPr>
+          <w:rStyle w:val="VerbatimChar"/>
+        </w:rPr>
+        <w:t xml:space="preserve">muto-announce</w:t>
+      </w:r>
+      <w:r>
+        <w:t xml:space="preserve"> </w:t>
+      </w:r>
+      <w:r>
+        <w:t xml:space="preserve">in the header group) still advertises the ended offer:</w:t>
+      </w:r>
+      <w:r>
+        <w:t xml:space="preserve"> </w:t>
+      </w:r>
+      <w:r>
+        <w:rPr>
+          <w:bCs/>
+          <w:b/>
+        </w:rPr>
+        <w:t xml:space="preserve">“</w:t>
+      </w:r>
+      <w:r>
+        <w:rPr>
+          <w:bCs/>
+          <w:b/>
+        </w:rPr>
+        <w:t xml:space="preserve">EXTRA 10% OFF OUR QUARTERLY PLAN</w:t>
+      </w:r>
+      <w:r>
+        <w:rPr>
+          <w:bCs/>
+          <w:b/>
+        </w:rPr>
+        <w:t xml:space="preserve">”</w:t>
+      </w:r>
+      <w:r>
+        <w:t xml:space="preserve"> </w:t>
+      </w:r>
+      <w:r>
+        <w:t xml:space="preserve">and</w:t>
+      </w:r>
+      <w:r>
+        <w:t xml:space="preserve"> </w:t>
+      </w:r>
+      <w:r>
+        <w:rPr>
+          <w:bCs/>
+          <w:b/>
+        </w:rPr>
+        <w:t xml:space="preserve">“</w:t>
+      </w:r>
+      <w:r>
+        <w:rPr>
+          <w:bCs/>
+          <w:b/>
+        </w:rPr>
+        <w:t xml:space="preserve">ENDS ON 28.10.26</w:t>
+      </w:r>
+      <w:r>
+        <w:rPr>
+          <w:bCs/>
+          <w:b/>
+        </w:rPr>
+        <w:t xml:space="preserve">”</w:t>
+      </w:r>
+      <w:r>
+        <w:t xml:space="preserve">. Remove those two messages (Customize → Header → announcement bar). The other three (</w:t>
+      </w:r>
+      <w:r>
+        <w:t xml:space="preserve">“</w:t>
+      </w:r>
+      <w:r>
+        <w:t xml:space="preserve">LIMITED NEW CUSTOMER OFFER</w:t>
+      </w:r>
+      <w:r>
+        <w:t xml:space="preserve">”</w:t>
+      </w:r>
+      <w:r>
+        <w:t xml:space="preserve">,</w:t>
+      </w:r>
+      <w:r>
+        <w:t xml:space="preserve"> </w:t>
+      </w:r>
+      <w:r>
+        <w:t xml:space="preserve">“</w:t>
+      </w:r>
+      <w:r>
+        <w:t xml:space="preserve">£77 OF FREE GIFTS WITH EACH ORDER</w:t>
+      </w:r>
+      <w:r>
+        <w:t xml:space="preserve">”</w:t>
+      </w:r>
+      <w:r>
+        <w:t xml:space="preserve">,</w:t>
+      </w:r>
+      <w:r>
+        <w:t xml:space="preserve"> </w:t>
+      </w:r>
+      <w:r>
+        <w:t xml:space="preserve">“</w:t>
+      </w:r>
+      <w:r>
+        <w:t xml:space="preserve">FREE ULTRAPURE CREATINE, BOTTLE, SOCKS, JAR, EBOOK</w:t>
+      </w:r>
+      <w:r>
+        <w:t xml:space="preserve">”</w:t>
+      </w:r>
+      <w:r>
+        <w:t xml:space="preserve">) can stay.</w:t>
+      </w:r>
+    </w:p>
+    <w:bookmarkEnd w:id="25"/>
+    <w:bookmarkStart w:id="27" w:name="whats-on-the-new-page"/>
     <w:p>
       <w:pPr>
         <w:pStyle w:val="Heading1"/>
@@ -1894,7 +2030,7 @@
         <w:t xml:space="preserve"> </w:t>
       </w:r>
       <w:r>
-        <w:t xml:space="preserve">(and the sticky bar’s) in brand green</w:t>
+        <w:t xml:space="preserve">in brand green</w:t>
       </w:r>
       <w:r>
         <w:t xml:space="preserve"> </w:t>
@@ -2122,28 +2258,28 @@
           <w:bCs/>
           <w:b/>
         </w:rPr>
-        <w:t xml:space="preserve">Backgrounds:</w:t>
-      </w:r>
-      <w:r>
-        <w:t xml:space="preserve"> </w:t>
-      </w:r>
-      <w:r>
-        <w:t xml:space="preserve">no gradient washes. The bands alternate flat grey (#F2F2F2) and white, set in the</w:t>
-      </w:r>
-      <w:r>
-        <w:t xml:space="preserve"> </w:t>
-      </w:r>
-      <w:r>
-        <w:rPr>
-          <w:rStyle w:val="VerbatimChar"/>
-        </w:rPr>
-        <w:t xml:space="preserve">head_styles</w:t>
-      </w:r>
-      <w:r>
-        <w:t xml:space="preserve"> </w:t>
-      </w:r>
-      <w:r>
-        <w:t xml:space="preserve">block at the top of the template.</w:t>
+        <w:t xml:space="preserve">No sticky add-to-cart bar.</w:t>
+      </w:r>
+      <w:r>
+        <w:t xml:space="preserve"> </w:t>
+      </w:r>
+      <w:r>
+        <w:t xml:space="preserve">The</w:t>
+      </w:r>
+      <w:r>
+        <w:t xml:space="preserve"> </w:t>
+      </w:r>
+      <w:r>
+        <w:rPr>
+          <w:rStyle w:val="VerbatimChar"/>
+        </w:rPr>
+        <w:t xml:space="preserve">sticky</w:t>
+      </w:r>
+      <w:r>
+        <w:t xml:space="preserve"> </w:t>
+      </w:r>
+      <w:r>
+        <w:t xml:space="preserve">section isn’t in this template, so nothing slides in at the top or bottom of the page as you scroll.</w:t>
       </w:r>
     </w:p>
     <w:p>
@@ -2159,6 +2295,43 @@
           <w:bCs/>
           <w:b/>
         </w:rPr>
+        <w:t xml:space="preserve">Backgrounds:</w:t>
+      </w:r>
+      <w:r>
+        <w:t xml:space="preserve"> </w:t>
+      </w:r>
+      <w:r>
+        <w:t xml:space="preserve">no gradient washes. The bands alternate flat grey (#F2F2F2) and white, set in the</w:t>
+      </w:r>
+      <w:r>
+        <w:t xml:space="preserve"> </w:t>
+      </w:r>
+      <w:r>
+        <w:rPr>
+          <w:rStyle w:val="VerbatimChar"/>
+        </w:rPr>
+        <w:t xml:space="preserve">head_styles</w:t>
+      </w:r>
+      <w:r>
+        <w:t xml:space="preserve"> </w:t>
+      </w:r>
+      <w:r>
+        <w:t xml:space="preserve">block at the top of the template.</w:t>
+      </w:r>
+    </w:p>
+    <w:p>
+      <w:pPr>
+        <w:numPr>
+          <w:ilvl w:val="0"/>
+          <w:numId w:val="1005"/>
+        </w:numPr>
+        <w:pStyle w:val="Compact"/>
+      </w:pPr>
+      <w:r>
+        <w:rPr>
+          <w:bCs/>
+          <w:b/>
+        </w:rPr>
         <w:t xml:space="preserve">Not carried over from</w:t>
       </w:r>
       <w:r>
@@ -2253,7 +2426,7 @@
         <w:t xml:space="preserve">if they’re wanted back.</w:t>
       </w:r>
     </w:p>
-    <w:bookmarkStart w:id="25" w:name="how-its-built"/>
+    <w:bookmarkStart w:id="26" w:name="how-its-built"/>
     <w:p>
       <w:pPr>
         <w:pStyle w:val="Heading2"/>
@@ -2376,9 +2549,9 @@
         <w:t xml:space="preserve">builds the template. Change copy there and rebuild rather than editing by hand, or tell Richie about manual edits so they aren’t lost on the next rebuild.</w:t>
       </w:r>
     </w:p>
-    <w:bookmarkEnd w:id="25"/>
     <w:bookmarkEnd w:id="26"/>
-    <w:bookmarkStart w:id="27" w:name="check-after-publishing"/>
+    <w:bookmarkEnd w:id="27"/>
+    <w:bookmarkStart w:id="28" w:name="check-after-publishing"/>
     <w:p>
       <w:pPr>
         <w:pStyle w:val="Heading1"/>
@@ -2615,6 +2788,28 @@
           <w:bCs/>
           <w:b/>
         </w:rPr>
+        <w:t xml:space="preserve">No sticky bar</w:t>
+      </w:r>
+      <w:r>
+        <w:t xml:space="preserve"> </w:t>
+      </w:r>
+      <w:r>
+        <w:t xml:space="preserve">appears as you scroll the page.</w:t>
+      </w:r>
+    </w:p>
+    <w:p>
+      <w:pPr>
+        <w:numPr>
+          <w:ilvl w:val="0"/>
+          <w:numId w:val="1007"/>
+        </w:numPr>
+        <w:pStyle w:val="Compact"/>
+      </w:pPr>
+      <w:r>
+        <w:rPr>
+          <w:bCs/>
+          <w:b/>
+        </w:rPr>
         <w:t xml:space="preserve">-3 and any page on</w:t>
       </w:r>
       <w:r>
@@ -2646,7 +2841,65 @@
         <w:t xml:space="preserve">no Black Friday box (step 3).</w:t>
       </w:r>
     </w:p>
-    <w:bookmarkEnd w:id="27"/>
+    <w:p>
+      <w:pPr>
+        <w:numPr>
+          <w:ilvl w:val="0"/>
+          <w:numId w:val="1007"/>
+        </w:numPr>
+        <w:pStyle w:val="Compact"/>
+      </w:pPr>
+      <w:r>
+        <w:rPr>
+          <w:bCs/>
+          <w:b/>
+        </w:rPr>
+        <w:t xml:space="preserve">Announcement bar:</w:t>
+      </w:r>
+      <w:r>
+        <w:t xml:space="preserve"> </w:t>
+      </w:r>
+      <w:r>
+        <w:t xml:space="preserve">no</w:t>
+      </w:r>
+      <w:r>
+        <w:t xml:space="preserve"> </w:t>
+      </w:r>
+      <w:r>
+        <w:t xml:space="preserve">“</w:t>
+      </w:r>
+      <w:r>
+        <w:t xml:space="preserve">extra 10% off</w:t>
+      </w:r>
+      <w:r>
+        <w:t xml:space="preserve">”</w:t>
+      </w:r>
+      <w:r>
+        <w:t xml:space="preserve"> </w:t>
+      </w:r>
+      <w:r>
+        <w:t xml:space="preserve">or</w:t>
+      </w:r>
+      <w:r>
+        <w:t xml:space="preserve"> </w:t>
+      </w:r>
+      <w:r>
+        <w:t xml:space="preserve">“</w:t>
+      </w:r>
+      <w:r>
+        <w:t xml:space="preserve">ends on 28.10.26</w:t>
+      </w:r>
+      <w:r>
+        <w:t xml:space="preserve">”</w:t>
+      </w:r>
+      <w:r>
+        <w:t xml:space="preserve"> </w:t>
+      </w:r>
+      <w:r>
+        <w:t xml:space="preserve">(step 4).</w:t>
+      </w:r>
+    </w:p>
+    <w:bookmarkEnd w:id="28"/>
     <w:sectPr/>
   </w:body>
 </w:document>

</xml_diff>

<commit_message>
Delivery line: Royal Mail Tracked 24hr with logo, 9pm cut-off; BF counter 'out of 500 remaining'
Co-Authored-By: Claude Opus 5.5 <noreply@anthropic.com>
Claude-Session: https://claude.ai/code/session_01VYMABjkorQn2QmgJS9ckGR
</commit_message>
<xml_diff>
--- a/handoff/MUTO_Dev_Handoff_Main_PDP_28Oct2026.docx
+++ b/handoff/MUTO_Dev_Handoff_Main_PDP_28Oct2026.docx
@@ -2224,10 +2224,29 @@
         <w:t xml:space="preserve">Thu 29th Oct</w:t>
       </w:r>
       <w:r>
+        <w:t xml:space="preserve"> </w:t>
+      </w:r>
+      <w:r>
+        <w:t xml:space="preserve">| [Royal Mail logo] Tracked 24hr delivery</w:t>
+      </w:r>
+      <w:r>
         <w:t xml:space="preserve">”</w:t>
       </w:r>
       <w:r>
-        <w:t xml:space="preserve">. The date is always the next calendar day in UK time, set by a script and rolling over at midnight. Before the script runs it says</w:t>
+        <w:t xml:space="preserve">. The date is the next calendar day in UK time, or the day after from the</w:t>
+      </w:r>
+      <w:r>
+        <w:t xml:space="preserve"> </w:t>
+      </w:r>
+      <w:r>
+        <w:rPr>
+          <w:bCs/>
+          <w:b/>
+        </w:rPr>
+        <w:t xml:space="preserve">9pm cut-off</w:t>
+      </w:r>
+      <w:r>
+        <w:t xml:space="preserve">, set by a script that updates while the page is open. Before the script runs it says</w:t>
       </w:r>
       <w:r>
         <w:t xml:space="preserve"> </w:t>
@@ -2242,7 +2261,19 @@
         <w:t xml:space="preserve">”</w:t>
       </w:r>
       <w:r>
-        <w:t xml:space="preserve">.</w:t>
+        <w:t xml:space="preserve">. The logo is</w:t>
+      </w:r>
+      <w:r>
+        <w:t xml:space="preserve"> </w:t>
+      </w:r>
+      <w:r>
+        <w:rPr>
+          <w:rStyle w:val="VerbatimChar"/>
+        </w:rPr>
+        <w:t xml:space="preserve">theme/assets/royal-mail-logo.png</w:t>
+      </w:r>
+      <w:r>
+        <w:t xml:space="preserve">, embedded in the template (nothing to upload).</w:t>
       </w:r>
     </w:p>
     <w:p>

</xml_diff>

<commit_message>
Mobile: delivery line centred; 'How it helps' list hidden
Co-Authored-By: Claude Opus 5.5 <noreply@anthropic.com>
Claude-Session: https://claude.ai/code/session_01VYMABjkorQn2QmgJS9ckGR
</commit_message>
<xml_diff>
--- a/handoff/MUTO_Dev_Handoff_Main_PDP_28Oct2026.docx
+++ b/handoff/MUTO_Dev_Handoff_Main_PDP_28Oct2026.docx
@@ -2274,6 +2274,56 @@
       </w:r>
       <w:r>
         <w:t xml:space="preserve">, embedded in the template (nothing to upload).</w:t>
+      </w:r>
+    </w:p>
+    <w:p>
+      <w:pPr>
+        <w:numPr>
+          <w:ilvl w:val="0"/>
+          <w:numId w:val="1005"/>
+        </w:numPr>
+        <w:pStyle w:val="Compact"/>
+      </w:pPr>
+      <w:r>
+        <w:rPr>
+          <w:bCs/>
+          <w:b/>
+        </w:rPr>
+        <w:t xml:space="preserve">“</w:t>
+      </w:r>
+      <w:r>
+        <w:rPr>
+          <w:bCs/>
+          <w:b/>
+        </w:rPr>
+        <w:t xml:space="preserve">How it helps</w:t>
+      </w:r>
+      <w:r>
+        <w:rPr>
+          <w:bCs/>
+          <w:b/>
+        </w:rPr>
+        <w:t xml:space="preserve">”</w:t>
+      </w:r>
+      <w:r>
+        <w:rPr>
+          <w:bCs/>
+          <w:b/>
+        </w:rPr>
+        <w:t xml:space="preserve"> </w:t>
+      </w:r>
+      <w:r>
+        <w:rPr>
+          <w:bCs/>
+          <w:b/>
+        </w:rPr>
+        <w:t xml:space="preserve">list</w:t>
+      </w:r>
+      <w:r>
+        <w:t xml:space="preserve"> </w:t>
+      </w:r>
+      <w:r>
+        <w:t xml:space="preserve">in the buy box is hidden on phones as well as desktop.</w:t>
       </w:r>
     </w:p>
     <w:p>

</xml_diff>

<commit_message>
Dev handover: final main PDP (phones, founder, video footnote)
Co-Authored-By: Claude Opus 5.5 <noreply@anthropic.com>
Claude-Session: https://claude.ai/code/session_01VYMABjkorQn2QmgJS9ckGR
</commit_message>
<xml_diff>
--- a/handoff/MUTO_Dev_Handoff_Main_PDP_28Oct2026.docx
+++ b/handoff/MUTO_Dev_Handoff_Main_PDP_28Oct2026.docx
@@ -1789,7 +1789,7 @@
         <w:t xml:space="preserve">”</w:t>
       </w:r>
       <w:r>
-        <w:t xml:space="preserve">, 8 videos in a row that scrolls: Kate Bright, David Mercado, Lucy Halliday, Harry Insley, Adam Facey, Max Richards, Adam Hamilton, Yolanda King. Ellen Gray’s video is removed.</w:t>
+        <w:t xml:space="preserve">, 8 videos in a row that scrolls: Kate Bright, David Mercado, Lucy Halliday, Harry Insley, Adam Facey, Max Richards, Adam Hamilton, Yolanda King. Ellen Gray’s video is removed, and so is the footnote under the row.</w:t>
       </w:r>
     </w:p>
     <w:p>
@@ -1857,7 +1857,7 @@
         <w:t xml:space="preserve"> </w:t>
       </w:r>
       <w:r>
-        <w:t xml:space="preserve">Dr Richie Barclay, PhD.</w:t>
+        <w:t xml:space="preserve">Dr Richie Barclay, PhD: cell biologist, Harley Street nutritionist for 13 years, former cricketer and tennis player.</w:t>
       </w:r>
     </w:p>
     <w:p>
@@ -2324,6 +2324,28 @@
       </w:r>
       <w:r>
         <w:t xml:space="preserve">in the buy box is hidden on phones as well as desktop.</w:t>
+      </w:r>
+    </w:p>
+    <w:p>
+      <w:pPr>
+        <w:numPr>
+          <w:ilvl w:val="0"/>
+          <w:numId w:val="1005"/>
+        </w:numPr>
+        <w:pStyle w:val="Compact"/>
+      </w:pPr>
+      <w:r>
+        <w:rPr>
+          <w:bCs/>
+          <w:b/>
+        </w:rPr>
+        <w:t xml:space="preserve">Phones:</w:t>
+      </w:r>
+      <w:r>
+        <w:t xml:space="preserve"> </w:t>
+      </w:r>
+      <w:r>
+        <w:t xml:space="preserve">the billing line under each plan name is smaller (12px) so it fits, and the delivery line is centred.</w:t>
       </w:r>
     </w:p>
     <w:p>

</xml_diff>

<commit_message>
Main PDP handover: page now keeps every muto-nad-v2 section
Co-Authored-By: Claude Opus 5.5 <noreply@anthropic.com>
Claude-Session: https://claude.ai/code/session_01VYMABjkorQn2QmgJS9ckGR
</commit_message>
<xml_diff>
--- a/handoff/MUTO_Dev_Handoff_Main_PDP_28Oct2026.docx
+++ b/handoff/MUTO_Dev_Handoff_Main_PDP_28Oct2026.docx
@@ -115,7 +115,70 @@
         <w:t xml:space="preserve">muto-nad-trust</w:t>
       </w:r>
       <w:r>
-        <w:t xml:space="preserve">. The buy box is the one on the site today. Below it are new blocks: the science board, standards, customer videos, reviews and the founder. The Black Friday pre-sale box and its MUTO10 code are removed.</w:t>
+        <w:t xml:space="preserve">. It is today’s</w:t>
+      </w:r>
+      <w:r>
+        <w:t xml:space="preserve"> </w:t>
+      </w:r>
+      <w:r>
+        <w:rPr>
+          <w:rStyle w:val="VerbatimChar"/>
+        </w:rPr>
+        <w:t xml:space="preserve">muto-nad-v2</w:t>
+      </w:r>
+      <w:r>
+        <w:t xml:space="preserve"> </w:t>
+      </w:r>
+      <w:r>
+        <w:t xml:space="preserve">page, with every section kept: buy box,</w:t>
+      </w:r>
+      <w:r>
+        <w:t xml:space="preserve"> </w:t>
+      </w:r>
+      <w:r>
+        <w:t xml:space="preserve">“</w:t>
+      </w:r>
+      <w:r>
+        <w:t xml:space="preserve">On this page</w:t>
+      </w:r>
+      <w:r>
+        <w:t xml:space="preserve">”</w:t>
+      </w:r>
+      <w:r>
+        <w:t xml:space="preserve"> </w:t>
+      </w:r>
+      <w:r>
+        <w:t xml:space="preserve">menu,</w:t>
+      </w:r>
+      <w:r>
+        <w:t xml:space="preserve"> </w:t>
+      </w:r>
+      <w:r>
+        <w:t xml:space="preserve">“</w:t>
+      </w:r>
+      <w:r>
+        <w:t xml:space="preserve">Five jobs. One daily jar.</w:t>
+      </w:r>
+      <w:r>
+        <w:t xml:space="preserve">”</w:t>
+      </w:r>
+      <w:r>
+        <w:t xml:space="preserve">, the ingredient library, comparison, timeline,</w:t>
+      </w:r>
+      <w:r>
+        <w:t xml:space="preserve"> </w:t>
+      </w:r>
+      <w:r>
+        <w:t xml:space="preserve">“</w:t>
+      </w:r>
+      <w:r>
+        <w:t xml:space="preserve">How to take it</w:t>
+      </w:r>
+      <w:r>
+        <w:t xml:space="preserve">”</w:t>
+      </w:r>
+      <w:r>
+        <w:t xml:space="preserve">, FAQs. New blocks slot in between: the statement, the science board, standards, customer videos, reviews and the founder. The Black Friday pre-sale box and its MUTO10 code are removed.</w:t>
       </w:r>
     </w:p>
     <w:p>
@@ -319,7 +382,49 @@
         <w:t xml:space="preserve"> </w:t>
       </w:r>
       <w:r>
-        <w:t xml:space="preserve">The buy box, its</w:t>
+        <w:t xml:space="preserve">Everything except the new blocks is copied from the</w:t>
+      </w:r>
+      <w:r>
+        <w:t xml:space="preserve"> </w:t>
+      </w:r>
+      <w:r>
+        <w:rPr>
+          <w:bCs/>
+          <w:b/>
+        </w:rPr>
+        <w:t xml:space="preserve">live</w:t>
+      </w:r>
+      <w:r>
+        <w:rPr>
+          <w:bCs/>
+          <w:b/>
+        </w:rPr>
+        <w:t xml:space="preserve"> </w:t>
+      </w:r>
+      <w:r>
+        <w:rPr>
+          <w:rStyle w:val="VerbatimChar"/>
+          <w:bCs/>
+          <w:b/>
+        </w:rPr>
+        <w:t xml:space="preserve">muto-nad-v2</w:t>
+      </w:r>
+      <w:r>
+        <w:rPr>
+          <w:bCs/>
+          <w:b/>
+        </w:rPr>
+        <w:t xml:space="preserve"> </w:t>
+      </w:r>
+      <w:r>
+        <w:rPr>
+          <w:bCs/>
+          <w:b/>
+        </w:rPr>
+        <w:t xml:space="preserve">template as of 28 October</w:t>
+      </w:r>
+      <w:r>
+        <w:t xml:space="preserve">: the buy box and its</w:t>
       </w:r>
       <w:r>
         <w:t xml:space="preserve"> </w:t>
@@ -334,49 +439,22 @@
         <w:t xml:space="preserve"> </w:t>
       </w:r>
       <w:r>
-        <w:t xml:space="preserve">block, the comparison table and the test-results panel are copied from the</w:t>
-      </w:r>
-      <w:r>
-        <w:t xml:space="preserve"> </w:t>
-      </w:r>
-      <w:r>
-        <w:rPr>
-          <w:bCs/>
-          <w:b/>
-        </w:rPr>
-        <w:t xml:space="preserve">live</w:t>
-      </w:r>
-      <w:r>
-        <w:rPr>
-          <w:bCs/>
-          <w:b/>
-        </w:rPr>
-        <w:t xml:space="preserve"> </w:t>
-      </w:r>
-      <w:r>
-        <w:rPr>
-          <w:rStyle w:val="VerbatimChar"/>
-          <w:bCs/>
-          <w:b/>
-        </w:rPr>
-        <w:t xml:space="preserve">muto-nad-v2</w:t>
-      </w:r>
-      <w:r>
-        <w:rPr>
-          <w:bCs/>
-          <w:b/>
-        </w:rPr>
-        <w:t xml:space="preserve"> </w:t>
-      </w:r>
-      <w:r>
-        <w:rPr>
-          <w:bCs/>
-          <w:b/>
-        </w:rPr>
-        <w:t xml:space="preserve">template as of 28 October</w:t>
-      </w:r>
-      <w:r>
-        <w:t xml:space="preserve">. If you’ve edited</w:t>
+        <w:t xml:space="preserve">block, the menu, benefits, ingredient library, comparison, timeline,</w:t>
+      </w:r>
+      <w:r>
+        <w:t xml:space="preserve"> </w:t>
+      </w:r>
+      <w:r>
+        <w:t xml:space="preserve">“</w:t>
+      </w:r>
+      <w:r>
+        <w:t xml:space="preserve">How to take it</w:t>
+      </w:r>
+      <w:r>
+        <w:t xml:space="preserve">”</w:t>
+      </w:r>
+      <w:r>
+        <w:t xml:space="preserve">, the FAQs and the test-results panel. If you’ve edited</w:t>
       </w:r>
       <w:r>
         <w:t xml:space="preserve"> </w:t>
@@ -754,6 +832,30 @@
         <w:rPr>
           <w:rStyle w:val="VerbatimChar"/>
         </w:rPr>
+        <w:t xml:space="preserve">muto-section-nav</w:t>
+      </w:r>
+      <w:r>
+        <w:t xml:space="preserve">,</w:t>
+      </w:r>
+      <w:r>
+        <w:t xml:space="preserve"> </w:t>
+      </w:r>
+      <w:r>
+        <w:rPr>
+          <w:rStyle w:val="VerbatimChar"/>
+        </w:rPr>
+        <w:t xml:space="preserve">muto-benefit-cards</w:t>
+      </w:r>
+      <w:r>
+        <w:t xml:space="preserve">,</w:t>
+      </w:r>
+      <w:r>
+        <w:t xml:space="preserve"> </w:t>
+      </w:r>
+      <w:r>
+        <w:rPr>
+          <w:rStyle w:val="VerbatimChar"/>
+        </w:rPr>
         <w:t xml:space="preserve">muto-home-board</w:t>
       </w:r>
       <w:r>
@@ -766,115 +868,79 @@
         <w:rPr>
           <w:rStyle w:val="VerbatimChar"/>
         </w:rPr>
+        <w:t xml:space="preserve">muto-ingredient-library</w:t>
+      </w:r>
+      <w:r>
+        <w:t xml:space="preserve">,</w:t>
+      </w:r>
+      <w:r>
+        <w:t xml:space="preserve"> </w:t>
+      </w:r>
+      <w:r>
+        <w:rPr>
+          <w:rStyle w:val="VerbatimChar"/>
+        </w:rPr>
+        <w:t xml:space="preserve">muto-home-results</w:t>
+      </w:r>
+      <w:r>
+        <w:t xml:space="preserve">,</w:t>
+      </w:r>
+      <w:r>
+        <w:t xml:space="preserve"> </w:t>
+      </w:r>
+      <w:r>
+        <w:rPr>
+          <w:rStyle w:val="VerbatimChar"/>
+        </w:rPr>
+        <w:t xml:space="preserve">muto-chapter</w:t>
+      </w:r>
+      <w:r>
+        <w:t xml:space="preserve">,</w:t>
+      </w:r>
+      <w:r>
+        <w:t xml:space="preserve"> </w:t>
+      </w:r>
+      <w:r>
+        <w:rPr>
+          <w:rStyle w:val="VerbatimChar"/>
+        </w:rPr>
+        <w:t xml:space="preserve">muto-timeline</w:t>
+      </w:r>
+      <w:r>
+        <w:t xml:space="preserve">,</w:t>
+      </w:r>
+      <w:r>
+        <w:t xml:space="preserve"> </w:t>
+      </w:r>
+      <w:r>
+        <w:rPr>
+          <w:rStyle w:val="VerbatimChar"/>
+        </w:rPr>
+        <w:t xml:space="preserve">muto-crea-faq</w:t>
+      </w:r>
+      <w:r>
+        <w:t xml:space="preserve">,</w:t>
+      </w:r>
+      <w:r>
+        <w:t xml:space="preserve"> </w:t>
+      </w:r>
+      <w:r>
+        <w:rPr>
+          <w:rStyle w:val="VerbatimChar"/>
+        </w:rPr>
+        <w:t xml:space="preserve">custom-reviews</w:t>
+      </w:r>
+      <w:r>
+        <w:t xml:space="preserve">,</w:t>
+      </w:r>
+      <w:r>
+        <w:t xml:space="preserve"> </w:t>
+      </w:r>
+      <w:r>
+        <w:rPr>
+          <w:rStyle w:val="VerbatimChar"/>
+        </w:rPr>
         <w:t xml:space="preserve">muto-test-results</w:t>
-      </w:r>
-      <w:r>
-        <w:t xml:space="preserve">,</w:t>
-      </w:r>
-      <w:r>
-        <w:t xml:space="preserve"> </w:t>
-      </w:r>
-      <w:r>
-        <w:rPr>
-          <w:rStyle w:val="VerbatimChar"/>
-        </w:rPr>
-        <w:t xml:space="preserve">muto-home-results</w:t>
-      </w:r>
-      <w:r>
-        <w:t xml:space="preserve">,</w:t>
-      </w:r>
-      <w:r>
-        <w:t xml:space="preserve"> </w:t>
-      </w:r>
-      <w:r>
-        <w:rPr>
-          <w:rStyle w:val="VerbatimChar"/>
-        </w:rPr>
-        <w:t xml:space="preserve">muto-crea-problem</w:t>
-      </w:r>
-      <w:r>
-        <w:t xml:space="preserve">,</w:t>
-      </w:r>
-      <w:r>
-        <w:t xml:space="preserve"> </w:t>
-      </w:r>
-      <w:r>
-        <w:rPr>
-          <w:rStyle w:val="VerbatimChar"/>
-        </w:rPr>
-        <w:t xml:space="preserve">muto-crea-benefits</w:t>
-      </w:r>
-      <w:r>
-        <w:t xml:space="preserve">,</w:t>
-      </w:r>
-      <w:r>
-        <w:t xml:space="preserve"> </w:t>
-      </w:r>
-      <w:r>
-        <w:rPr>
-          <w:rStyle w:val="VerbatimChar"/>
-        </w:rPr>
-        <w:t xml:space="preserve">muto-crea-steps</w:t>
-      </w:r>
-      <w:r>
-        <w:t xml:space="preserve">,</w:t>
-      </w:r>
-      <w:r>
-        <w:t xml:space="preserve"> </w:t>
-      </w:r>
-      <w:r>
-        <w:rPr>
-          <w:rStyle w:val="VerbatimChar"/>
-        </w:rPr>
-        <w:t xml:space="preserve">muto-crea-guarantee</w:t>
-      </w:r>
-      <w:r>
-        <w:t xml:space="preserve">,</w:t>
-      </w:r>
-      <w:r>
-        <w:t xml:space="preserve"> </w:t>
-      </w:r>
-      <w:r>
-        <w:rPr>
-          <w:rStyle w:val="VerbatimChar"/>
-        </w:rPr>
-        <w:t xml:space="preserve">muto-home-why</w:t>
-      </w:r>
-      <w:r>
-        <w:t xml:space="preserve">,</w:t>
-      </w:r>
-      <w:r>
-        <w:t xml:space="preserve"> </w:t>
-      </w:r>
-      <w:r>
-        <w:rPr>
-          <w:rStyle w:val="VerbatimChar"/>
-        </w:rPr>
-        <w:t xml:space="preserve">muto-chapter</w:t>
-      </w:r>
-      <w:r>
-        <w:t xml:space="preserve">,</w:t>
-      </w:r>
-      <w:r>
-        <w:t xml:space="preserve"> </w:t>
-      </w:r>
-      <w:r>
-        <w:rPr>
-          <w:rStyle w:val="VerbatimChar"/>
-        </w:rPr>
-        <w:t xml:space="preserve">muto-crea-faq</w:t>
-      </w:r>
-      <w:r>
-        <w:t xml:space="preserve">,</w:t>
-      </w:r>
-      <w:r>
-        <w:t xml:space="preserve"> </w:t>
-      </w:r>
-      <w:r>
-        <w:rPr>
-          <w:rStyle w:val="VerbatimChar"/>
-        </w:rPr>
-        <w:t xml:space="preserve">custom-reviews</w:t>
       </w:r>
       <w:r>
         <w:t xml:space="preserve">.</w:t>
@@ -1623,7 +1689,38 @@
         <w:pStyle w:val="FirstParagraph"/>
       </w:pPr>
       <w:r>
-        <w:t xml:space="preserve">In order, below the buy box:</w:t>
+        <w:t xml:space="preserve">In order, below the buy box.</w:t>
+      </w:r>
+      <w:r>
+        <w:t xml:space="preserve"> </w:t>
+      </w:r>
+      <w:r>
+        <w:rPr>
+          <w:bCs/>
+          <w:b/>
+        </w:rPr>
+        <w:t xml:space="preserve">New</w:t>
+      </w:r>
+      <w:r>
+        <w:t xml:space="preserve"> </w:t>
+      </w:r>
+      <w:r>
+        <w:t xml:space="preserve">blocks are in bold; the rest is</w:t>
+      </w:r>
+      <w:r>
+        <w:t xml:space="preserve"> </w:t>
+      </w:r>
+      <w:r>
+        <w:rPr>
+          <w:rStyle w:val="VerbatimChar"/>
+        </w:rPr>
+        <w:t xml:space="preserve">muto-nad-v2</w:t>
+      </w:r>
+      <w:r>
+        <w:t xml:space="preserve"> </w:t>
+      </w:r>
+      <w:r>
+        <w:t xml:space="preserve">as it is on live today.</w:t>
       </w:r>
     </w:p>
     <w:p>
@@ -1635,20 +1732,10 @@
         <w:pStyle w:val="Compact"/>
       </w:pPr>
       <w:r>
-        <w:rPr>
-          <w:bCs/>
-          <w:b/>
-        </w:rPr>
-        <w:t xml:space="preserve">Statement:</w:t>
-      </w:r>
-      <w:r>
-        <w:t xml:space="preserve"> </w:t>
-      </w:r>
-      <w:r>
         <w:t xml:space="preserve">“</w:t>
       </w:r>
       <w:r>
-        <w:t xml:space="preserve">Not ready to slow down.</w:t>
+        <w:t xml:space="preserve">On this page</w:t>
       </w:r>
       <w:r>
         <w:t xml:space="preserve">”</w:t>
@@ -1657,37 +1744,7 @@
         <w:t xml:space="preserve"> </w:t>
       </w:r>
       <w:r>
-        <w:t xml:space="preserve">/</w:t>
-      </w:r>
-      <w:r>
-        <w:t xml:space="preserve"> </w:t>
-      </w:r>
-      <w:r>
-        <w:t xml:space="preserve">“</w:t>
-      </w:r>
-      <w:r>
-        <w:t xml:space="preserve">The next-generation multi-nutrient, built for what your body needs in your 40s and 50s.</w:t>
-      </w:r>
-      <w:r>
-        <w:t xml:space="preserve">”</w:t>
-      </w:r>
-      <w:r>
-        <w:t xml:space="preserve"> </w:t>
-      </w:r>
-      <w:r>
-        <w:t xml:space="preserve">/ tag</w:t>
-      </w:r>
-      <w:r>
-        <w:t xml:space="preserve"> </w:t>
-      </w:r>
-      <w:r>
-        <w:t xml:space="preserve">“</w:t>
-      </w:r>
-      <w:r>
-        <w:t xml:space="preserve">Got a wearable? Track the shift over 90 days.</w:t>
-      </w:r>
-      <w:r>
-        <w:t xml:space="preserve">”</w:t>
+        <w:t xml:space="preserve">menu (pins to the top as you scroll, as on live)</w:t>
       </w:r>
     </w:p>
     <w:p>
@@ -1703,7 +1760,7 @@
           <w:bCs/>
           <w:b/>
         </w:rPr>
-        <w:t xml:space="preserve">Science board:</w:t>
+        <w:t xml:space="preserve">Statement:</w:t>
       </w:r>
       <w:r>
         <w:t xml:space="preserve"> </w:t>
@@ -1712,13 +1769,46 @@
         <w:t xml:space="preserve">“</w:t>
       </w:r>
       <w:r>
-        <w:t xml:space="preserve">Six scientists put their name to MUTO.</w:t>
+        <w:t xml:space="preserve">Not ready to slow down.</w:t>
       </w:r>
       <w:r>
         <w:t xml:space="preserve">”</w:t>
       </w:r>
       <w:r>
-        <w:t xml:space="preserve">, compact row, white background.</w:t>
+        <w:t xml:space="preserve"> </w:t>
+      </w:r>
+      <w:r>
+        <w:t xml:space="preserve">/</w:t>
+      </w:r>
+      <w:r>
+        <w:t xml:space="preserve"> </w:t>
+      </w:r>
+      <w:r>
+        <w:t xml:space="preserve">“</w:t>
+      </w:r>
+      <w:r>
+        <w:t xml:space="preserve">The next-generation multi-nutrient, built for what your body needs in your 40s and 50s.</w:t>
+      </w:r>
+      <w:r>
+        <w:t xml:space="preserve">”</w:t>
+      </w:r>
+      <w:r>
+        <w:t xml:space="preserve"> </w:t>
+      </w:r>
+      <w:r>
+        <w:t xml:space="preserve">/ tag</w:t>
+      </w:r>
+      <w:r>
+        <w:t xml:space="preserve"> </w:t>
+      </w:r>
+      <w:r>
+        <w:t xml:space="preserve">“</w:t>
+      </w:r>
+      <w:r>
+        <w:t xml:space="preserve">Got a wearable? Track the shift over 90 days.</w:t>
+      </w:r>
+      <w:r>
+        <w:t xml:space="preserve">”</w:t>
       </w:r>
     </w:p>
     <w:p>
@@ -1730,26 +1820,10 @@
         <w:pStyle w:val="Compact"/>
       </w:pPr>
       <w:r>
-        <w:rPr>
-          <w:bCs/>
-          <w:b/>
-        </w:rPr>
-        <w:t xml:space="preserve">Standards:</w:t>
-      </w:r>
-      <w:r>
-        <w:t xml:space="preserve"> </w:t>
-      </w:r>
-      <w:r>
-        <w:t xml:space="preserve">four cards. Card 1 has the</w:t>
-      </w:r>
-      <w:r>
-        <w:t xml:space="preserve"> </w:t>
-      </w:r>
-      <w:r>
         <w:t xml:space="preserve">“</w:t>
       </w:r>
       <w:r>
-        <w:t xml:space="preserve">View third-party testing results</w:t>
+        <w:t xml:space="preserve">Five jobs. One daily jar.</w:t>
       </w:r>
       <w:r>
         <w:t xml:space="preserve">”</w:t>
@@ -1758,7 +1832,7 @@
         <w:t xml:space="preserve"> </w:t>
       </w:r>
       <w:r>
-        <w:t xml:space="preserve">button, which opens the certificate panel (batch 2333).</w:t>
+        <w:t xml:space="preserve">benefits</w:t>
       </w:r>
     </w:p>
     <w:p>
@@ -1774,7 +1848,7 @@
           <w:bCs/>
           <w:b/>
         </w:rPr>
-        <w:t xml:space="preserve">Customer videos:</w:t>
+        <w:t xml:space="preserve">Science board:</w:t>
       </w:r>
       <w:r>
         <w:t xml:space="preserve"> </w:t>
@@ -1783,13 +1857,13 @@
         <w:t xml:space="preserve">“</w:t>
       </w:r>
       <w:r>
-        <w:t xml:space="preserve">Don’t take our word for it.</w:t>
+        <w:t xml:space="preserve">Six scientists put their name to MUTO.</w:t>
       </w:r>
       <w:r>
         <w:t xml:space="preserve">”</w:t>
       </w:r>
       <w:r>
-        <w:t xml:space="preserve">, 8 videos in a row that scrolls: Kate Bright, David Mercado, Lucy Halliday, Harry Insley, Adam Facey, Max Richards, Adam Hamilton, Yolanda King. Ellen Gray’s video is removed, and so is the footnote under the row.</w:t>
+        <w:t xml:space="preserve">, compact row, white background.</w:t>
       </w:r>
     </w:p>
     <w:p>
@@ -1805,7 +1879,13 @@
           <w:bCs/>
           <w:b/>
         </w:rPr>
-        <w:t xml:space="preserve">Reviews:</w:t>
+        <w:t xml:space="preserve">Standards:</w:t>
+      </w:r>
+      <w:r>
+        <w:t xml:space="preserve"> </w:t>
+      </w:r>
+      <w:r>
+        <w:t xml:space="preserve">four cards. Card 1 has the</w:t>
       </w:r>
       <w:r>
         <w:t xml:space="preserve"> </w:t>
@@ -1814,28 +1894,16 @@
         <w:t xml:space="preserve">“</w:t>
       </w:r>
       <w:r>
-        <w:t xml:space="preserve">What our community say.</w:t>
+        <w:t xml:space="preserve">View third-party testing results</w:t>
       </w:r>
       <w:r>
         <w:t xml:space="preserve">”</w:t>
       </w:r>
       <w:r>
-        <w:t xml:space="preserve">, 20 five-star REVIEWS.io reviews that rotate every 6 seconds, with</w:t>
-      </w:r>
-      <w:r>
-        <w:t xml:space="preserve"> </w:t>
-      </w:r>
-      <w:r>
-        <w:t xml:space="preserve">“</w:t>
-      </w:r>
-      <w:r>
-        <w:t xml:space="preserve">4.8 from 103 reviews</w:t>
-      </w:r>
-      <w:r>
-        <w:t xml:space="preserve">”</w:t>
-      </w:r>
-      <w:r>
-        <w:t xml:space="preserve">.</w:t>
+        <w:t xml:space="preserve"> </w:t>
+      </w:r>
+      <w:r>
+        <w:t xml:space="preserve">button, which opens the certificate panel (batch 2333).</w:t>
       </w:r>
     </w:p>
     <w:p>
@@ -1847,17 +1915,19 @@
         <w:pStyle w:val="Compact"/>
       </w:pPr>
       <w:r>
-        <w:rPr>
-          <w:bCs/>
-          <w:b/>
-        </w:rPr>
-        <w:t xml:space="preserve">Founder:</w:t>
-      </w:r>
-      <w:r>
-        <w:t xml:space="preserve"> </w:t>
-      </w:r>
-      <w:r>
-        <w:t xml:space="preserve">Dr Richie Barclay, PhD: cell biologist, Harley Street nutritionist for 13 years, former cricketer and tennis player.</w:t>
+        <w:t xml:space="preserve">“</w:t>
+      </w:r>
+      <w:r>
+        <w:t xml:space="preserve">Every ingredient has a job.</w:t>
+      </w:r>
+      <w:r>
+        <w:t xml:space="preserve">”</w:t>
+      </w:r>
+      <w:r>
+        <w:t xml:space="preserve"> </w:t>
+      </w:r>
+      <w:r>
+        <w:t xml:space="preserve">ingredient library</w:t>
       </w:r>
     </w:p>
     <w:p>
@@ -1869,68 +1939,57 @@
         <w:pStyle w:val="Compact"/>
       </w:pPr>
       <w:r>
-        <w:t xml:space="preserve">Problem, benefits,</w:t>
-      </w:r>
-      <w:r>
-        <w:t xml:space="preserve"> </w:t>
-      </w:r>
-      <w:r>
-        <w:rPr>
-          <w:bCs/>
-          <w:b/>
-        </w:rPr>
-        <w:t xml:space="preserve">timeline</w:t>
-      </w:r>
-      <w:r>
-        <w:t xml:space="preserve"> </w:t>
-      </w:r>
-      <w:r>
-        <w:t xml:space="preserve">(</w:t>
+        <w:rPr>
+          <w:bCs/>
+          <w:b/>
+        </w:rPr>
+        <w:t xml:space="preserve">Customer videos:</w:t>
+      </w:r>
+      <w:r>
+        <w:t xml:space="preserve"> </w:t>
       </w:r>
       <w:r>
         <w:t xml:space="preserve">“</w:t>
       </w:r>
       <w:r>
-        <w:t xml:space="preserve">Your first 90 days.</w:t>
+        <w:t xml:space="preserve">Don’t take our word for it.</w:t>
       </w:r>
       <w:r>
         <w:t xml:space="preserve">”</w:t>
       </w:r>
       <w:r>
-        <w:t xml:space="preserve"> </w:t>
-      </w:r>
-      <w:r>
-        <w:t xml:space="preserve">day 1 / 30 / 60 / 90), guarantee,</w:t>
-      </w:r>
-      <w:r>
-        <w:t xml:space="preserve"> </w:t>
-      </w:r>
-      <w:r>
-        <w:rPr>
-          <w:bCs/>
-          <w:b/>
-        </w:rPr>
+        <w:t xml:space="preserve">, 8 videos in a row that scrolls: Kate Bright, David Mercado, Lucy Halliday, Harry Insley, Adam Facey, Max Richards, Adam Hamilton, Yolanda King. Ellen Gray’s video is removed, and so is the footnote under the row.</w:t>
+      </w:r>
+    </w:p>
+    <w:p>
+      <w:pPr>
+        <w:numPr>
+          <w:ilvl w:val="0"/>
+          <w:numId w:val="1004"/>
+        </w:numPr>
+        <w:pStyle w:val="Compact"/>
+      </w:pPr>
+      <w:r>
+        <w:rPr>
+          <w:bCs/>
+          <w:b/>
+        </w:rPr>
+        <w:t xml:space="preserve">Reviews:</w:t>
+      </w:r>
+      <w:r>
+        <w:t xml:space="preserve"> </w:t>
+      </w:r>
+      <w:r>
         <w:t xml:space="preserve">“</w:t>
       </w:r>
       <w:r>
-        <w:rPr>
-          <w:bCs/>
-          <w:b/>
-        </w:rPr>
-        <w:t xml:space="preserve">MUTO vs the usual</w:t>
-      </w:r>
-      <w:r>
-        <w:rPr>
-          <w:bCs/>
-          <w:b/>
-        </w:rPr>
+        <w:t xml:space="preserve">What our community say.</w:t>
+      </w:r>
+      <w:r>
         <w:t xml:space="preserve">”</w:t>
       </w:r>
       <w:r>
-        <w:t xml:space="preserve"> </w:t>
-      </w:r>
-      <w:r>
-        <w:t xml:space="preserve">comparison (as on live), FAQs (7;</w:t>
+        <w:t xml:space="preserve">, 20 five-star REVIEWS.io reviews that rotate every 6 seconds, with</w:t>
       </w:r>
       <w:r>
         <w:t xml:space="preserve"> </w:t>
@@ -1939,16 +1998,80 @@
         <w:t xml:space="preserve">“</w:t>
       </w:r>
       <w:r>
-        <w:t xml:space="preserve">Do I need a smartwatch?</w:t>
+        <w:t xml:space="preserve">4.8 from 103 reviews</w:t>
       </w:r>
       <w:r>
         <w:t xml:space="preserve">”</w:t>
       </w:r>
       <w:r>
-        <w:t xml:space="preserve"> </w:t>
-      </w:r>
-      <w:r>
-        <w:t xml:space="preserve">removed), REVIEWS.io widget.</w:t>
+        <w:t xml:space="preserve">.</w:t>
+      </w:r>
+    </w:p>
+    <w:p>
+      <w:pPr>
+        <w:numPr>
+          <w:ilvl w:val="0"/>
+          <w:numId w:val="1004"/>
+        </w:numPr>
+        <w:pStyle w:val="Compact"/>
+      </w:pPr>
+      <w:r>
+        <w:rPr>
+          <w:bCs/>
+          <w:b/>
+        </w:rPr>
+        <w:t xml:space="preserve">Founder:</w:t>
+      </w:r>
+      <w:r>
+        <w:t xml:space="preserve"> </w:t>
+      </w:r>
+      <w:r>
+        <w:t xml:space="preserve">Dr Richie Barclay, PhD: cell biologist, Harley Street nutritionist for 13 years, former cricketer and tennis player.</w:t>
+      </w:r>
+    </w:p>
+    <w:p>
+      <w:pPr>
+        <w:numPr>
+          <w:ilvl w:val="0"/>
+          <w:numId w:val="1004"/>
+        </w:numPr>
+        <w:pStyle w:val="Compact"/>
+      </w:pPr>
+      <w:r>
+        <w:t xml:space="preserve">Comparison,</w:t>
+      </w:r>
+      <w:r>
+        <w:t xml:space="preserve"> </w:t>
+      </w:r>
+      <w:r>
+        <w:t xml:space="preserve">“</w:t>
+      </w:r>
+      <w:r>
+        <w:t xml:space="preserve">What you can expect over time.</w:t>
+      </w:r>
+      <w:r>
+        <w:t xml:space="preserve">”</w:t>
+      </w:r>
+      <w:r>
+        <w:t xml:space="preserve"> </w:t>
+      </w:r>
+      <w:r>
+        <w:t xml:space="preserve">timeline,</w:t>
+      </w:r>
+      <w:r>
+        <w:t xml:space="preserve"> </w:t>
+      </w:r>
+      <w:r>
+        <w:t xml:space="preserve">“</w:t>
+      </w:r>
+      <w:r>
+        <w:t xml:space="preserve">How to take it.</w:t>
+      </w:r>
+      <w:r>
+        <w:t xml:space="preserve">”</w:t>
+      </w:r>
+      <w:r>
+        <w:t xml:space="preserve">, FAQs (all 10 from live), REVIEWS.io widget.</w:t>
       </w:r>
     </w:p>
     <w:p>
@@ -2422,113 +2545,6 @@
         <w:t xml:space="preserve">block at the top of the template.</w:t>
       </w:r>
     </w:p>
-    <w:p>
-      <w:pPr>
-        <w:numPr>
-          <w:ilvl w:val="0"/>
-          <w:numId w:val="1005"/>
-        </w:numPr>
-        <w:pStyle w:val="Compact"/>
-      </w:pPr>
-      <w:r>
-        <w:rPr>
-          <w:bCs/>
-          <w:b/>
-        </w:rPr>
-        <w:t xml:space="preserve">Not carried over from</w:t>
-      </w:r>
-      <w:r>
-        <w:rPr>
-          <w:bCs/>
-          <w:b/>
-        </w:rPr>
-        <w:t xml:space="preserve"> </w:t>
-      </w:r>
-      <w:r>
-        <w:rPr>
-          <w:rStyle w:val="VerbatimChar"/>
-          <w:bCs/>
-          <w:b/>
-        </w:rPr>
-        <w:t xml:space="preserve">muto-nad-v2</w:t>
-      </w:r>
-      <w:r>
-        <w:rPr>
-          <w:bCs/>
-          <w:b/>
-        </w:rPr>
-        <w:t xml:space="preserve">:</w:t>
-      </w:r>
-      <w:r>
-        <w:t xml:space="preserve"> </w:t>
-      </w:r>
-      <w:r>
-        <w:t xml:space="preserve">the</w:t>
-      </w:r>
-      <w:r>
-        <w:t xml:space="preserve"> </w:t>
-      </w:r>
-      <w:r>
-        <w:t xml:space="preserve">“</w:t>
-      </w:r>
-      <w:r>
-        <w:t xml:space="preserve">On this page</w:t>
-      </w:r>
-      <w:r>
-        <w:t xml:space="preserve">”</w:t>
-      </w:r>
-      <w:r>
-        <w:t xml:space="preserve"> </w:t>
-      </w:r>
-      <w:r>
-        <w:t xml:space="preserve">menu,</w:t>
-      </w:r>
-      <w:r>
-        <w:t xml:space="preserve"> </w:t>
-      </w:r>
-      <w:r>
-        <w:t xml:space="preserve">“</w:t>
-      </w:r>
-      <w:r>
-        <w:t xml:space="preserve">Five jobs. One daily jar.</w:t>
-      </w:r>
-      <w:r>
-        <w:t xml:space="preserve">”</w:t>
-      </w:r>
-      <w:r>
-        <w:t xml:space="preserve">, the ingredient library, the v2 timeline and</w:t>
-      </w:r>
-      <w:r>
-        <w:t xml:space="preserve"> </w:t>
-      </w:r>
-      <w:r>
-        <w:t xml:space="preserve">“</w:t>
-      </w:r>
-      <w:r>
-        <w:t xml:space="preserve">How to take it</w:t>
-      </w:r>
-      <w:r>
-        <w:t xml:space="preserve">”</w:t>
-      </w:r>
-      <w:r>
-        <w:t xml:space="preserve">. They stay in</w:t>
-      </w:r>
-      <w:r>
-        <w:t xml:space="preserve"> </w:t>
-      </w:r>
-      <w:r>
-        <w:rPr>
-          <w:rStyle w:val="VerbatimChar"/>
-        </w:rPr>
-        <w:t xml:space="preserve">muto-nad-v2</w:t>
-      </w:r>
-      <w:r>
-        <w:t xml:space="preserve"> </w:t>
-      </w:r>
-      <w:r>
-        <w:t xml:space="preserve">if they’re wanted back.</w:t>
-      </w:r>
-    </w:p>
     <w:bookmarkStart w:id="26" w:name="how-its-built"/>
     <w:p>
       <w:pPr>
@@ -2682,7 +2698,7 @@
         <w:t xml:space="preserve"> </w:t>
       </w:r>
       <w:r>
-        <w:t xml:space="preserve">the buy box matches today’s page, with</w:t>
+        <w:t xml:space="preserve">the buy box and every section from today’s page are there (menu, Five jobs, ingredient library, comparison, timeline, How to take it, FAQs), with</w:t>
       </w:r>
       <w:r>
         <w:t xml:space="preserve"> </w:t>
@@ -2786,6 +2802,36 @@
       </w:r>
       <w:r>
         <w:t xml:space="preserve">scrolls to the board.</w:t>
+      </w:r>
+    </w:p>
+    <w:p>
+      <w:pPr>
+        <w:numPr>
+          <w:ilvl w:val="1"/>
+          <w:numId w:val="1008"/>
+        </w:numPr>
+        <w:pStyle w:val="Compact"/>
+      </w:pPr>
+      <w:r>
+        <w:t xml:space="preserve">Each</w:t>
+      </w:r>
+      <w:r>
+        <w:t xml:space="preserve"> </w:t>
+      </w:r>
+      <w:r>
+        <w:t xml:space="preserve">“</w:t>
+      </w:r>
+      <w:r>
+        <w:t xml:space="preserve">On this page</w:t>
+      </w:r>
+      <w:r>
+        <w:t xml:space="preserve">”</w:t>
+      </w:r>
+      <w:r>
+        <w:t xml:space="preserve"> </w:t>
+      </w:r>
+      <w:r>
+        <w:t xml:space="preserve">menu link scrolls to its section.</w:t>
       </w:r>
     </w:p>
     <w:p>

</xml_diff>

<commit_message>
Main PDP: benefits heading 'Benefits built on published science.' with a 40s-50s line
Co-Authored-By: Claude Opus 5.5 <noreply@anthropic.com>
Claude-Session: https://claude.ai/code/session_01VYMABjkorQn2QmgJS9ckGR
</commit_message>
<xml_diff>
--- a/handoff/MUTO_Dev_Handoff_Main_PDP_28Oct2026.docx
+++ b/handoff/MUTO_Dev_Handoff_Main_PDP_28Oct2026.docx
@@ -1820,19 +1820,50 @@
         <w:pStyle w:val="Compact"/>
       </w:pPr>
       <w:r>
+        <w:rPr>
+          <w:bCs/>
+          <w:b/>
+        </w:rPr>
+        <w:t xml:space="preserve">Benefits:</w:t>
+      </w:r>
+      <w:r>
+        <w:t xml:space="preserve"> </w:t>
+      </w:r>
+      <w:r>
+        <w:t xml:space="preserve">the live five cards, with a new heading:</w:t>
+      </w:r>
+      <w:r>
+        <w:t xml:space="preserve"> </w:t>
+      </w:r>
+      <w:r>
         <w:t xml:space="preserve">“</w:t>
       </w:r>
       <w:r>
+        <w:t xml:space="preserve">Benefits built on published science.</w:t>
+      </w:r>
+      <w:r>
+        <w:t xml:space="preserve">”</w:t>
+      </w:r>
+      <w:r>
+        <w:t xml:space="preserve"> </w:t>
+      </w:r>
+      <w:r>
+        <w:t xml:space="preserve">(small line above:</w:t>
+      </w:r>
+      <w:r>
+        <w:t xml:space="preserve"> </w:t>
+      </w:r>
+      <w:r>
+        <w:t xml:space="preserve">“</w:t>
+      </w:r>
+      <w:r>
         <w:t xml:space="preserve">Five jobs. One daily jar.</w:t>
       </w:r>
       <w:r>
         <w:t xml:space="preserve">”</w:t>
       </w:r>
       <w:r>
-        <w:t xml:space="preserve"> </w:t>
-      </w:r>
-      <w:r>
-        <w:t xml:space="preserve">benefits</w:t>
+        <w:t xml:space="preserve">), line under it now speaks to 40s and 50s.</w:t>
       </w:r>
     </w:p>
     <w:p>

</xml_diff>

<commit_message>
Main PDP: Standards, What people say and Founder in the On this page menu
Co-Authored-By: Claude Opus 5.5 <noreply@anthropic.com>
Claude-Session: https://claude.ai/code/session_01VYMABjkorQn2QmgJS9ckGR
</commit_message>
<xml_diff>
--- a/handoff/MUTO_Dev_Handoff_Main_PDP_28Oct2026.docx
+++ b/handoff/MUTO_Dev_Handoff_Main_PDP_28Oct2026.docx
@@ -1744,7 +1744,49 @@
         <w:t xml:space="preserve"> </w:t>
       </w:r>
       <w:r>
-        <w:t xml:space="preserve">menu (pins to the top as you scroll, as on live)</w:t>
+        <w:t xml:space="preserve">menu (pins to the top as you scroll, as on live), with three new links:</w:t>
+      </w:r>
+      <w:r>
+        <w:t xml:space="preserve"> </w:t>
+      </w:r>
+      <w:r>
+        <w:rPr>
+          <w:bCs/>
+          <w:b/>
+        </w:rPr>
+        <w:t xml:space="preserve">Standards</w:t>
+      </w:r>
+      <w:r>
+        <w:t xml:space="preserve">,</w:t>
+      </w:r>
+      <w:r>
+        <w:t xml:space="preserve"> </w:t>
+      </w:r>
+      <w:r>
+        <w:rPr>
+          <w:bCs/>
+          <w:b/>
+        </w:rPr>
+        <w:t xml:space="preserve">What people say</w:t>
+      </w:r>
+      <w:r>
+        <w:t xml:space="preserve"> </w:t>
+      </w:r>
+      <w:r>
+        <w:t xml:space="preserve">(the videos) and</w:t>
+      </w:r>
+      <w:r>
+        <w:t xml:space="preserve"> </w:t>
+      </w:r>
+      <w:r>
+        <w:rPr>
+          <w:bCs/>
+          <w:b/>
+        </w:rPr>
+        <w:t xml:space="preserve">Founder</w:t>
+      </w:r>
+      <w:r>
+        <w:t xml:space="preserve">, 11 links in page order</w:t>
       </w:r>
     </w:p>
     <w:p>

</xml_diff>

<commit_message>
Main PDP: benefits line 'What you need after 35. Your biology shifts. What you need evolves.'
Co-Authored-By: Claude Opus 5.5 <noreply@anthropic.com>
Claude-Session: https://claude.ai/code/session_01VYMABjkorQn2QmgJS9ckGR
</commit_message>
<xml_diff>
--- a/handoff/MUTO_Dev_Handoff_Main_PDP_28Oct2026.docx
+++ b/handoff/MUTO_Dev_Handoff_Main_PDP_28Oct2026.docx
@@ -1905,7 +1905,19 @@
         <w:t xml:space="preserve">”</w:t>
       </w:r>
       <w:r>
-        <w:t xml:space="preserve">), line under it now speaks to 40s and 50s.</w:t>
+        <w:t xml:space="preserve">), and a new line under it:</w:t>
+      </w:r>
+      <w:r>
+        <w:t xml:space="preserve"> </w:t>
+      </w:r>
+      <w:r>
+        <w:t xml:space="preserve">“</w:t>
+      </w:r>
+      <w:r>
+        <w:t xml:space="preserve">What you need after 35. Your biology shifts. What you need evolves.</w:t>
+      </w:r>
+      <w:r>
+        <w:t xml:space="preserve">”</w:t>
       </w:r>
     </w:p>
     <w:p>

</xml_diff>

<commit_message>
Main PDP: 'The problem' four stat boxes with sources, after the statement
Co-Authored-By: Claude Opus 5.5 <noreply@anthropic.com>
Claude-Session: https://claude.ai/code/session_01VYMABjkorQn2QmgJS9ckGR
</commit_message>
<xml_diff>
--- a/handoff/MUTO_Dev_Handoff_Main_PDP_28Oct2026.docx
+++ b/handoff/MUTO_Dev_Handoff_Main_PDP_28Oct2026.docx
@@ -196,7 +196,7 @@
           <w:bCs/>
           <w:b/>
         </w:rPr>
-        <w:t xml:space="preserve">6 new files to add</w:t>
+        <w:t xml:space="preserve">7 new files to add</w:t>
       </w:r>
       <w:r>
         <w:t xml:space="preserve">,</w:t>
@@ -473,13 +473,13 @@
       </w:r>
     </w:p>
     <w:bookmarkEnd w:id="21"/>
-    <w:bookmarkStart w:id="22" w:name="step-1-add-the-6-files-in-this-order"/>
+    <w:bookmarkStart w:id="22" w:name="step-1-add-the-7-files-in-this-order"/>
     <w:p>
       <w:pPr>
         <w:pStyle w:val="Heading1"/>
       </w:pPr>
       <w:r>
-        <w:t xml:space="preserve">Step 1: add the 6 files, in this order</w:t>
+        <w:t xml:space="preserve">Step 1: add the 7 files, in this order</w:t>
       </w:r>
     </w:p>
     <w:p>
@@ -554,7 +554,7 @@
               <w:jc w:val="left"/>
             </w:pPr>
             <w:r>
-              <w:t xml:space="preserve">Styles for the four new blocks</w:t>
+              <w:t xml:space="preserve">Styles for the five new blocks</w:t>
             </w:r>
           </w:p>
         </w:tc>
@@ -596,6 +596,44 @@
             </w:r>
             <w:r>
               <w:t xml:space="preserve">band</w:t>
+            </w:r>
+          </w:p>
+        </w:tc>
+      </w:tr>
+      <w:tr>
+        <w:tc>
+          <w:tcPr/>
+          <w:p>
+            <w:pPr>
+              <w:pStyle w:val="Compact"/>
+              <w:jc w:val="left"/>
+            </w:pPr>
+            <w:r>
+              <w:rPr>
+                <w:rStyle w:val="VerbatimChar"/>
+              </w:rPr>
+              <w:t xml:space="preserve">sections/muto-crea-stats.liquid</w:t>
+            </w:r>
+          </w:p>
+        </w:tc>
+        <w:tc>
+          <w:tcPr/>
+          <w:p>
+            <w:pPr>
+              <w:pStyle w:val="Compact"/>
+              <w:jc w:val="left"/>
+            </w:pPr>
+            <w:r>
+              <w:t xml:space="preserve">“</w:t>
+            </w:r>
+            <w:r>
+              <w:t xml:space="preserve">The problem</w:t>
+            </w:r>
+            <w:r>
+              <w:t xml:space="preserve">”</w:t>
+            </w:r>
+            <w:r>
+              <w:t xml:space="preserve">: four stat boxes with sources</w:t>
             </w:r>
           </w:p>
         </w:tc>
@@ -1866,13 +1904,7 @@
           <w:bCs/>
           <w:b/>
         </w:rPr>
-        <w:t xml:space="preserve">Benefits:</w:t>
-      </w:r>
-      <w:r>
-        <w:t xml:space="preserve"> </w:t>
-      </w:r>
-      <w:r>
-        <w:t xml:space="preserve">the live five cards, with a new heading:</w:t>
+        <w:t xml:space="preserve">The problem:</w:t>
       </w:r>
       <w:r>
         <w:t xml:space="preserve"> </w:t>
@@ -1881,7 +1913,7 @@
         <w:t xml:space="preserve">“</w:t>
       </w:r>
       <w:r>
-        <w:t xml:space="preserve">Benefits built on published science.</w:t>
+        <w:t xml:space="preserve">Your biology shifts. Most supplements don’t.</w:t>
       </w:r>
       <w:r>
         <w:t xml:space="preserve">”</w:t>
@@ -1890,34 +1922,71 @@
         <w:t xml:space="preserve"> </w:t>
       </w:r>
       <w:r>
-        <w:t xml:space="preserve">(small line above:</w:t>
-      </w:r>
-      <w:r>
-        <w:t xml:space="preserve"> </w:t>
-      </w:r>
-      <w:r>
-        <w:t xml:space="preserve">“</w:t>
-      </w:r>
-      <w:r>
-        <w:t xml:space="preserve">Five jobs. One daily jar.</w:t>
-      </w:r>
-      <w:r>
-        <w:t xml:space="preserve">”</w:t>
-      </w:r>
-      <w:r>
-        <w:t xml:space="preserve">), and a new line under it:</w:t>
-      </w:r>
-      <w:r>
-        <w:t xml:space="preserve"> </w:t>
-      </w:r>
-      <w:r>
-        <w:t xml:space="preserve">“</w:t>
-      </w:r>
-      <w:r>
-        <w:t xml:space="preserve">What you need after 35. Your biology shifts. What you need evolves.</w:t>
-      </w:r>
-      <w:r>
-        <w:t xml:space="preserve">”</w:t>
+        <w:t xml:space="preserve">Four boxes:</w:t>
+      </w:r>
+      <w:r>
+        <w:t xml:space="preserve"> </w:t>
+      </w:r>
+      <w:r>
+        <w:rPr>
+          <w:bCs/>
+          <w:b/>
+        </w:rPr>
+        <w:t xml:space="preserve">57%</w:t>
+      </w:r>
+      <w:r>
+        <w:t xml:space="preserve"> </w:t>
+      </w:r>
+      <w:r>
+        <w:t xml:space="preserve">of supplements tested didn’t match their label (Crawford et al., JAMA Network Open 2022) ·</w:t>
+      </w:r>
+      <w:r>
+        <w:t xml:space="preserve"> </w:t>
+      </w:r>
+      <w:r>
+        <w:rPr>
+          <w:bCs/>
+          <w:b/>
+        </w:rPr>
+        <w:t xml:space="preserve">1 in 2</w:t>
+      </w:r>
+      <w:r>
+        <w:t xml:space="preserve"> </w:t>
+      </w:r>
+      <w:r>
+        <w:t xml:space="preserve">deaths are linked to chronic inflammation (Furman et al., Nature Medicine 2019) ·</w:t>
+      </w:r>
+      <w:r>
+        <w:t xml:space="preserve"> </w:t>
+      </w:r>
+      <w:r>
+        <w:rPr>
+          <w:bCs/>
+          <w:b/>
+        </w:rPr>
+        <w:t xml:space="preserve">30%</w:t>
+      </w:r>
+      <w:r>
+        <w:t xml:space="preserve"> </w:t>
+      </w:r>
+      <w:r>
+        <w:t xml:space="preserve">less NAD+ in liver tissue after 60 (Zhou et al., British Journal of Pharmacology 2016) ·</w:t>
+      </w:r>
+      <w:r>
+        <w:t xml:space="preserve"> </w:t>
+      </w:r>
+      <w:r>
+        <w:rPr>
+          <w:bCs/>
+          <w:b/>
+        </w:rPr>
+        <w:t xml:space="preserve">50%</w:t>
+      </w:r>
+      <w:r>
+        <w:t xml:space="preserve"> </w:t>
+      </w:r>
+      <w:r>
+        <w:t xml:space="preserve">lower muscle mitochondrial capacity by your late 60s (Conley et al., Journal of Physiology 2000). Sources in a small line underneath.</w:t>
       </w:r>
     </w:p>
     <w:p>
@@ -1933,7 +2002,13 @@
           <w:bCs/>
           <w:b/>
         </w:rPr>
-        <w:t xml:space="preserve">Science board:</w:t>
+        <w:t xml:space="preserve">Benefits:</w:t>
+      </w:r>
+      <w:r>
+        <w:t xml:space="preserve"> </w:t>
+      </w:r>
+      <w:r>
+        <w:t xml:space="preserve">the live five cards, with a new heading:</w:t>
       </w:r>
       <w:r>
         <w:t xml:space="preserve"> </w:t>
@@ -1942,13 +2017,43 @@
         <w:t xml:space="preserve">“</w:t>
       </w:r>
       <w:r>
-        <w:t xml:space="preserve">Six scientists put their name to MUTO.</w:t>
+        <w:t xml:space="preserve">Benefits built on published science.</w:t>
       </w:r>
       <w:r>
         <w:t xml:space="preserve">”</w:t>
       </w:r>
       <w:r>
-        <w:t xml:space="preserve">, compact row, white background.</w:t>
+        <w:t xml:space="preserve"> </w:t>
+      </w:r>
+      <w:r>
+        <w:t xml:space="preserve">(small line above:</w:t>
+      </w:r>
+      <w:r>
+        <w:t xml:space="preserve"> </w:t>
+      </w:r>
+      <w:r>
+        <w:t xml:space="preserve">“</w:t>
+      </w:r>
+      <w:r>
+        <w:t xml:space="preserve">Five jobs. One daily jar.</w:t>
+      </w:r>
+      <w:r>
+        <w:t xml:space="preserve">”</w:t>
+      </w:r>
+      <w:r>
+        <w:t xml:space="preserve">), and a new line under it:</w:t>
+      </w:r>
+      <w:r>
+        <w:t xml:space="preserve"> </w:t>
+      </w:r>
+      <w:r>
+        <w:t xml:space="preserve">“</w:t>
+      </w:r>
+      <w:r>
+        <w:t xml:space="preserve">What you need after 35. Your biology shifts. What you need evolves.</w:t>
+      </w:r>
+      <w:r>
+        <w:t xml:space="preserve">”</w:t>
       </w:r>
     </w:p>
     <w:p>
@@ -1964,13 +2069,7 @@
           <w:bCs/>
           <w:b/>
         </w:rPr>
-        <w:t xml:space="preserve">Standards:</w:t>
-      </w:r>
-      <w:r>
-        <w:t xml:space="preserve"> </w:t>
-      </w:r>
-      <w:r>
-        <w:t xml:space="preserve">four cards. Card 1 has the</w:t>
+        <w:t xml:space="preserve">Science board:</w:t>
       </w:r>
       <w:r>
         <w:t xml:space="preserve"> </w:t>
@@ -1979,16 +2078,13 @@
         <w:t xml:space="preserve">“</w:t>
       </w:r>
       <w:r>
-        <w:t xml:space="preserve">View third-party testing results</w:t>
+        <w:t xml:space="preserve">Six scientists put their name to MUTO.</w:t>
       </w:r>
       <w:r>
         <w:t xml:space="preserve">”</w:t>
       </w:r>
       <w:r>
-        <w:t xml:space="preserve"> </w:t>
-      </w:r>
-      <w:r>
-        <w:t xml:space="preserve">button, which opens the certificate panel (batch 2333).</w:t>
+        <w:t xml:space="preserve">, compact row, white background.</w:t>
       </w:r>
     </w:p>
     <w:p>
@@ -2000,10 +2096,26 @@
         <w:pStyle w:val="Compact"/>
       </w:pPr>
       <w:r>
+        <w:rPr>
+          <w:bCs/>
+          <w:b/>
+        </w:rPr>
+        <w:t xml:space="preserve">Standards:</w:t>
+      </w:r>
+      <w:r>
+        <w:t xml:space="preserve"> </w:t>
+      </w:r>
+      <w:r>
+        <w:t xml:space="preserve">four cards. Card 1 has the</w:t>
+      </w:r>
+      <w:r>
+        <w:t xml:space="preserve"> </w:t>
+      </w:r>
+      <w:r>
         <w:t xml:space="preserve">“</w:t>
       </w:r>
       <w:r>
-        <w:t xml:space="preserve">Every ingredient has a job.</w:t>
+        <w:t xml:space="preserve">View third-party testing results</w:t>
       </w:r>
       <w:r>
         <w:t xml:space="preserve">”</w:t>
@@ -2012,7 +2124,7 @@
         <w:t xml:space="preserve"> </w:t>
       </w:r>
       <w:r>
-        <w:t xml:space="preserve">ingredient library</w:t>
+        <w:t xml:space="preserve">button, which opens the certificate panel (batch 2333).</w:t>
       </w:r>
     </w:p>
     <w:p>
@@ -2024,26 +2136,19 @@
         <w:pStyle w:val="Compact"/>
       </w:pPr>
       <w:r>
-        <w:rPr>
-          <w:bCs/>
-          <w:b/>
-        </w:rPr>
-        <w:t xml:space="preserve">Customer videos:</w:t>
-      </w:r>
-      <w:r>
-        <w:t xml:space="preserve"> </w:t>
-      </w:r>
-      <w:r>
         <w:t xml:space="preserve">“</w:t>
       </w:r>
       <w:r>
-        <w:t xml:space="preserve">Don’t take our word for it.</w:t>
+        <w:t xml:space="preserve">Every ingredient has a job.</w:t>
       </w:r>
       <w:r>
         <w:t xml:space="preserve">”</w:t>
       </w:r>
       <w:r>
-        <w:t xml:space="preserve">, 8 videos in a row that scrolls: Kate Bright, David Mercado, Lucy Halliday, Harry Insley, Adam Facey, Max Richards, Adam Hamilton, Yolanda King. Ellen Gray’s video is removed, and so is the footnote under the row.</w:t>
+        <w:t xml:space="preserve"> </w:t>
+      </w:r>
+      <w:r>
+        <w:t xml:space="preserve">ingredient library</w:t>
       </w:r>
     </w:p>
     <w:p>
@@ -2059,7 +2164,7 @@
           <w:bCs/>
           <w:b/>
         </w:rPr>
-        <w:t xml:space="preserve">Reviews:</w:t>
+        <w:t xml:space="preserve">Customer videos:</w:t>
       </w:r>
       <w:r>
         <w:t xml:space="preserve"> </w:t>
@@ -2068,28 +2173,13 @@
         <w:t xml:space="preserve">“</w:t>
       </w:r>
       <w:r>
-        <w:t xml:space="preserve">What our community say.</w:t>
+        <w:t xml:space="preserve">Don’t take our word for it.</w:t>
       </w:r>
       <w:r>
         <w:t xml:space="preserve">”</w:t>
       </w:r>
       <w:r>
-        <w:t xml:space="preserve">, 20 five-star REVIEWS.io reviews that rotate every 6 seconds, with</w:t>
-      </w:r>
-      <w:r>
-        <w:t xml:space="preserve"> </w:t>
-      </w:r>
-      <w:r>
-        <w:t xml:space="preserve">“</w:t>
-      </w:r>
-      <w:r>
-        <w:t xml:space="preserve">4.8 from 103 reviews</w:t>
-      </w:r>
-      <w:r>
-        <w:t xml:space="preserve">”</w:t>
-      </w:r>
-      <w:r>
-        <w:t xml:space="preserve">.</w:t>
+        <w:t xml:space="preserve">, 8 videos in a row that scrolls: Kate Bright, David Mercado, Lucy Halliday, Harry Insley, Adam Facey, Max Richards, Adam Hamilton, Yolanda King. Ellen Gray’s video is removed, and so is the footnote under the row.</w:t>
       </w:r>
     </w:p>
     <w:p>
@@ -2105,13 +2195,37 @@
           <w:bCs/>
           <w:b/>
         </w:rPr>
-        <w:t xml:space="preserve">Founder:</w:t>
-      </w:r>
-      <w:r>
-        <w:t xml:space="preserve"> </w:t>
-      </w:r>
-      <w:r>
-        <w:t xml:space="preserve">Dr Richie Barclay, PhD: cell biologist, Harley Street nutritionist for 13 years, former cricketer and tennis player.</w:t>
+        <w:t xml:space="preserve">Reviews:</w:t>
+      </w:r>
+      <w:r>
+        <w:t xml:space="preserve"> </w:t>
+      </w:r>
+      <w:r>
+        <w:t xml:space="preserve">“</w:t>
+      </w:r>
+      <w:r>
+        <w:t xml:space="preserve">What our community say.</w:t>
+      </w:r>
+      <w:r>
+        <w:t xml:space="preserve">”</w:t>
+      </w:r>
+      <w:r>
+        <w:t xml:space="preserve">, 20 five-star REVIEWS.io reviews that rotate every 6 seconds, with</w:t>
+      </w:r>
+      <w:r>
+        <w:t xml:space="preserve"> </w:t>
+      </w:r>
+      <w:r>
+        <w:t xml:space="preserve">“</w:t>
+      </w:r>
+      <w:r>
+        <w:t xml:space="preserve">4.8 from 103 reviews</w:t>
+      </w:r>
+      <w:r>
+        <w:t xml:space="preserve">”</w:t>
+      </w:r>
+      <w:r>
+        <w:t xml:space="preserve">.</w:t>
       </w:r>
     </w:p>
     <w:p>
@@ -2123,6 +2237,28 @@
         <w:pStyle w:val="Compact"/>
       </w:pPr>
       <w:r>
+        <w:rPr>
+          <w:bCs/>
+          <w:b/>
+        </w:rPr>
+        <w:t xml:space="preserve">Founder:</w:t>
+      </w:r>
+      <w:r>
+        <w:t xml:space="preserve"> </w:t>
+      </w:r>
+      <w:r>
+        <w:t xml:space="preserve">Dr Richie Barclay, PhD: cell biologist, Harley Street nutritionist for 13 years, former cricketer and tennis player.</w:t>
+      </w:r>
+    </w:p>
+    <w:p>
+      <w:pPr>
+        <w:numPr>
+          <w:ilvl w:val="0"/>
+          <w:numId w:val="1004"/>
+        </w:numPr>
+        <w:pStyle w:val="Compact"/>
+      </w:pPr>
+      <w:r>
         <w:t xml:space="preserve">Comparison,</w:t>
       </w:r>
       <w:r>
@@ -2658,7 +2794,7 @@
         <w:t xml:space="preserve"> </w:t>
       </w:r>
       <w:r>
-        <w:t xml:space="preserve">apart from the four new sections and their stylesheet. The page’s own styles are in a Custom Liquid block called</w:t>
+        <w:t xml:space="preserve">apart from the five new sections and their stylesheet. The page’s own styles are in a Custom Liquid block called</w:t>
       </w:r>
       <w:r>
         <w:t xml:space="preserve"> </w:t>

</xml_diff>

<commit_message>
Main PDP: mostly white bands; sage grey only on the reviews rail and comparison
Co-Authored-By: Claude Opus 5.5 <noreply@anthropic.com>
Claude-Session: https://claude.ai/code/session_01VYMABjkorQn2QmgJS9ckGR
</commit_message>
<xml_diff>
--- a/handoff/MUTO_Dev_Handoff_Main_PDP_28Oct2026.docx
+++ b/handoff/MUTO_Dev_Handoff_Main_PDP_28Oct2026.docx
@@ -2748,7 +2748,43 @@
         <w:t xml:space="preserve"> </w:t>
       </w:r>
       <w:r>
-        <w:t xml:space="preserve">no gradient washes. The bands alternate flat brand sage grey (#C8D2CF) and white, set in the</w:t>
+        <w:t xml:space="preserve">no gradient washes. Almost every band is flat white. Brand sage grey (#C8D2CF) is used only on</w:t>
+      </w:r>
+      <w:r>
+        <w:t xml:space="preserve"> </w:t>
+      </w:r>
+      <w:r>
+        <w:t xml:space="preserve">“</w:t>
+      </w:r>
+      <w:r>
+        <w:t xml:space="preserve">What our community say</w:t>
+      </w:r>
+      <w:r>
+        <w:t xml:space="preserve">”</w:t>
+      </w:r>
+      <w:r>
+        <w:t xml:space="preserve"> </w:t>
+      </w:r>
+      <w:r>
+        <w:t xml:space="preserve">and the comparison (as on live).</w:t>
+      </w:r>
+      <w:r>
+        <w:t xml:space="preserve"> </w:t>
+      </w:r>
+      <w:r>
+        <w:t xml:space="preserve">“</w:t>
+      </w:r>
+      <w:r>
+        <w:t xml:space="preserve">How to take it</w:t>
+      </w:r>
+      <w:r>
+        <w:t xml:space="preserve">”</w:t>
+      </w:r>
+      <w:r>
+        <w:t xml:space="preserve"> </w:t>
+      </w:r>
+      <w:r>
+        <w:t xml:space="preserve">and the ingredient library are white too. Set in the</w:t>
       </w:r>
       <w:r>
         <w:t xml:space="preserve"> </w:t>

</xml_diff>

<commit_message>
Main PDP: problem stats in MUTO card style, NAD+ 50% by 40, more space, nav link
Co-Authored-By: Claude Opus 5.5 <noreply@anthropic.com>
Claude-Session: https://claude.ai/code/session_01VYMABjkorQn2QmgJS9ckGR
</commit_message>
<xml_diff>
--- a/handoff/MUTO_Dev_Handoff_Main_PDP_28Oct2026.docx
+++ b/handoff/MUTO_Dev_Handoff_Main_PDP_28Oct2026.docx
@@ -1782,7 +1782,20 @@
         <w:t xml:space="preserve"> </w:t>
       </w:r>
       <w:r>
-        <w:t xml:space="preserve">menu (pins to the top as you scroll, as on live), with three new links:</w:t>
+        <w:t xml:space="preserve">menu (pins to the top as you scroll, as on live), with four new links:</w:t>
+      </w:r>
+      <w:r>
+        <w:t xml:space="preserve"> </w:t>
+      </w:r>
+      <w:r>
+        <w:rPr>
+          <w:bCs/>
+          <w:b/>
+        </w:rPr>
+        <w:t xml:space="preserve">The problem</w:t>
+      </w:r>
+      <w:r>
+        <w:t xml:space="preserve">,</w:t>
       </w:r>
       <w:r>
         <w:t xml:space="preserve"> </w:t>
@@ -1824,7 +1837,7 @@
         <w:t xml:space="preserve">Founder</w:t>
       </w:r>
       <w:r>
-        <w:t xml:space="preserve">, 11 links in page order</w:t>
+        <w:t xml:space="preserve">, 12 links in page order</w:t>
       </w:r>
     </w:p>
     <w:p>
@@ -1910,9 +1923,30 @@
         <w:t xml:space="preserve"> </w:t>
       </w:r>
       <w:r>
+        <w:t xml:space="preserve">pill</w:t>
+      </w:r>
+      <w:r>
+        <w:t xml:space="preserve"> </w:t>
+      </w:r>
+      <w:r>
         <w:t xml:space="preserve">“</w:t>
       </w:r>
       <w:r>
+        <w:t xml:space="preserve">The problem</w:t>
+      </w:r>
+      <w:r>
+        <w:t xml:space="preserve">”</w:t>
+      </w:r>
+      <w:r>
+        <w:t xml:space="preserve">, heading</w:t>
+      </w:r>
+      <w:r>
+        <w:t xml:space="preserve"> </w:t>
+      </w:r>
+      <w:r>
+        <w:t xml:space="preserve">“</w:t>
+      </w:r>
+      <w:r>
         <w:t xml:space="preserve">Your biology shifts. Most supplements don’t.</w:t>
       </w:r>
       <w:r>
@@ -1922,7 +1956,7 @@
         <w:t xml:space="preserve"> </w:t>
       </w:r>
       <w:r>
-        <w:t xml:space="preserve">Four boxes:</w:t>
+        <w:t xml:space="preserve">Four cards in the standards style (number, lime topic tag, big figure, cyan rule, one line):</w:t>
       </w:r>
       <w:r>
         <w:t xml:space="preserve"> </w:t>
@@ -1964,13 +1998,13 @@
           <w:bCs/>
           <w:b/>
         </w:rPr>
-        <w:t xml:space="preserve">30%</w:t>
-      </w:r>
-      <w:r>
-        <w:t xml:space="preserve"> </w:t>
-      </w:r>
-      <w:r>
-        <w:t xml:space="preserve">less NAD+ in liver tissue after 60 (Zhou et al., British Journal of Pharmacology 2016) ·</w:t>
+        <w:t xml:space="preserve">50%</w:t>
+      </w:r>
+      <w:r>
+        <w:t xml:space="preserve"> </w:t>
+      </w:r>
+      <w:r>
+        <w:t xml:space="preserve">less NAD+ by the time you reach 40 (Massudi et al., PLoS ONE 2012) ·</w:t>
       </w:r>
       <w:r>
         <w:t xml:space="preserve"> </w:t>

</xml_diff>

<commit_message>
Main PDP: NAD+ card states the decline Massudi shows, without a % by age
Co-Authored-By: Claude Opus 5.5 <noreply@anthropic.com>
Claude-Session: https://claude.ai/code/session_01VYMABjkorQn2QmgJS9ckGR
</commit_message>
<xml_diff>
--- a/handoff/MUTO_Dev_Handoff_Main_PDP_28Oct2026.docx
+++ b/handoff/MUTO_Dev_Handoff_Main_PDP_28Oct2026.docx
@@ -1998,13 +1998,13 @@
           <w:bCs/>
           <w:b/>
         </w:rPr>
-        <w:t xml:space="preserve">50%</w:t>
-      </w:r>
-      <w:r>
-        <w:t xml:space="preserve"> </w:t>
-      </w:r>
-      <w:r>
-        <w:t xml:space="preserve">less NAD+ by the time you reach 40 (Massudi et al., PLoS ONE 2012) ·</w:t>
+        <w:t xml:space="preserve">↓</w:t>
+      </w:r>
+      <w:r>
+        <w:t xml:space="preserve"> </w:t>
+      </w:r>
+      <w:r>
+        <w:t xml:space="preserve">NAD+ falls steadily as you age, in studies of human tissue (Massudi et al., PLoS ONE 2012) ·</w:t>
       </w:r>
       <w:r>
         <w:t xml:space="preserve"> </w:t>

</xml_diff>

<commit_message>
Main PDP: NAD+ card back to 50% by your 40s
Co-Authored-By: Claude Opus 5.5 <noreply@anthropic.com>
Claude-Session: https://claude.ai/code/session_01VYMABjkorQn2QmgJS9ckGR
</commit_message>
<xml_diff>
--- a/handoff/MUTO_Dev_Handoff_Main_PDP_28Oct2026.docx
+++ b/handoff/MUTO_Dev_Handoff_Main_PDP_28Oct2026.docx
@@ -1998,13 +1998,13 @@
           <w:bCs/>
           <w:b/>
         </w:rPr>
-        <w:t xml:space="preserve">↓</w:t>
-      </w:r>
-      <w:r>
-        <w:t xml:space="preserve"> </w:t>
-      </w:r>
-      <w:r>
-        <w:t xml:space="preserve">NAD+ falls steadily as you age, in studies of human tissue (Massudi et al., PLoS ONE 2012) ·</w:t>
+        <w:t xml:space="preserve">50%</w:t>
+      </w:r>
+      <w:r>
+        <w:t xml:space="preserve"> </w:t>
+      </w:r>
+      <w:r>
+        <w:t xml:space="preserve">less NAD+ by your 40s (Massudi et al., PLoS ONE 2012) ·</w:t>
       </w:r>
       <w:r>
         <w:t xml:space="preserve"> </w:t>

</xml_diff>

<commit_message>
Main PDP: smaller, tighter phone scale across the page; problem stats 2x2 on phones
Co-Authored-By: Claude Opus 5.5 <noreply@anthropic.com>
Claude-Session: https://claude.ai/code/session_01VYMABjkorQn2QmgJS9ckGR
</commit_message>
<xml_diff>
--- a/handoff/MUTO_Dev_Handoff_Main_PDP_28Oct2026.docx
+++ b/handoff/MUTO_Dev_Handoff_Main_PDP_28Oct2026.docx
@@ -2724,6 +2724,55 @@
       </w:r>
       <w:r>
         <w:t xml:space="preserve">the billing line under each plan name is smaller (12px) so it fits, and the delivery line is centred.</w:t>
+      </w:r>
+    </w:p>
+    <w:p>
+      <w:pPr>
+        <w:numPr>
+          <w:ilvl w:val="0"/>
+          <w:numId w:val="1005"/>
+        </w:numPr>
+        <w:pStyle w:val="Compact"/>
+      </w:pPr>
+      <w:r>
+        <w:rPr>
+          <w:bCs/>
+          <w:b/>
+        </w:rPr>
+        <w:t xml:space="preserve">Phones, whole page:</w:t>
+      </w:r>
+      <w:r>
+        <w:t xml:space="preserve"> </w:t>
+      </w:r>
+      <w:r>
+        <w:t xml:space="preserve">a smaller, tighter scale below 750px. Headings 28px (the statement 32px), lines under headings 15px, body 14-15px, smaller cards with less padding, benefit cards narrower, problem stats two by two, section spacing 40px. The new bands’ sizes are in</w:t>
+      </w:r>
+      <w:r>
+        <w:t xml:space="preserve"> </w:t>
+      </w:r>
+      <w:r>
+        <w:rPr>
+          <w:rStyle w:val="VerbatimChar"/>
+        </w:rPr>
+        <w:t xml:space="preserve">muto-crea-trust.css</w:t>
+      </w:r>
+      <w:r>
+        <w:t xml:space="preserve">. The live sections’ sizes are in the template’s</w:t>
+      </w:r>
+      <w:r>
+        <w:t xml:space="preserve"> </w:t>
+      </w:r>
+      <w:r>
+        <w:rPr>
+          <w:rStyle w:val="VerbatimChar"/>
+        </w:rPr>
+        <w:t xml:space="preserve">head_styles</w:t>
+      </w:r>
+      <w:r>
+        <w:t xml:space="preserve"> </w:t>
+      </w:r>
+      <w:r>
+        <w:t xml:space="preserve">block, so they only change on this page.</w:t>
       </w:r>
     </w:p>
     <w:p>

</xml_diff>

<commit_message>
Main PDP: delivery line, stats and collab line re-added after section re-draws; tighter Five jobs label gap
Co-Authored-By: Claude Opus 5.5 <noreply@anthropic.com>
Claude-Session: https://claude.ai/code/session_01VYMABjkorQn2QmgJS9ckGR
</commit_message>
<xml_diff>
--- a/handoff/MUTO_Dev_Handoff_Main_PDP_28Oct2026.docx
+++ b/handoff/MUTO_Dev_Handoff_Main_PDP_28Oct2026.docx
@@ -2974,7 +2974,34 @@
         <w:t xml:space="preserve"> </w:t>
       </w:r>
       <w:r>
-        <w:t xml:space="preserve">at the bottom.</w:t>
+        <w:t xml:space="preserve">at the bottom. The</w:t>
+      </w:r>
+      <w:r>
+        <w:t xml:space="preserve"> </w:t>
+      </w:r>
+      <w:r>
+        <w:rPr>
+          <w:rStyle w:val="VerbatimChar"/>
+        </w:rPr>
+        <w:t xml:space="preserve">bands</w:t>
+      </w:r>
+      <w:r>
+        <w:t xml:space="preserve"> </w:t>
+      </w:r>
+      <w:r>
+        <w:t xml:space="preserve">scripts (delivery line, rotating stats, collaboration line, video drag) run again after</w:t>
+      </w:r>
+      <w:r>
+        <w:t xml:space="preserve"> </w:t>
+      </w:r>
+      <w:r>
+        <w:rPr>
+          <w:rStyle w:val="VerbatimChar"/>
+        </w:rPr>
+        <w:t xml:space="preserve">shopify:section:load</w:t>
+      </w:r>
+      <w:r>
+        <w:t xml:space="preserve">, so they survive the theme editor re-drawing the buy box.</w:t>
       </w:r>
     </w:p>
     <w:p>

</xml_diff>

<commit_message>
Main PDP: videos and reviews above the ingredients; comparison heading 'See the difference for yourself.'
Co-Authored-By: Claude Opus 5.5 <noreply@anthropic.com>
Claude-Session: https://claude.ai/code/session_01VYMABjkorQn2QmgJS9ckGR
</commit_message>
<xml_diff>
--- a/handoff/MUTO_Dev_Handoff_Main_PDP_28Oct2026.docx
+++ b/handoff/MUTO_Dev_Handoff_Main_PDP_28Oct2026.docx
@@ -2170,19 +2170,26 @@
         <w:pStyle w:val="Compact"/>
       </w:pPr>
       <w:r>
+        <w:rPr>
+          <w:bCs/>
+          <w:b/>
+        </w:rPr>
+        <w:t xml:space="preserve">Customer videos:</w:t>
+      </w:r>
+      <w:r>
+        <w:t xml:space="preserve"> </w:t>
+      </w:r>
+      <w:r>
         <w:t xml:space="preserve">“</w:t>
       </w:r>
       <w:r>
-        <w:t xml:space="preserve">Every ingredient has a job.</w:t>
+        <w:t xml:space="preserve">Don’t take our word for it.</w:t>
       </w:r>
       <w:r>
         <w:t xml:space="preserve">”</w:t>
       </w:r>
       <w:r>
-        <w:t xml:space="preserve"> </w:t>
-      </w:r>
-      <w:r>
-        <w:t xml:space="preserve">ingredient library</w:t>
+        <w:t xml:space="preserve">, 8 videos in a row that scrolls: Kate Bright, David Mercado, Lucy Halliday, Harry Insley, Adam Facey, Max Richards, Adam Hamilton, Yolanda King. Ellen Gray’s video is removed, and so is the footnote under the row.</w:t>
       </w:r>
     </w:p>
     <w:p>
@@ -2198,7 +2205,7 @@
           <w:bCs/>
           <w:b/>
         </w:rPr>
-        <w:t xml:space="preserve">Customer videos:</w:t>
+        <w:t xml:space="preserve">Reviews:</w:t>
       </w:r>
       <w:r>
         <w:t xml:space="preserve"> </w:t>
@@ -2207,13 +2214,28 @@
         <w:t xml:space="preserve">“</w:t>
       </w:r>
       <w:r>
-        <w:t xml:space="preserve">Don’t take our word for it.</w:t>
+        <w:t xml:space="preserve">What our community say.</w:t>
       </w:r>
       <w:r>
         <w:t xml:space="preserve">”</w:t>
       </w:r>
       <w:r>
-        <w:t xml:space="preserve">, 8 videos in a row that scrolls: Kate Bright, David Mercado, Lucy Halliday, Harry Insley, Adam Facey, Max Richards, Adam Hamilton, Yolanda King. Ellen Gray’s video is removed, and so is the footnote under the row.</w:t>
+        <w:t xml:space="preserve">, 20 five-star REVIEWS.io reviews that rotate every 6 seconds, with</w:t>
+      </w:r>
+      <w:r>
+        <w:t xml:space="preserve"> </w:t>
+      </w:r>
+      <w:r>
+        <w:t xml:space="preserve">“</w:t>
+      </w:r>
+      <w:r>
+        <w:t xml:space="preserve">4.8 from 103 reviews</w:t>
+      </w:r>
+      <w:r>
+        <w:t xml:space="preserve">”</w:t>
+      </w:r>
+      <w:r>
+        <w:t xml:space="preserve">.</w:t>
       </w:r>
     </w:p>
     <w:p>
@@ -2225,41 +2247,19 @@
         <w:pStyle w:val="Compact"/>
       </w:pPr>
       <w:r>
-        <w:rPr>
-          <w:bCs/>
-          <w:b/>
-        </w:rPr>
-        <w:t xml:space="preserve">Reviews:</w:t>
-      </w:r>
-      <w:r>
-        <w:t xml:space="preserve"> </w:t>
-      </w:r>
-      <w:r>
         <w:t xml:space="preserve">“</w:t>
       </w:r>
       <w:r>
-        <w:t xml:space="preserve">What our community say.</w:t>
+        <w:t xml:space="preserve">Every ingredient has a job.</w:t>
       </w:r>
       <w:r>
         <w:t xml:space="preserve">”</w:t>
       </w:r>
       <w:r>
-        <w:t xml:space="preserve">, 20 five-star REVIEWS.io reviews that rotate every 6 seconds, with</w:t>
-      </w:r>
-      <w:r>
-        <w:t xml:space="preserve"> </w:t>
-      </w:r>
-      <w:r>
-        <w:t xml:space="preserve">“</w:t>
-      </w:r>
-      <w:r>
-        <w:t xml:space="preserve">4.8 from 103 reviews</w:t>
-      </w:r>
-      <w:r>
-        <w:t xml:space="preserve">”</w:t>
-      </w:r>
-      <w:r>
-        <w:t xml:space="preserve">.</w:t>
+        <w:t xml:space="preserve"> </w:t>
+      </w:r>
+      <w:r>
+        <w:t xml:space="preserve">ingredient library</w:t>
       </w:r>
     </w:p>
     <w:p>
@@ -2293,7 +2293,22 @@
         <w:pStyle w:val="Compact"/>
       </w:pPr>
       <w:r>
-        <w:t xml:space="preserve">Comparison,</w:t>
+        <w:t xml:space="preserve">Comparison (heading now</w:t>
+      </w:r>
+      <w:r>
+        <w:t xml:space="preserve"> </w:t>
+      </w:r>
+      <w:r>
+        <w:t xml:space="preserve">“</w:t>
+      </w:r>
+      <w:r>
+        <w:t xml:space="preserve">See the difference for yourself.</w:t>
+      </w:r>
+      <w:r>
+        <w:t xml:space="preserve">”</w:t>
+      </w:r>
+      <w:r>
+        <w:t xml:space="preserve">),</w:t>
       </w:r>
       <w:r>
         <w:t xml:space="preserve"> </w:t>

</xml_diff>

<commit_message>
Main PDP: travel vial as a quarterly-only first-order gift (£10); quarterly kit £87
Co-Authored-By: Claude Opus 5.5 <noreply@anthropic.com>
Claude-Session: https://claude.ai/code/session_01VYMABjkorQn2QmgJS9ckGR
</commit_message>
<xml_diff>
--- a/handoff/MUTO_Dev_Handoff_Main_PDP_28Oct2026.docx
+++ b/handoff/MUTO_Dev_Handoff_Main_PDP_28Oct2026.docx
@@ -239,6 +239,22 @@
           <w:b/>
         </w:rPr>
         <w:t xml:space="preserve">2 announcement-bar messages to take down</w:t>
+      </w:r>
+      <w:r>
+        <w:t xml:space="preserve"> </w:t>
+      </w:r>
+      <w:r>
+        <w:t xml:space="preserve">and</w:t>
+      </w:r>
+      <w:r>
+        <w:t xml:space="preserve"> </w:t>
+      </w:r>
+      <w:r>
+        <w:rPr>
+          <w:bCs/>
+          <w:b/>
+        </w:rPr>
+        <w:t xml:space="preserve">1 cart setting for the new travel vial</w:t>
       </w:r>
       <w:r>
         <w:t xml:space="preserve">. No existing theme file is overwritten.</w:t>
@@ -1581,13 +1597,13 @@
       </w:r>
     </w:p>
     <w:bookmarkEnd w:id="24"/>
-    <w:bookmarkStart w:id="25" w:name="step-4-the-announcement-bar"/>
+    <w:bookmarkStart w:id="25" w:name="X93d7b96aa690f301e8fe4f3616095285741404c"/>
     <w:p>
       <w:pPr>
         <w:pStyle w:val="Heading1"/>
       </w:pPr>
       <w:r>
-        <w:t xml:space="preserve">Step 4: the announcement bar</w:t>
+        <w:t xml:space="preserve">Step 4: the travel vial (3-month plan, first order)</w:t>
       </w:r>
     </w:p>
     <w:p>
@@ -1595,170 +1611,36 @@
         <w:pStyle w:val="FirstParagraph"/>
       </w:pPr>
       <w:r>
-        <w:t xml:space="preserve">The scrolling announcement bar at the top of every page (section</w:t>
-      </w:r>
-      <w:r>
-        <w:t xml:space="preserve"> </w:t>
-      </w:r>
-      <w:r>
-        <w:rPr>
-          <w:rStyle w:val="VerbatimChar"/>
-        </w:rPr>
-        <w:t xml:space="preserve">muto-announce</w:t>
-      </w:r>
-      <w:r>
-        <w:t xml:space="preserve"> </w:t>
-      </w:r>
-      <w:r>
-        <w:t xml:space="preserve">in the header group) still advertises the ended offer:</w:t>
-      </w:r>
-      <w:r>
-        <w:t xml:space="preserve"> </w:t>
-      </w:r>
-      <w:r>
-        <w:rPr>
-          <w:bCs/>
-          <w:b/>
-        </w:rPr>
-        <w:t xml:space="preserve">“</w:t>
-      </w:r>
-      <w:r>
-        <w:rPr>
-          <w:bCs/>
-          <w:b/>
-        </w:rPr>
-        <w:t xml:space="preserve">EXTRA 10% OFF OUR QUARTERLY PLAN</w:t>
-      </w:r>
-      <w:r>
-        <w:rPr>
-          <w:bCs/>
-          <w:b/>
-        </w:rPr>
-        <w:t xml:space="preserve">”</w:t>
-      </w:r>
-      <w:r>
-        <w:t xml:space="preserve"> </w:t>
-      </w:r>
-      <w:r>
-        <w:t xml:space="preserve">and</w:t>
-      </w:r>
-      <w:r>
-        <w:t xml:space="preserve"> </w:t>
-      </w:r>
-      <w:r>
-        <w:rPr>
-          <w:bCs/>
-          <w:b/>
-        </w:rPr>
-        <w:t xml:space="preserve">“</w:t>
-      </w:r>
-      <w:r>
-        <w:rPr>
-          <w:bCs/>
-          <w:b/>
-        </w:rPr>
-        <w:t xml:space="preserve">ENDS ON 28.10.26</w:t>
-      </w:r>
-      <w:r>
-        <w:rPr>
-          <w:bCs/>
-          <w:b/>
-        </w:rPr>
-        <w:t xml:space="preserve">”</w:t>
-      </w:r>
-      <w:r>
-        <w:t xml:space="preserve">. Remove those two messages (Customize → Header → announcement bar). The other three (</w:t>
-      </w:r>
-      <w:r>
-        <w:t xml:space="preserve">“</w:t>
-      </w:r>
-      <w:r>
-        <w:t xml:space="preserve">LIMITED NEW CUSTOMER OFFER</w:t>
-      </w:r>
-      <w:r>
-        <w:t xml:space="preserve">”</w:t>
-      </w:r>
-      <w:r>
-        <w:t xml:space="preserve">,</w:t>
-      </w:r>
-      <w:r>
-        <w:t xml:space="preserve"> </w:t>
-      </w:r>
-      <w:r>
-        <w:t xml:space="preserve">“</w:t>
-      </w:r>
-      <w:r>
-        <w:t xml:space="preserve">£77 OF FREE GIFTS WITH EACH ORDER</w:t>
-      </w:r>
-      <w:r>
-        <w:t xml:space="preserve">”</w:t>
-      </w:r>
-      <w:r>
-        <w:t xml:space="preserve">,</w:t>
-      </w:r>
-      <w:r>
-        <w:t xml:space="preserve"> </w:t>
-      </w:r>
-      <w:r>
-        <w:t xml:space="preserve">“</w:t>
-      </w:r>
-      <w:r>
-        <w:t xml:space="preserve">FREE ULTRAPURE CREATINE, BOTTLE, SOCKS, JAR, EBOOK</w:t>
-      </w:r>
-      <w:r>
-        <w:t xml:space="preserve">”</w:t>
-      </w:r>
-      <w:r>
-        <w:t xml:space="preserve">) can stay.</w:t>
-      </w:r>
-    </w:p>
-    <w:bookmarkEnd w:id="25"/>
-    <w:bookmarkStart w:id="27" w:name="whats-on-the-new-page"/>
-    <w:p>
-      <w:pPr>
-        <w:pStyle w:val="Heading1"/>
-      </w:pPr>
-      <w:r>
-        <w:t xml:space="preserve">What’s on the new page</w:t>
-      </w:r>
-    </w:p>
-    <w:p>
-      <w:pPr>
-        <w:pStyle w:val="FirstParagraph"/>
-      </w:pPr>
-      <w:r>
-        <w:t xml:space="preserve">In order, below the buy box.</w:t>
-      </w:r>
-      <w:r>
-        <w:t xml:space="preserve"> </w:t>
-      </w:r>
-      <w:r>
-        <w:rPr>
-          <w:bCs/>
-          <w:b/>
-        </w:rPr>
-        <w:t xml:space="preserve">New</w:t>
-      </w:r>
-      <w:r>
-        <w:t xml:space="preserve"> </w:t>
-      </w:r>
-      <w:r>
-        <w:t xml:space="preserve">blocks are in bold; the rest is</w:t>
-      </w:r>
-      <w:r>
-        <w:t xml:space="preserve"> </w:t>
-      </w:r>
-      <w:r>
-        <w:rPr>
-          <w:rStyle w:val="VerbatimChar"/>
-        </w:rPr>
-        <w:t xml:space="preserve">muto-nad-v2</w:t>
-      </w:r>
-      <w:r>
-        <w:t xml:space="preserve"> </w:t>
-      </w:r>
-      <w:r>
-        <w:t xml:space="preserve">as it is on live today.</w:t>
+        <w:t xml:space="preserve">A free</w:t>
+      </w:r>
+      <w:r>
+        <w:t xml:space="preserve"> </w:t>
+      </w:r>
+      <w:r>
+        <w:rPr>
+          <w:bCs/>
+          <w:b/>
+        </w:rPr>
+        <w:t xml:space="preserve">travel vial</w:t>
+      </w:r>
+      <w:r>
+        <w:t xml:space="preserve"> </w:t>
+      </w:r>
+      <w:r>
+        <w:t xml:space="preserve">now comes with the first order on the 3-month plan only, shown with</w:t>
+      </w:r>
+      <w:r>
+        <w:t xml:space="preserve"> </w:t>
+      </w:r>
+      <w:r>
+        <w:rPr>
+          <w:bCs/>
+          <w:b/>
+        </w:rPr>
+        <w:t xml:space="preserve">£10 crossed out</w:t>
+      </w:r>
+      <w:r>
+        <w:t xml:space="preserve">, like the other gifts.</w:t>
       </w:r>
     </w:p>
     <w:p>
@@ -1770,74 +1652,50 @@
         <w:pStyle w:val="Compact"/>
       </w:pPr>
       <w:r>
+        <w:rPr>
+          <w:bCs/>
+          <w:b/>
+        </w:rPr>
+        <w:t xml:space="preserve">Product: already created.</w:t>
+      </w:r>
+      <w:r>
+        <w:t xml:space="preserve"> </w:t>
+      </w:r>
+      <w:r>
         <w:t xml:space="preserve">“</w:t>
       </w:r>
       <w:r>
-        <w:t xml:space="preserve">On this page</w:t>
+        <w:t xml:space="preserve">Travel Vial</w:t>
       </w:r>
       <w:r>
         <w:t xml:space="preserve">”</w:t>
       </w:r>
       <w:r>
-        <w:t xml:space="preserve"> </w:t>
-      </w:r>
-      <w:r>
-        <w:t xml:space="preserve">menu (pins to the top as you scroll, as on live), with four new links:</w:t>
-      </w:r>
-      <w:r>
-        <w:t xml:space="preserve"> </w:t>
-      </w:r>
-      <w:r>
-        <w:rPr>
-          <w:bCs/>
-          <w:b/>
-        </w:rPr>
-        <w:t xml:space="preserve">Problem</w:t>
-      </w:r>
-      <w:r>
-        <w:t xml:space="preserve">,</w:t>
-      </w:r>
-      <w:r>
-        <w:t xml:space="preserve"> </w:t>
-      </w:r>
-      <w:r>
-        <w:rPr>
-          <w:bCs/>
-          <w:b/>
-        </w:rPr>
-        <w:t xml:space="preserve">Standards</w:t>
-      </w:r>
-      <w:r>
-        <w:t xml:space="preserve">,</w:t>
-      </w:r>
-      <w:r>
-        <w:t xml:space="preserve"> </w:t>
-      </w:r>
-      <w:r>
-        <w:rPr>
-          <w:bCs/>
-          <w:b/>
-        </w:rPr>
-        <w:t xml:space="preserve">What people say</w:t>
-      </w:r>
-      <w:r>
-        <w:t xml:space="preserve"> </w:t>
-      </w:r>
-      <w:r>
-        <w:t xml:space="preserve">(the videos) and</w:t>
-      </w:r>
-      <w:r>
-        <w:t xml:space="preserve"> </w:t>
-      </w:r>
-      <w:r>
-        <w:rPr>
-          <w:bCs/>
-          <w:b/>
-        </w:rPr>
-        <w:t xml:space="preserve">Founder</w:t>
-      </w:r>
-      <w:r>
-        <w:t xml:space="preserve">, 12 links in page order</w:t>
+        <w:t xml:space="preserve">, handle</w:t>
+      </w:r>
+      <w:r>
+        <w:t xml:space="preserve"> </w:t>
+      </w:r>
+      <w:r>
+        <w:rPr>
+          <w:rStyle w:val="VerbatimChar"/>
+        </w:rPr>
+        <w:t xml:space="preserve">muto-travel-vial-free</w:t>
+      </w:r>
+      <w:r>
+        <w:t xml:space="preserve">, SKU</w:t>
+      </w:r>
+      <w:r>
+        <w:t xml:space="preserve"> </w:t>
+      </w:r>
+      <w:r>
+        <w:rPr>
+          <w:rStyle w:val="VerbatimChar"/>
+        </w:rPr>
+        <w:t xml:space="preserve">TRAVEL-VIAL</w:t>
+      </w:r>
+      <w:r>
+        <w:t xml:space="preserve">, £0 with a £10 compare-at, unlisted, stock not tracked, published to the Online Store. It still needs a photo.</w:t>
       </w:r>
     </w:p>
     <w:p>
@@ -1853,7 +1711,47 @@
           <w:bCs/>
           <w:b/>
         </w:rPr>
-        <w:t xml:space="preserve">Statement:</w:t>
+        <w:t xml:space="preserve">Cart: one setting to change on the live theme.</w:t>
+      </w:r>
+      <w:r>
+        <w:t xml:space="preserve"> </w:t>
+      </w:r>
+      <w:r>
+        <w:t xml:space="preserve">Online Store → Customize → Theme settings → the cart giveaway settings → the 3-month free products list (</w:t>
+      </w:r>
+      <w:r>
+        <w:rPr>
+          <w:rStyle w:val="VerbatimChar"/>
+        </w:rPr>
+        <w:t xml:space="preserve">cart_free_product_3m</w:t>
+      </w:r>
+      <w:r>
+        <w:t xml:space="preserve">). Add</w:t>
+      </w:r>
+      <w:r>
+        <w:t xml:space="preserve"> </w:t>
+      </w:r>
+      <w:r>
+        <w:rPr>
+          <w:bCs/>
+          <w:b/>
+        </w:rPr>
+        <w:t xml:space="preserve">Travel Vial</w:t>
+      </w:r>
+      <w:r>
+        <w:t xml:space="preserve"> </w:t>
+      </w:r>
+      <w:r>
+        <w:t xml:space="preserve">(</w:t>
+      </w:r>
+      <w:r>
+        <w:rPr>
+          <w:rStyle w:val="VerbatimChar"/>
+        </w:rPr>
+        <w:t xml:space="preserve">muto-travel-vial-free</w:t>
+      </w:r>
+      <w:r>
+        <w:t xml:space="preserve">) to the list, alongside the bottle, socks, creatine and Garmin entry. The theme’s giveaway script then adds it to the cart at £0 whenever the 3-month NAD+ subscription is in it. The cart drawer lists it under</w:t>
       </w:r>
       <w:r>
         <w:t xml:space="preserve"> </w:t>
@@ -1862,7 +1760,7 @@
         <w:t xml:space="preserve">“</w:t>
       </w:r>
       <w:r>
-        <w:t xml:space="preserve">Not ready to slow down.</w:t>
+        <w:t xml:space="preserve">Your free welcome gifts</w:t>
       </w:r>
       <w:r>
         <w:t xml:space="preserve">”</w:t>
@@ -1871,7 +1769,7 @@
         <w:t xml:space="preserve"> </w:t>
       </w:r>
       <w:r>
-        <w:t xml:space="preserve">/</w:t>
+        <w:t xml:space="preserve">with £10 struck through and</w:t>
       </w:r>
       <w:r>
         <w:t xml:space="preserve"> </w:t>
@@ -1880,28 +1778,13 @@
         <w:t xml:space="preserve">“</w:t>
       </w:r>
       <w:r>
-        <w:t xml:space="preserve">The next-generation multi-nutrient, built for what your body needs in your 40s and 50s.</w:t>
+        <w:t xml:space="preserve">Free</w:t>
       </w:r>
       <w:r>
         <w:t xml:space="preserve">”</w:t>
       </w:r>
       <w:r>
-        <w:t xml:space="preserve"> </w:t>
-      </w:r>
-      <w:r>
-        <w:t xml:space="preserve">/ tag</w:t>
-      </w:r>
-      <w:r>
-        <w:t xml:space="preserve"> </w:t>
-      </w:r>
-      <w:r>
-        <w:t xml:space="preserve">“</w:t>
-      </w:r>
-      <w:r>
-        <w:t xml:space="preserve">Got a wearable? Track the shift over 90 days.</w:t>
-      </w:r>
-      <w:r>
-        <w:t xml:space="preserve">”</w:t>
+        <w:t xml:space="preserve">. Subscription renewals don’t carry cart gifts, so it only ships with the first order.</w:t>
       </w:r>
     </w:p>
     <w:p>
@@ -1917,13 +1800,13 @@
           <w:bCs/>
           <w:b/>
         </w:rPr>
-        <w:t xml:space="preserve">The problem:</w:t>
-      </w:r>
-      <w:r>
-        <w:t xml:space="preserve"> </w:t>
-      </w:r>
-      <w:r>
-        <w:t xml:space="preserve">small mono label</w:t>
+        <w:t xml:space="preserve">Page: in the template.</w:t>
+      </w:r>
+      <w:r>
+        <w:t xml:space="preserve"> </w:t>
+      </w:r>
+      <w:r>
+        <w:t xml:space="preserve">The welcome kit shows a</w:t>
       </w:r>
       <w:r>
         <w:t xml:space="preserve"> </w:t>
@@ -1932,95 +1815,32 @@
         <w:t xml:space="preserve">“</w:t>
       </w:r>
       <w:r>
-        <w:t xml:space="preserve">The problem</w:t>
+        <w:t xml:space="preserve">Travel vial</w:t>
       </w:r>
       <w:r>
         <w:t xml:space="preserve">”</w:t>
       </w:r>
       <w:r>
-        <w:t xml:space="preserve">, heading</w:t>
-      </w:r>
-      <w:r>
-        <w:t xml:space="preserve"> </w:t>
-      </w:r>
-      <w:r>
-        <w:t xml:space="preserve">“</w:t>
-      </w:r>
-      <w:r>
-        <w:t xml:space="preserve">Your biology shifts. Most supplements don’t.</w:t>
-      </w:r>
-      <w:r>
-        <w:t xml:space="preserve">”</w:t>
-      </w:r>
-      <w:r>
-        <w:t xml:space="preserve"> </w:t>
-      </w:r>
-      <w:r>
-        <w:t xml:space="preserve">Four cards in the standards style (number, lime topic tag, big figure, cyan rule, one line):</w:t>
-      </w:r>
-      <w:r>
-        <w:t xml:space="preserve"> </w:t>
-      </w:r>
-      <w:r>
-        <w:rPr>
-          <w:bCs/>
-          <w:b/>
-        </w:rPr>
-        <w:t xml:space="preserve">57%</w:t>
-      </w:r>
-      <w:r>
-        <w:t xml:space="preserve"> </w:t>
-      </w:r>
-      <w:r>
-        <w:t xml:space="preserve">of supplements tested didn’t match their label (Crawford et al., JAMA Network Open 2022) ·</w:t>
-      </w:r>
-      <w:r>
-        <w:t xml:space="preserve"> </w:t>
-      </w:r>
-      <w:r>
-        <w:rPr>
-          <w:bCs/>
-          <w:b/>
-        </w:rPr>
-        <w:t xml:space="preserve">1 in 2</w:t>
-      </w:r>
-      <w:r>
-        <w:t xml:space="preserve"> </w:t>
-      </w:r>
-      <w:r>
-        <w:t xml:space="preserve">deaths are linked to chronic inflammation (Furman et al., Nature Medicine 2019) ·</w:t>
-      </w:r>
-      <w:r>
-        <w:t xml:space="preserve"> </w:t>
-      </w:r>
-      <w:r>
-        <w:rPr>
-          <w:bCs/>
-          <w:b/>
-        </w:rPr>
-        <w:t xml:space="preserve">50%</w:t>
-      </w:r>
-      <w:r>
-        <w:t xml:space="preserve"> </w:t>
-      </w:r>
-      <w:r>
-        <w:t xml:space="preserve">less NAD+ in skin by middle age (Massudi et al., PLoS ONE 2012, analysed in Peluso et al., Nutrients 2022) ·</w:t>
-      </w:r>
-      <w:r>
-        <w:t xml:space="preserve"> </w:t>
-      </w:r>
-      <w:r>
-        <w:rPr>
-          <w:bCs/>
-          <w:b/>
-        </w:rPr>
-        <w:t xml:space="preserve">50%</w:t>
-      </w:r>
-      <w:r>
-        <w:t xml:space="preserve"> </w:t>
-      </w:r>
-      <w:r>
-        <w:t xml:space="preserve">lower muscle mitochondrial capacity by your late 60s (Conley et al., Journal of Physiology 2000). Sources in a small line underneath.</w:t>
+        <w:t xml:space="preserve"> </w:t>
+      </w:r>
+      <w:r>
+        <w:t xml:space="preserve">tile (£10 struck through) and an itemised row on the quarterly plan only. The quarterly kit is now worth</w:t>
+      </w:r>
+      <w:r>
+        <w:t xml:space="preserve"> </w:t>
+      </w:r>
+      <w:r>
+        <w:rPr>
+          <w:bCs/>
+          <w:b/>
+        </w:rPr>
+        <w:t xml:space="preserve">£87</w:t>
+      </w:r>
+      <w:r>
+        <w:t xml:space="preserve"> </w:t>
+      </w:r>
+      <w:r>
+        <w:t xml:space="preserve">(was £77) in the plan’s bullet and the bar above the plans.</w:t>
       </w:r>
     </w:p>
     <w:p>
@@ -2036,13 +1856,13 @@
           <w:bCs/>
           <w:b/>
         </w:rPr>
-        <w:t xml:space="preserve">Benefits:</w:t>
-      </w:r>
-      <w:r>
-        <w:t xml:space="preserve"> </w:t>
-      </w:r>
-      <w:r>
-        <w:t xml:space="preserve">the live five cards, with a new heading:</w:t>
+        <w:t xml:space="preserve">Also say £87</w:t>
+      </w:r>
+      <w:r>
+        <w:t xml:space="preserve"> </w:t>
+      </w:r>
+      <w:r>
+        <w:t xml:space="preserve">wherever else the quarterly kit is quoted at £77, e.g. the announcement bar’s</w:t>
       </w:r>
       <w:r>
         <w:t xml:space="preserve"> </w:t>
@@ -2051,7 +1871,7 @@
         <w:t xml:space="preserve">“</w:t>
       </w:r>
       <w:r>
-        <w:t xml:space="preserve">Benefits built on published science.</w:t>
+        <w:t xml:space="preserve">£77 OF FREE GIFTS WITH EACH ORDER</w:t>
       </w:r>
       <w:r>
         <w:t xml:space="preserve">”</w:t>
@@ -2060,87 +1880,109 @@
         <w:t xml:space="preserve"> </w:t>
       </w:r>
       <w:r>
-        <w:t xml:space="preserve">(small line above:</w:t>
-      </w:r>
-      <w:r>
-        <w:t xml:space="preserve"> </w:t>
-      </w:r>
-      <w:r>
+        <w:t xml:space="preserve">if that’s meant to be the quarterly figure.</w:t>
+      </w:r>
+    </w:p>
+    <w:bookmarkEnd w:id="25"/>
+    <w:bookmarkStart w:id="26" w:name="step-5-the-announcement-bar"/>
+    <w:p>
+      <w:pPr>
+        <w:pStyle w:val="Heading1"/>
+      </w:pPr>
+      <w:r>
+        <w:t xml:space="preserve">Step 5: the announcement bar</w:t>
+      </w:r>
+    </w:p>
+    <w:p>
+      <w:pPr>
+        <w:pStyle w:val="FirstParagraph"/>
+      </w:pPr>
+      <w:r>
+        <w:t xml:space="preserve">The scrolling announcement bar at the top of every page (section</w:t>
+      </w:r>
+      <w:r>
+        <w:t xml:space="preserve"> </w:t>
+      </w:r>
+      <w:r>
+        <w:rPr>
+          <w:rStyle w:val="VerbatimChar"/>
+        </w:rPr>
+        <w:t xml:space="preserve">muto-announce</w:t>
+      </w:r>
+      <w:r>
+        <w:t xml:space="preserve"> </w:t>
+      </w:r>
+      <w:r>
+        <w:t xml:space="preserve">in the header group) still advertises the ended offer:</w:t>
+      </w:r>
+      <w:r>
+        <w:t xml:space="preserve"> </w:t>
+      </w:r>
+      <w:r>
+        <w:rPr>
+          <w:bCs/>
+          <w:b/>
+        </w:rPr>
         <w:t xml:space="preserve">“</w:t>
       </w:r>
       <w:r>
-        <w:t xml:space="preserve">Five jobs. One daily jar.</w:t>
-      </w:r>
-      <w:r>
+        <w:rPr>
+          <w:bCs/>
+          <w:b/>
+        </w:rPr>
+        <w:t xml:space="preserve">EXTRA 10% OFF OUR QUARTERLY PLAN</w:t>
+      </w:r>
+      <w:r>
+        <w:rPr>
+          <w:bCs/>
+          <w:b/>
+        </w:rPr>
         <w:t xml:space="preserve">”</w:t>
       </w:r>
       <w:r>
-        <w:t xml:space="preserve">), and a new line under it:</w:t>
-      </w:r>
-      <w:r>
-        <w:t xml:space="preserve"> </w:t>
-      </w:r>
-      <w:r>
+        <w:t xml:space="preserve"> </w:t>
+      </w:r>
+      <w:r>
+        <w:t xml:space="preserve">and</w:t>
+      </w:r>
+      <w:r>
+        <w:t xml:space="preserve"> </w:t>
+      </w:r>
+      <w:r>
+        <w:rPr>
+          <w:bCs/>
+          <w:b/>
+        </w:rPr>
         <w:t xml:space="preserve">“</w:t>
       </w:r>
       <w:r>
-        <w:t xml:space="preserve">What you need after 35. Your biology shifts. What you need evolves.</w:t>
-      </w:r>
-      <w:r>
+        <w:rPr>
+          <w:bCs/>
+          <w:b/>
+        </w:rPr>
+        <w:t xml:space="preserve">ENDS ON 28.10.26</w:t>
+      </w:r>
+      <w:r>
+        <w:rPr>
+          <w:bCs/>
+          <w:b/>
+        </w:rPr>
         <w:t xml:space="preserve">”</w:t>
       </w:r>
-    </w:p>
-    <w:p>
-      <w:pPr>
-        <w:numPr>
-          <w:ilvl w:val="0"/>
-          <w:numId w:val="1004"/>
-        </w:numPr>
-        <w:pStyle w:val="Compact"/>
-      </w:pPr>
-      <w:r>
-        <w:rPr>
-          <w:bCs/>
-          <w:b/>
-        </w:rPr>
-        <w:t xml:space="preserve">Science board:</w:t>
-      </w:r>
-      <w:r>
-        <w:t xml:space="preserve"> </w:t>
+      <w:r>
+        <w:t xml:space="preserve">. Remove those two messages (Customize → Header → announcement bar). The other three (</w:t>
       </w:r>
       <w:r>
         <w:t xml:space="preserve">“</w:t>
       </w:r>
       <w:r>
-        <w:t xml:space="preserve">Six scientists put their name to MUTO.</w:t>
+        <w:t xml:space="preserve">LIMITED NEW CUSTOMER OFFER</w:t>
       </w:r>
       <w:r>
         <w:t xml:space="preserve">”</w:t>
       </w:r>
       <w:r>
-        <w:t xml:space="preserve">, compact row, white background.</w:t>
-      </w:r>
-    </w:p>
-    <w:p>
-      <w:pPr>
-        <w:numPr>
-          <w:ilvl w:val="0"/>
-          <w:numId w:val="1004"/>
-        </w:numPr>
-        <w:pStyle w:val="Compact"/>
-      </w:pPr>
-      <w:r>
-        <w:rPr>
-          <w:bCs/>
-          <w:b/>
-        </w:rPr>
-        <w:t xml:space="preserve">Standards:</w:t>
-      </w:r>
-      <w:r>
-        <w:t xml:space="preserve"> </w:t>
-      </w:r>
-      <w:r>
-        <w:t xml:space="preserve">four cards. Card 1 has the</w:t>
+        <w:t xml:space="preserve">,</w:t>
       </w:r>
       <w:r>
         <w:t xml:space="preserve"> </w:t>
@@ -2149,32 +1991,13 @@
         <w:t xml:space="preserve">“</w:t>
       </w:r>
       <w:r>
-        <w:t xml:space="preserve">View third-party testing results</w:t>
+        <w:t xml:space="preserve">£77 OF FREE GIFTS WITH EACH ORDER</w:t>
       </w:r>
       <w:r>
         <w:t xml:space="preserve">”</w:t>
       </w:r>
       <w:r>
-        <w:t xml:space="preserve"> </w:t>
-      </w:r>
-      <w:r>
-        <w:t xml:space="preserve">button, which opens the certificate panel (batch 2333).</w:t>
-      </w:r>
-    </w:p>
-    <w:p>
-      <w:pPr>
-        <w:numPr>
-          <w:ilvl w:val="0"/>
-          <w:numId w:val="1004"/>
-        </w:numPr>
-        <w:pStyle w:val="Compact"/>
-      </w:pPr>
-      <w:r>
-        <w:rPr>
-          <w:bCs/>
-          <w:b/>
-        </w:rPr>
-        <w:t xml:space="preserve">Customer videos:</w:t>
+        <w:t xml:space="preserve">,</w:t>
       </w:r>
       <w:r>
         <w:t xml:space="preserve"> </w:t>
@@ -2183,165 +2006,23 @@
         <w:t xml:space="preserve">“</w:t>
       </w:r>
       <w:r>
-        <w:t xml:space="preserve">Don’t take our word for it.</w:t>
+        <w:t xml:space="preserve">FREE ULTRAPURE CREATINE, BOTTLE, SOCKS, JAR, EBOOK</w:t>
       </w:r>
       <w:r>
         <w:t xml:space="preserve">”</w:t>
       </w:r>
       <w:r>
-        <w:t xml:space="preserve">, 8 videos in a row that scrolls: Kate Bright, David Mercado, Lucy Halliday, Harry Insley, Adam Facey, Max Richards, Adam Hamilton, Yolanda King. Ellen Gray’s video is removed, and so is the footnote under the row.</w:t>
-      </w:r>
-    </w:p>
-    <w:p>
-      <w:pPr>
-        <w:numPr>
-          <w:ilvl w:val="0"/>
-          <w:numId w:val="1004"/>
-        </w:numPr>
-        <w:pStyle w:val="Compact"/>
-      </w:pPr>
-      <w:r>
-        <w:rPr>
-          <w:bCs/>
-          <w:b/>
-        </w:rPr>
-        <w:t xml:space="preserve">Reviews:</w:t>
-      </w:r>
-      <w:r>
-        <w:t xml:space="preserve"> </w:t>
-      </w:r>
-      <w:r>
-        <w:t xml:space="preserve">“</w:t>
-      </w:r>
-      <w:r>
-        <w:t xml:space="preserve">What our community say.</w:t>
-      </w:r>
-      <w:r>
-        <w:t xml:space="preserve">”</w:t>
-      </w:r>
-      <w:r>
-        <w:t xml:space="preserve">, 20 five-star REVIEWS.io reviews that rotate every 6 seconds, with</w:t>
-      </w:r>
-      <w:r>
-        <w:t xml:space="preserve"> </w:t>
-      </w:r>
-      <w:r>
-        <w:t xml:space="preserve">“</w:t>
-      </w:r>
-      <w:r>
-        <w:t xml:space="preserve">4.8 from 103 reviews</w:t>
-      </w:r>
-      <w:r>
-        <w:t xml:space="preserve">”</w:t>
-      </w:r>
-      <w:r>
-        <w:t xml:space="preserve">.</w:t>
-      </w:r>
-    </w:p>
-    <w:p>
-      <w:pPr>
-        <w:numPr>
-          <w:ilvl w:val="0"/>
-          <w:numId w:val="1004"/>
-        </w:numPr>
-        <w:pStyle w:val="Compact"/>
-      </w:pPr>
-      <w:r>
-        <w:t xml:space="preserve">“</w:t>
-      </w:r>
-      <w:r>
-        <w:t xml:space="preserve">Every ingredient has a job.</w:t>
-      </w:r>
-      <w:r>
-        <w:t xml:space="preserve">”</w:t>
-      </w:r>
-      <w:r>
-        <w:t xml:space="preserve"> </w:t>
-      </w:r>
-      <w:r>
-        <w:t xml:space="preserve">ingredient library</w:t>
-      </w:r>
-    </w:p>
-    <w:p>
-      <w:pPr>
-        <w:numPr>
-          <w:ilvl w:val="0"/>
-          <w:numId w:val="1004"/>
-        </w:numPr>
-        <w:pStyle w:val="Compact"/>
-      </w:pPr>
-      <w:r>
-        <w:rPr>
-          <w:bCs/>
-          <w:b/>
-        </w:rPr>
-        <w:t xml:space="preserve">Founder:</w:t>
-      </w:r>
-      <w:r>
-        <w:t xml:space="preserve"> </w:t>
-      </w:r>
-      <w:r>
-        <w:t xml:space="preserve">Dr Richie Barclay, PhD: cell biologist, Harley Street nutritionist for 13 years, former cricketer and tennis player.</w:t>
-      </w:r>
-    </w:p>
-    <w:p>
-      <w:pPr>
-        <w:numPr>
-          <w:ilvl w:val="0"/>
-          <w:numId w:val="1004"/>
-        </w:numPr>
-        <w:pStyle w:val="Compact"/>
-      </w:pPr>
-      <w:r>
-        <w:t xml:space="preserve">Comparison (heading now</w:t>
-      </w:r>
-      <w:r>
-        <w:t xml:space="preserve"> </w:t>
-      </w:r>
-      <w:r>
-        <w:t xml:space="preserve">“</w:t>
-      </w:r>
-      <w:r>
-        <w:t xml:space="preserve">See the difference for yourself.</w:t>
-      </w:r>
-      <w:r>
-        <w:t xml:space="preserve">”</w:t>
-      </w:r>
-      <w:r>
-        <w:t xml:space="preserve">),</w:t>
-      </w:r>
-      <w:r>
-        <w:t xml:space="preserve"> </w:t>
-      </w:r>
-      <w:r>
-        <w:t xml:space="preserve">“</w:t>
-      </w:r>
-      <w:r>
-        <w:t xml:space="preserve">What you can expect over time.</w:t>
-      </w:r>
-      <w:r>
-        <w:t xml:space="preserve">”</w:t>
-      </w:r>
-      <w:r>
-        <w:t xml:space="preserve"> </w:t>
-      </w:r>
-      <w:r>
-        <w:t xml:space="preserve">timeline,</w:t>
-      </w:r>
-      <w:r>
-        <w:t xml:space="preserve"> </w:t>
-      </w:r>
-      <w:r>
-        <w:t xml:space="preserve">“</w:t>
-      </w:r>
-      <w:r>
-        <w:t xml:space="preserve">How to take it.</w:t>
-      </w:r>
-      <w:r>
-        <w:t xml:space="preserve">”</w:t>
-      </w:r>
-      <w:r>
-        <w:t xml:space="preserve">, FAQs (all 10 from live), REVIEWS.io widget.</w:t>
+        <w:t xml:space="preserve">) can stay.</w:t>
+      </w:r>
+    </w:p>
+    <w:bookmarkEnd w:id="26"/>
+    <w:bookmarkStart w:id="28" w:name="whats-on-the-new-page"/>
+    <w:p>
+      <w:pPr>
+        <w:pStyle w:val="Heading1"/>
+      </w:pPr>
+      <w:r>
+        <w:t xml:space="preserve">What’s on the new page</w:t>
       </w:r>
     </w:p>
     <w:p>
@@ -2349,7 +2030,23 @@
         <w:pStyle w:val="FirstParagraph"/>
       </w:pPr>
       <w:r>
-        <w:t xml:space="preserve">Also changed from</w:t>
+        <w:t xml:space="preserve">In order, below the buy box.</w:t>
+      </w:r>
+      <w:r>
+        <w:t xml:space="preserve"> </w:t>
+      </w:r>
+      <w:r>
+        <w:rPr>
+          <w:bCs/>
+          <w:b/>
+        </w:rPr>
+        <w:t xml:space="preserve">New</w:t>
+      </w:r>
+      <w:r>
+        <w:t xml:space="preserve"> </w:t>
+      </w:r>
+      <w:r>
+        <w:t xml:space="preserve">blocks are in bold; the rest is</w:t>
       </w:r>
       <w:r>
         <w:t xml:space="preserve"> </w:t>
@@ -2361,7 +2058,10 @@
         <w:t xml:space="preserve">muto-nad-v2</w:t>
       </w:r>
       <w:r>
-        <w:t xml:space="preserve">:</w:t>
+        <w:t xml:space="preserve"> </w:t>
+      </w:r>
+      <w:r>
+        <w:t xml:space="preserve">as it is on live today.</w:t>
       </w:r>
     </w:p>
     <w:p>
@@ -2373,26 +2073,10 @@
         <w:pStyle w:val="Compact"/>
       </w:pPr>
       <w:r>
-        <w:rPr>
-          <w:bCs/>
-          <w:b/>
-        </w:rPr>
-        <w:t xml:space="preserve">Under the buy button:</w:t>
-      </w:r>
-      <w:r>
-        <w:t xml:space="preserve"> </w:t>
-      </w:r>
-      <w:r>
-        <w:t xml:space="preserve">the serving line,</w:t>
-      </w:r>
-      <w:r>
-        <w:t xml:space="preserve"> </w:t>
-      </w:r>
-      <w:r>
         <w:t xml:space="preserve">“</w:t>
       </w:r>
       <w:r>
-        <w:t xml:space="preserve">Not another multivitamin…</w:t>
+        <w:t xml:space="preserve">On this page</w:t>
       </w:r>
       <w:r>
         <w:t xml:space="preserve">”</w:t>
@@ -2401,7 +2085,62 @@
         <w:t xml:space="preserve"> </w:t>
       </w:r>
       <w:r>
-        <w:t xml:space="preserve">copy and the quote slider are blanked or hidden (not deleted).</w:t>
+        <w:t xml:space="preserve">menu (pins to the top as you scroll, as on live), with four new links:</w:t>
+      </w:r>
+      <w:r>
+        <w:t xml:space="preserve"> </w:t>
+      </w:r>
+      <w:r>
+        <w:rPr>
+          <w:bCs/>
+          <w:b/>
+        </w:rPr>
+        <w:t xml:space="preserve">Problem</w:t>
+      </w:r>
+      <w:r>
+        <w:t xml:space="preserve">,</w:t>
+      </w:r>
+      <w:r>
+        <w:t xml:space="preserve"> </w:t>
+      </w:r>
+      <w:r>
+        <w:rPr>
+          <w:bCs/>
+          <w:b/>
+        </w:rPr>
+        <w:t xml:space="preserve">Standards</w:t>
+      </w:r>
+      <w:r>
+        <w:t xml:space="preserve">,</w:t>
+      </w:r>
+      <w:r>
+        <w:t xml:space="preserve"> </w:t>
+      </w:r>
+      <w:r>
+        <w:rPr>
+          <w:bCs/>
+          <w:b/>
+        </w:rPr>
+        <w:t xml:space="preserve">What people say</w:t>
+      </w:r>
+      <w:r>
+        <w:t xml:space="preserve"> </w:t>
+      </w:r>
+      <w:r>
+        <w:t xml:space="preserve">(the videos) and</w:t>
+      </w:r>
+      <w:r>
+        <w:t xml:space="preserve"> </w:t>
+      </w:r>
+      <w:r>
+        <w:rPr>
+          <w:bCs/>
+          <w:b/>
+        </w:rPr>
+        <w:t xml:space="preserve">Founder</w:t>
+      </w:r>
+      <w:r>
+        <w:t xml:space="preserve">, 12 links in page order</w:t>
       </w:r>
     </w:p>
     <w:p>
@@ -2417,26 +2156,7 @@
           <w:bCs/>
           <w:b/>
         </w:rPr>
-        <w:t xml:space="preserve">Buy button</w:t>
-      </w:r>
-      <w:r>
-        <w:t xml:space="preserve"> </w:t>
-      </w:r>
-      <w:r>
-        <w:t xml:space="preserve">in brand green</w:t>
-      </w:r>
-      <w:r>
-        <w:t xml:space="preserve"> </w:t>
-      </w:r>
-      <w:r>
-        <w:rPr>
-          <w:bCs/>
-          <w:b/>
-        </w:rPr>
-        <w:t xml:space="preserve">#6BCE7F</w:t>
-      </w:r>
-      <w:r>
-        <w:t xml:space="preserve">, charcoal label, with a second line inside it: a shield and</w:t>
+        <w:t xml:space="preserve">Statement:</w:t>
       </w:r>
       <w:r>
         <w:t xml:space="preserve"> </w:t>
@@ -2445,13 +2165,46 @@
         <w:t xml:space="preserve">“</w:t>
       </w:r>
       <w:r>
-        <w:t xml:space="preserve">90-day money-back guarantee</w:t>
+        <w:t xml:space="preserve">Not ready to slow down.</w:t>
       </w:r>
       <w:r>
         <w:t xml:space="preserve">”</w:t>
       </w:r>
       <w:r>
-        <w:t xml:space="preserve">.</w:t>
+        <w:t xml:space="preserve"> </w:t>
+      </w:r>
+      <w:r>
+        <w:t xml:space="preserve">/</w:t>
+      </w:r>
+      <w:r>
+        <w:t xml:space="preserve"> </w:t>
+      </w:r>
+      <w:r>
+        <w:t xml:space="preserve">“</w:t>
+      </w:r>
+      <w:r>
+        <w:t xml:space="preserve">The next-generation multi-nutrient, built for what your body needs in your 40s and 50s.</w:t>
+      </w:r>
+      <w:r>
+        <w:t xml:space="preserve">”</w:t>
+      </w:r>
+      <w:r>
+        <w:t xml:space="preserve"> </w:t>
+      </w:r>
+      <w:r>
+        <w:t xml:space="preserve">/ tag</w:t>
+      </w:r>
+      <w:r>
+        <w:t xml:space="preserve"> </w:t>
+      </w:r>
+      <w:r>
+        <w:t xml:space="preserve">“</w:t>
+      </w:r>
+      <w:r>
+        <w:t xml:space="preserve">Got a wearable? Track the shift over 90 days.</w:t>
+      </w:r>
+      <w:r>
+        <w:t xml:space="preserve">”</w:t>
       </w:r>
     </w:p>
     <w:p>
@@ -2467,7 +2220,13 @@
           <w:bCs/>
           <w:b/>
         </w:rPr>
-        <w:t xml:space="preserve">Under the subhead:</w:t>
+        <w:t xml:space="preserve">The problem:</w:t>
+      </w:r>
+      <w:r>
+        <w:t xml:space="preserve"> </w:t>
+      </w:r>
+      <w:r>
+        <w:t xml:space="preserve">small mono label</w:t>
       </w:r>
       <w:r>
         <w:t xml:space="preserve"> </w:t>
@@ -2476,10 +2235,95 @@
         <w:t xml:space="preserve">“</w:t>
       </w:r>
       <w:r>
-        <w:t xml:space="preserve">In collaboration with seven leading scientists from world-leading research institutions, including four universities in the UK and Australia.</w:t>
+        <w:t xml:space="preserve">The problem</w:t>
       </w:r>
       <w:r>
         <w:t xml:space="preserve">”</w:t>
+      </w:r>
+      <w:r>
+        <w:t xml:space="preserve">, heading</w:t>
+      </w:r>
+      <w:r>
+        <w:t xml:space="preserve"> </w:t>
+      </w:r>
+      <w:r>
+        <w:t xml:space="preserve">“</w:t>
+      </w:r>
+      <w:r>
+        <w:t xml:space="preserve">Your biology shifts. Most supplements don’t.</w:t>
+      </w:r>
+      <w:r>
+        <w:t xml:space="preserve">”</w:t>
+      </w:r>
+      <w:r>
+        <w:t xml:space="preserve"> </w:t>
+      </w:r>
+      <w:r>
+        <w:t xml:space="preserve">Four cards in the standards style (number, lime topic tag, big figure, cyan rule, one line):</w:t>
+      </w:r>
+      <w:r>
+        <w:t xml:space="preserve"> </w:t>
+      </w:r>
+      <w:r>
+        <w:rPr>
+          <w:bCs/>
+          <w:b/>
+        </w:rPr>
+        <w:t xml:space="preserve">57%</w:t>
+      </w:r>
+      <w:r>
+        <w:t xml:space="preserve"> </w:t>
+      </w:r>
+      <w:r>
+        <w:t xml:space="preserve">of supplements tested didn’t match their label (Crawford et al., JAMA Network Open 2022) ·</w:t>
+      </w:r>
+      <w:r>
+        <w:t xml:space="preserve"> </w:t>
+      </w:r>
+      <w:r>
+        <w:rPr>
+          <w:bCs/>
+          <w:b/>
+        </w:rPr>
+        <w:t xml:space="preserve">1 in 2</w:t>
+      </w:r>
+      <w:r>
+        <w:t xml:space="preserve"> </w:t>
+      </w:r>
+      <w:r>
+        <w:t xml:space="preserve">deaths are linked to chronic inflammation (Furman et al., Nature Medicine 2019) ·</w:t>
+      </w:r>
+      <w:r>
+        <w:t xml:space="preserve"> </w:t>
+      </w:r>
+      <w:r>
+        <w:rPr>
+          <w:bCs/>
+          <w:b/>
+        </w:rPr>
+        <w:t xml:space="preserve">50%</w:t>
+      </w:r>
+      <w:r>
+        <w:t xml:space="preserve"> </w:t>
+      </w:r>
+      <w:r>
+        <w:t xml:space="preserve">less NAD+ in skin by middle age (Massudi et al., PLoS ONE 2012, analysed in Peluso et al., Nutrients 2022) ·</w:t>
+      </w:r>
+      <w:r>
+        <w:t xml:space="preserve"> </w:t>
+      </w:r>
+      <w:r>
+        <w:rPr>
+          <w:bCs/>
+          <w:b/>
+        </w:rPr>
+        <w:t xml:space="preserve">50%</w:t>
+      </w:r>
+      <w:r>
+        <w:t xml:space="preserve"> </w:t>
+      </w:r>
+      <w:r>
+        <w:t xml:space="preserve">lower muscle mitochondrial capacity by your late 60s (Conley et al., Journal of Physiology 2000). Sources in a small line underneath.</w:t>
       </w:r>
     </w:p>
     <w:p>
@@ -2495,13 +2339,13 @@
           <w:bCs/>
           <w:b/>
         </w:rPr>
-        <w:t xml:space="preserve">Rotating stats</w:t>
-      </w:r>
-      <w:r>
-        <w:t xml:space="preserve"> </w:t>
-      </w:r>
-      <w:r>
-        <w:t xml:space="preserve">under the button, every 3.5 seconds:</w:t>
+        <w:t xml:space="preserve">Benefits:</w:t>
+      </w:r>
+      <w:r>
+        <w:t xml:space="preserve"> </w:t>
+      </w:r>
+      <w:r>
+        <w:t xml:space="preserve">the live five cards, with a new heading:</w:t>
       </w:r>
       <w:r>
         <w:t xml:space="preserve"> </w:t>
@@ -2510,13 +2354,16 @@
         <w:t xml:space="preserve">“</w:t>
       </w:r>
       <w:r>
-        <w:t xml:space="preserve">94% reported better recovery</w:t>
+        <w:t xml:space="preserve">Benefits built on published science.</w:t>
       </w:r>
       <w:r>
         <w:t xml:space="preserve">”</w:t>
       </w:r>
       <w:r>
-        <w:t xml:space="preserve">,</w:t>
+        <w:t xml:space="preserve"> </w:t>
+      </w:r>
+      <w:r>
+        <w:t xml:space="preserve">(small line above:</w:t>
       </w:r>
       <w:r>
         <w:t xml:space="preserve"> </w:t>
@@ -2525,13 +2372,13 @@
         <w:t xml:space="preserve">“</w:t>
       </w:r>
       <w:r>
-        <w:t xml:space="preserve">92% reported improved energy</w:t>
+        <w:t xml:space="preserve">Five jobs. One daily jar.</w:t>
       </w:r>
       <w:r>
         <w:t xml:space="preserve">”</w:t>
       </w:r>
       <w:r>
-        <w:t xml:space="preserve">,</w:t>
+        <w:t xml:space="preserve">), and a new line under it:</w:t>
       </w:r>
       <w:r>
         <w:t xml:space="preserve"> </w:t>
@@ -2540,40 +2387,10 @@
         <w:t xml:space="preserve">“</w:t>
       </w:r>
       <w:r>
-        <w:t xml:space="preserve">88% bounce back quicker</w:t>
+        <w:t xml:space="preserve">What you need after 35. Your biology shifts. What you need evolves.</w:t>
       </w:r>
       <w:r>
         <w:t xml:space="preserve">”</w:t>
-      </w:r>
-      <w:r>
-        <w:t xml:space="preserve">, with a black bar that fills left to right to each figure. Set in</w:t>
-      </w:r>
-      <w:r>
-        <w:t xml:space="preserve"> </w:t>
-      </w:r>
-      <w:r>
-        <w:rPr>
-          <w:rStyle w:val="VerbatimChar"/>
-        </w:rPr>
-        <w:t xml:space="preserve">STATS</w:t>
-      </w:r>
-      <w:r>
-        <w:t xml:space="preserve"> </w:t>
-      </w:r>
-      <w:r>
-        <w:t xml:space="preserve">in</w:t>
-      </w:r>
-      <w:r>
-        <w:t xml:space="preserve"> </w:t>
-      </w:r>
-      <w:r>
-        <w:rPr>
-          <w:rStyle w:val="VerbatimChar"/>
-        </w:rPr>
-        <w:t xml:space="preserve">make_trust.py</w:t>
-      </w:r>
-      <w:r>
-        <w:t xml:space="preserve">.</w:t>
       </w:r>
     </w:p>
     <w:p>
@@ -2589,13 +2406,7 @@
           <w:bCs/>
           <w:b/>
         </w:rPr>
-        <w:t xml:space="preserve">Delivery line</w:t>
-      </w:r>
-      <w:r>
-        <w:t xml:space="preserve"> </w:t>
-      </w:r>
-      <w:r>
-        <w:t xml:space="preserve">under the button:</w:t>
+        <w:t xml:space="preserve">Science board:</w:t>
       </w:r>
       <w:r>
         <w:t xml:space="preserve"> </w:t>
@@ -2604,69 +2415,13 @@
         <w:t xml:space="preserve">“</w:t>
       </w:r>
       <w:r>
-        <w:t xml:space="preserve">● Ready to ship — arrives by</w:t>
-      </w:r>
-      <w:r>
-        <w:t xml:space="preserve"> </w:t>
-      </w:r>
-      <w:r>
-        <w:rPr>
-          <w:bCs/>
-          <w:b/>
-        </w:rPr>
-        <w:t xml:space="preserve">Thu 29th Oct</w:t>
-      </w:r>
-      <w:r>
-        <w:t xml:space="preserve"> </w:t>
-      </w:r>
-      <w:r>
-        <w:t xml:space="preserve">| [Royal Mail logo] Tracked 24hr delivery</w:t>
+        <w:t xml:space="preserve">Six scientists put their name to MUTO.</w:t>
       </w:r>
       <w:r>
         <w:t xml:space="preserve">”</w:t>
       </w:r>
       <w:r>
-        <w:t xml:space="preserve">. The date is the next calendar day in UK time, or the day after from the</w:t>
-      </w:r>
-      <w:r>
-        <w:t xml:space="preserve"> </w:t>
-      </w:r>
-      <w:r>
-        <w:rPr>
-          <w:bCs/>
-          <w:b/>
-        </w:rPr>
-        <w:t xml:space="preserve">9pm cut-off</w:t>
-      </w:r>
-      <w:r>
-        <w:t xml:space="preserve">, set by a script that updates while the page is open. Before the script runs it says</w:t>
-      </w:r>
-      <w:r>
-        <w:t xml:space="preserve"> </w:t>
-      </w:r>
-      <w:r>
-        <w:t xml:space="preserve">“</w:t>
-      </w:r>
-      <w:r>
-        <w:t xml:space="preserve">arrives tomorrow</w:t>
-      </w:r>
-      <w:r>
-        <w:t xml:space="preserve">”</w:t>
-      </w:r>
-      <w:r>
-        <w:t xml:space="preserve">. The logo is</w:t>
-      </w:r>
-      <w:r>
-        <w:t xml:space="preserve"> </w:t>
-      </w:r>
-      <w:r>
-        <w:rPr>
-          <w:rStyle w:val="VerbatimChar"/>
-        </w:rPr>
-        <w:t xml:space="preserve">theme/assets/royal-mail-logo.png</w:t>
-      </w:r>
-      <w:r>
-        <w:t xml:space="preserve">, embedded in the template (nothing to upload).</w:t>
+        <w:t xml:space="preserve">, compact row, white background.</w:t>
       </w:r>
     </w:p>
     <w:p>
@@ -2682,41 +2437,31 @@
           <w:bCs/>
           <w:b/>
         </w:rPr>
+        <w:t xml:space="preserve">Standards:</w:t>
+      </w:r>
+      <w:r>
+        <w:t xml:space="preserve"> </w:t>
+      </w:r>
+      <w:r>
+        <w:t xml:space="preserve">four cards. Card 1 has the</w:t>
+      </w:r>
+      <w:r>
+        <w:t xml:space="preserve"> </w:t>
+      </w:r>
+      <w:r>
         <w:t xml:space="preserve">“</w:t>
       </w:r>
       <w:r>
-        <w:rPr>
-          <w:bCs/>
-          <w:b/>
-        </w:rPr>
-        <w:t xml:space="preserve">How it helps</w:t>
-      </w:r>
-      <w:r>
-        <w:rPr>
-          <w:bCs/>
-          <w:b/>
-        </w:rPr>
+        <w:t xml:space="preserve">View third-party testing results</w:t>
+      </w:r>
+      <w:r>
         <w:t xml:space="preserve">”</w:t>
       </w:r>
       <w:r>
-        <w:rPr>
-          <w:bCs/>
-          <w:b/>
-        </w:rPr>
-        <w:t xml:space="preserve"> </w:t>
-      </w:r>
-      <w:r>
-        <w:rPr>
-          <w:bCs/>
-          <w:b/>
-        </w:rPr>
-        <w:t xml:space="preserve">list</w:t>
-      </w:r>
-      <w:r>
-        <w:t xml:space="preserve"> </w:t>
-      </w:r>
-      <w:r>
-        <w:t xml:space="preserve">in the buy box is hidden on phones as well as desktop.</w:t>
+        <w:t xml:space="preserve"> </w:t>
+      </w:r>
+      <w:r>
+        <w:t xml:space="preserve">button, which opens the certificate panel (batch 2333).</w:t>
       </w:r>
     </w:p>
     <w:p>
@@ -2732,13 +2477,22 @@
           <w:bCs/>
           <w:b/>
         </w:rPr>
-        <w:t xml:space="preserve">Phones:</w:t>
-      </w:r>
-      <w:r>
-        <w:t xml:space="preserve"> </w:t>
-      </w:r>
-      <w:r>
-        <w:t xml:space="preserve">the billing line under each plan name is smaller (12px) so it fits, and the delivery line is centred.</w:t>
+        <w:t xml:space="preserve">Customer videos:</w:t>
+      </w:r>
+      <w:r>
+        <w:t xml:space="preserve"> </w:t>
+      </w:r>
+      <w:r>
+        <w:t xml:space="preserve">“</w:t>
+      </w:r>
+      <w:r>
+        <w:t xml:space="preserve">Don’t take our word for it.</w:t>
+      </w:r>
+      <w:r>
+        <w:t xml:space="preserve">”</w:t>
+      </w:r>
+      <w:r>
+        <w:t xml:space="preserve">, 8 videos in a row that scrolls: Kate Bright, David Mercado, Lucy Halliday, Harry Insley, Adam Facey, Max Richards, Adam Hamilton, Yolanda King. Ellen Gray’s video is removed, and so is the footnote under the row.</w:t>
       </w:r>
     </w:p>
     <w:p>
@@ -2754,40 +2508,37 @@
           <w:bCs/>
           <w:b/>
         </w:rPr>
-        <w:t xml:space="preserve">Phones, whole page:</w:t>
-      </w:r>
-      <w:r>
-        <w:t xml:space="preserve"> </w:t>
-      </w:r>
-      <w:r>
-        <w:t xml:space="preserve">a smaller, tighter scale below 750px. Headings 28px (the statement 32px), lines under headings 15px, body 14-15px, smaller cards with less padding, benefit cards narrower, problem stats two by two, section spacing 40px. The new bands’ sizes are in</w:t>
-      </w:r>
-      <w:r>
-        <w:t xml:space="preserve"> </w:t>
-      </w:r>
-      <w:r>
-        <w:rPr>
-          <w:rStyle w:val="VerbatimChar"/>
-        </w:rPr>
-        <w:t xml:space="preserve">muto-crea-trust.css</w:t>
-      </w:r>
-      <w:r>
-        <w:t xml:space="preserve">. The live sections’ sizes are in the template’s</w:t>
-      </w:r>
-      <w:r>
-        <w:t xml:space="preserve"> </w:t>
-      </w:r>
-      <w:r>
-        <w:rPr>
-          <w:rStyle w:val="VerbatimChar"/>
-        </w:rPr>
-        <w:t xml:space="preserve">head_styles</w:t>
-      </w:r>
-      <w:r>
-        <w:t xml:space="preserve"> </w:t>
-      </w:r>
-      <w:r>
-        <w:t xml:space="preserve">block, so they only change on this page.</w:t>
+        <w:t xml:space="preserve">Reviews:</w:t>
+      </w:r>
+      <w:r>
+        <w:t xml:space="preserve"> </w:t>
+      </w:r>
+      <w:r>
+        <w:t xml:space="preserve">“</w:t>
+      </w:r>
+      <w:r>
+        <w:t xml:space="preserve">What our community say.</w:t>
+      </w:r>
+      <w:r>
+        <w:t xml:space="preserve">”</w:t>
+      </w:r>
+      <w:r>
+        <w:t xml:space="preserve">, 20 five-star REVIEWS.io reviews that rotate every 6 seconds, with</w:t>
+      </w:r>
+      <w:r>
+        <w:t xml:space="preserve"> </w:t>
+      </w:r>
+      <w:r>
+        <w:t xml:space="preserve">“</w:t>
+      </w:r>
+      <w:r>
+        <w:t xml:space="preserve">4.8 from 103 reviews</w:t>
+      </w:r>
+      <w:r>
+        <w:t xml:space="preserve">”</w:t>
+      </w:r>
+      <w:r>
+        <w:t xml:space="preserve">.</w:t>
       </w:r>
     </w:p>
     <w:p>
@@ -2799,32 +2550,19 @@
         <w:pStyle w:val="Compact"/>
       </w:pPr>
       <w:r>
-        <w:rPr>
-          <w:bCs/>
-          <w:b/>
-        </w:rPr>
-        <w:t xml:space="preserve">No sticky add-to-cart bar.</w:t>
-      </w:r>
-      <w:r>
-        <w:t xml:space="preserve"> </w:t>
-      </w:r>
-      <w:r>
-        <w:t xml:space="preserve">The</w:t>
-      </w:r>
-      <w:r>
-        <w:t xml:space="preserve"> </w:t>
-      </w:r>
-      <w:r>
-        <w:rPr>
-          <w:rStyle w:val="VerbatimChar"/>
-        </w:rPr>
-        <w:t xml:space="preserve">sticky</w:t>
-      </w:r>
-      <w:r>
-        <w:t xml:space="preserve"> </w:t>
-      </w:r>
-      <w:r>
-        <w:t xml:space="preserve">section isn’t in this template, so nothing slides in at the top or bottom of the page as you scroll.</w:t>
+        <w:t xml:space="preserve">“</w:t>
+      </w:r>
+      <w:r>
+        <w:t xml:space="preserve">Every ingredient has a job.</w:t>
+      </w:r>
+      <w:r>
+        <w:t xml:space="preserve">”</w:t>
+      </w:r>
+      <w:r>
+        <w:t xml:space="preserve"> </w:t>
+      </w:r>
+      <w:r>
+        <w:t xml:space="preserve">ingredient library</w:t>
       </w:r>
     </w:p>
     <w:p>
@@ -2840,13 +2578,25 @@
           <w:bCs/>
           <w:b/>
         </w:rPr>
-        <w:t xml:space="preserve">Backgrounds:</w:t>
-      </w:r>
-      <w:r>
-        <w:t xml:space="preserve"> </w:t>
-      </w:r>
-      <w:r>
-        <w:t xml:space="preserve">no gradient washes. Almost every band is flat white. Brand sage grey (#C8D2CF) is used only on</w:t>
+        <w:t xml:space="preserve">Founder:</w:t>
+      </w:r>
+      <w:r>
+        <w:t xml:space="preserve"> </w:t>
+      </w:r>
+      <w:r>
+        <w:t xml:space="preserve">Dr Richie Barclay, PhD: cell biologist, Harley Street nutritionist for 13 years, former cricketer and tennis player.</w:t>
+      </w:r>
+    </w:p>
+    <w:p>
+      <w:pPr>
+        <w:numPr>
+          <w:ilvl w:val="0"/>
+          <w:numId w:val="1005"/>
+        </w:numPr>
+        <w:pStyle w:val="Compact"/>
+      </w:pPr>
+      <w:r>
+        <w:t xml:space="preserve">Comparison (heading now</w:t>
       </w:r>
       <w:r>
         <w:t xml:space="preserve"> </w:t>
@@ -2855,16 +2605,13 @@
         <w:t xml:space="preserve">“</w:t>
       </w:r>
       <w:r>
-        <w:t xml:space="preserve">What our community say</w:t>
+        <w:t xml:space="preserve">See the difference for yourself.</w:t>
       </w:r>
       <w:r>
         <w:t xml:space="preserve">”</w:t>
       </w:r>
       <w:r>
-        <w:t xml:space="preserve"> </w:t>
-      </w:r>
-      <w:r>
-        <w:t xml:space="preserve">and the comparison (as on live).</w:t>
+        <w:t xml:space="preserve">),</w:t>
       </w:r>
       <w:r>
         <w:t xml:space="preserve"> </w:t>
@@ -2873,7 +2620,7 @@
         <w:t xml:space="preserve">“</w:t>
       </w:r>
       <w:r>
-        <w:t xml:space="preserve">How to take it</w:t>
+        <w:t xml:space="preserve">What you can expect over time.</w:t>
       </w:r>
       <w:r>
         <w:t xml:space="preserve">”</w:t>
@@ -2882,31 +2629,42 @@
         <w:t xml:space="preserve"> </w:t>
       </w:r>
       <w:r>
-        <w:t xml:space="preserve">and the ingredient library are white too. Set in the</w:t>
-      </w:r>
-      <w:r>
-        <w:t xml:space="preserve"> </w:t>
-      </w:r>
-      <w:r>
-        <w:rPr>
-          <w:rStyle w:val="VerbatimChar"/>
-        </w:rPr>
-        <w:t xml:space="preserve">head_styles</w:t>
-      </w:r>
-      <w:r>
-        <w:t xml:space="preserve"> </w:t>
-      </w:r>
-      <w:r>
-        <w:t xml:space="preserve">block at the top of the template.</w:t>
-      </w:r>
-    </w:p>
-    <w:bookmarkStart w:id="26" w:name="how-its-built"/>
-    <w:p>
-      <w:pPr>
-        <w:pStyle w:val="Heading2"/>
-      </w:pPr>
-      <w:r>
-        <w:t xml:space="preserve">How it’s built</w:t>
+        <w:t xml:space="preserve">timeline,</w:t>
+      </w:r>
+      <w:r>
+        <w:t xml:space="preserve"> </w:t>
+      </w:r>
+      <w:r>
+        <w:t xml:space="preserve">“</w:t>
+      </w:r>
+      <w:r>
+        <w:t xml:space="preserve">How to take it.</w:t>
+      </w:r>
+      <w:r>
+        <w:t xml:space="preserve">”</w:t>
+      </w:r>
+      <w:r>
+        <w:t xml:space="preserve">, FAQs (all 10 from live), REVIEWS.io widget.</w:t>
+      </w:r>
+    </w:p>
+    <w:p>
+      <w:pPr>
+        <w:pStyle w:val="FirstParagraph"/>
+      </w:pPr>
+      <w:r>
+        <w:t xml:space="preserve">Also changed from</w:t>
+      </w:r>
+      <w:r>
+        <w:t xml:space="preserve"> </w:t>
+      </w:r>
+      <w:r>
+        <w:rPr>
+          <w:rStyle w:val="VerbatimChar"/>
+        </w:rPr>
+        <w:t xml:space="preserve">muto-nad-v2</w:t>
+      </w:r>
+      <w:r>
+        <w:t xml:space="preserve">:</w:t>
       </w:r>
     </w:p>
     <w:p>
@@ -2922,101 +2680,31 @@
           <w:bCs/>
           <w:b/>
         </w:rPr>
-        <w:t xml:space="preserve">Template-only</w:t>
-      </w:r>
-      <w:r>
-        <w:t xml:space="preserve"> </w:t>
-      </w:r>
-      <w:r>
-        <w:t xml:space="preserve">apart from the five new sections and their stylesheet. The page’s own styles are in a Custom Liquid block called</w:t>
-      </w:r>
-      <w:r>
-        <w:t xml:space="preserve"> </w:t>
-      </w:r>
-      <w:r>
-        <w:rPr>
-          <w:rStyle w:val="VerbatimChar"/>
-        </w:rPr>
-        <w:t xml:space="preserve">head_styles</w:t>
-      </w:r>
-      <w:r>
-        <w:t xml:space="preserve"> </w:t>
-      </w:r>
-      <w:r>
-        <w:t xml:space="preserve">at the</w:t>
-      </w:r>
-      <w:r>
-        <w:t xml:space="preserve"> </w:t>
-      </w:r>
-      <w:r>
-        <w:rPr>
-          <w:bCs/>
-          <w:b/>
-        </w:rPr>
-        <w:t xml:space="preserve">top</w:t>
-      </w:r>
-      <w:r>
-        <w:t xml:space="preserve"> </w:t>
-      </w:r>
-      <w:r>
-        <w:t xml:space="preserve">of the template, so the buy box is styled from the first paint (with them at the bottom, the old design flashed on load). Its scripts stay in</w:t>
-      </w:r>
-      <w:r>
-        <w:t xml:space="preserve"> </w:t>
-      </w:r>
-      <w:r>
-        <w:rPr>
-          <w:rStyle w:val="VerbatimChar"/>
-        </w:rPr>
-        <w:t xml:space="preserve">easy_read</w:t>
-      </w:r>
-      <w:r>
-        <w:t xml:space="preserve"> </w:t>
-      </w:r>
-      <w:r>
-        <w:t xml:space="preserve">and</w:t>
-      </w:r>
-      <w:r>
-        <w:t xml:space="preserve"> </w:t>
-      </w:r>
-      <w:r>
-        <w:rPr>
-          <w:rStyle w:val="VerbatimChar"/>
-        </w:rPr>
-        <w:t xml:space="preserve">bands</w:t>
-      </w:r>
-      <w:r>
-        <w:t xml:space="preserve"> </w:t>
-      </w:r>
-      <w:r>
-        <w:t xml:space="preserve">at the bottom. The</w:t>
-      </w:r>
-      <w:r>
-        <w:t xml:space="preserve"> </w:t>
-      </w:r>
-      <w:r>
-        <w:rPr>
-          <w:rStyle w:val="VerbatimChar"/>
-        </w:rPr>
-        <w:t xml:space="preserve">bands</w:t>
-      </w:r>
-      <w:r>
-        <w:t xml:space="preserve"> </w:t>
-      </w:r>
-      <w:r>
-        <w:t xml:space="preserve">scripts (delivery line, rotating stats, collaboration line, video drag) run again after</w:t>
-      </w:r>
-      <w:r>
-        <w:t xml:space="preserve"> </w:t>
-      </w:r>
-      <w:r>
-        <w:rPr>
-          <w:rStyle w:val="VerbatimChar"/>
-        </w:rPr>
-        <w:t xml:space="preserve">shopify:section:load</w:t>
-      </w:r>
-      <w:r>
-        <w:t xml:space="preserve">, so they survive the theme editor re-drawing the buy box.</w:t>
+        <w:t xml:space="preserve">Under the buy button:</w:t>
+      </w:r>
+      <w:r>
+        <w:t xml:space="preserve"> </w:t>
+      </w:r>
+      <w:r>
+        <w:t xml:space="preserve">the serving line,</w:t>
+      </w:r>
+      <w:r>
+        <w:t xml:space="preserve"> </w:t>
+      </w:r>
+      <w:r>
+        <w:t xml:space="preserve">“</w:t>
+      </w:r>
+      <w:r>
+        <w:t xml:space="preserve">Not another multivitamin…</w:t>
+      </w:r>
+      <w:r>
+        <w:t xml:space="preserve">”</w:t>
+      </w:r>
+      <w:r>
+        <w:t xml:space="preserve"> </w:t>
+      </w:r>
+      <w:r>
+        <w:t xml:space="preserve">copy and the quote slider are blanked or hidden (not deleted).</w:t>
       </w:r>
     </w:p>
     <w:p>
@@ -3032,33 +2720,496 @@
           <w:bCs/>
           <w:b/>
         </w:rPr>
-        <w:t xml:space="preserve">Source:</w:t>
-      </w:r>
-      <w:r>
-        <w:t xml:space="preserve"> </w:t>
-      </w:r>
-      <w:r>
-        <w:rPr>
-          <w:rStyle w:val="VerbatimChar"/>
-        </w:rPr>
-        <w:t xml:space="preserve">shopify/pdp-trust/make_trust.py</w:t>
-      </w:r>
-      <w:r>
-        <w:t xml:space="preserve"> </w:t>
-      </w:r>
-      <w:r>
-        <w:t xml:space="preserve">builds the template. Change copy there and rebuild rather than editing by hand, or tell Richie about manual edits so they aren’t lost on the next rebuild.</w:t>
-      </w:r>
-    </w:p>
-    <w:bookmarkEnd w:id="26"/>
-    <w:bookmarkEnd w:id="27"/>
-    <w:bookmarkStart w:id="28" w:name="check-after-publishing"/>
-    <w:p>
-      <w:pPr>
-        <w:pStyle w:val="Heading1"/>
-      </w:pPr>
-      <w:r>
-        <w:t xml:space="preserve">Check after publishing</w:t>
+        <w:t xml:space="preserve">Buy button</w:t>
+      </w:r>
+      <w:r>
+        <w:t xml:space="preserve"> </w:t>
+      </w:r>
+      <w:r>
+        <w:t xml:space="preserve">in brand green</w:t>
+      </w:r>
+      <w:r>
+        <w:t xml:space="preserve"> </w:t>
+      </w:r>
+      <w:r>
+        <w:rPr>
+          <w:bCs/>
+          <w:b/>
+        </w:rPr>
+        <w:t xml:space="preserve">#6BCE7F</w:t>
+      </w:r>
+      <w:r>
+        <w:t xml:space="preserve">, charcoal label, with a second line inside it: a shield and</w:t>
+      </w:r>
+      <w:r>
+        <w:t xml:space="preserve"> </w:t>
+      </w:r>
+      <w:r>
+        <w:t xml:space="preserve">“</w:t>
+      </w:r>
+      <w:r>
+        <w:t xml:space="preserve">90-day money-back guarantee</w:t>
+      </w:r>
+      <w:r>
+        <w:t xml:space="preserve">”</w:t>
+      </w:r>
+      <w:r>
+        <w:t xml:space="preserve">.</w:t>
+      </w:r>
+    </w:p>
+    <w:p>
+      <w:pPr>
+        <w:numPr>
+          <w:ilvl w:val="0"/>
+          <w:numId w:val="1006"/>
+        </w:numPr>
+        <w:pStyle w:val="Compact"/>
+      </w:pPr>
+      <w:r>
+        <w:rPr>
+          <w:bCs/>
+          <w:b/>
+        </w:rPr>
+        <w:t xml:space="preserve">Under the subhead:</w:t>
+      </w:r>
+      <w:r>
+        <w:t xml:space="preserve"> </w:t>
+      </w:r>
+      <w:r>
+        <w:t xml:space="preserve">“</w:t>
+      </w:r>
+      <w:r>
+        <w:t xml:space="preserve">In collaboration with seven leading scientists from world-leading research institutions, including four universities in the UK and Australia.</w:t>
+      </w:r>
+      <w:r>
+        <w:t xml:space="preserve">”</w:t>
+      </w:r>
+    </w:p>
+    <w:p>
+      <w:pPr>
+        <w:numPr>
+          <w:ilvl w:val="0"/>
+          <w:numId w:val="1006"/>
+        </w:numPr>
+        <w:pStyle w:val="Compact"/>
+      </w:pPr>
+      <w:r>
+        <w:rPr>
+          <w:bCs/>
+          <w:b/>
+        </w:rPr>
+        <w:t xml:space="preserve">Rotating stats</w:t>
+      </w:r>
+      <w:r>
+        <w:t xml:space="preserve"> </w:t>
+      </w:r>
+      <w:r>
+        <w:t xml:space="preserve">under the button, every 3.5 seconds:</w:t>
+      </w:r>
+      <w:r>
+        <w:t xml:space="preserve"> </w:t>
+      </w:r>
+      <w:r>
+        <w:t xml:space="preserve">“</w:t>
+      </w:r>
+      <w:r>
+        <w:t xml:space="preserve">94% reported better recovery</w:t>
+      </w:r>
+      <w:r>
+        <w:t xml:space="preserve">”</w:t>
+      </w:r>
+      <w:r>
+        <w:t xml:space="preserve">,</w:t>
+      </w:r>
+      <w:r>
+        <w:t xml:space="preserve"> </w:t>
+      </w:r>
+      <w:r>
+        <w:t xml:space="preserve">“</w:t>
+      </w:r>
+      <w:r>
+        <w:t xml:space="preserve">92% reported improved energy</w:t>
+      </w:r>
+      <w:r>
+        <w:t xml:space="preserve">”</w:t>
+      </w:r>
+      <w:r>
+        <w:t xml:space="preserve">,</w:t>
+      </w:r>
+      <w:r>
+        <w:t xml:space="preserve"> </w:t>
+      </w:r>
+      <w:r>
+        <w:t xml:space="preserve">“</w:t>
+      </w:r>
+      <w:r>
+        <w:t xml:space="preserve">88% bounce back quicker</w:t>
+      </w:r>
+      <w:r>
+        <w:t xml:space="preserve">”</w:t>
+      </w:r>
+      <w:r>
+        <w:t xml:space="preserve">, with a black bar that fills left to right to each figure. Set in</w:t>
+      </w:r>
+      <w:r>
+        <w:t xml:space="preserve"> </w:t>
+      </w:r>
+      <w:r>
+        <w:rPr>
+          <w:rStyle w:val="VerbatimChar"/>
+        </w:rPr>
+        <w:t xml:space="preserve">STATS</w:t>
+      </w:r>
+      <w:r>
+        <w:t xml:space="preserve"> </w:t>
+      </w:r>
+      <w:r>
+        <w:t xml:space="preserve">in</w:t>
+      </w:r>
+      <w:r>
+        <w:t xml:space="preserve"> </w:t>
+      </w:r>
+      <w:r>
+        <w:rPr>
+          <w:rStyle w:val="VerbatimChar"/>
+        </w:rPr>
+        <w:t xml:space="preserve">make_trust.py</w:t>
+      </w:r>
+      <w:r>
+        <w:t xml:space="preserve">.</w:t>
+      </w:r>
+    </w:p>
+    <w:p>
+      <w:pPr>
+        <w:numPr>
+          <w:ilvl w:val="0"/>
+          <w:numId w:val="1006"/>
+        </w:numPr>
+        <w:pStyle w:val="Compact"/>
+      </w:pPr>
+      <w:r>
+        <w:rPr>
+          <w:bCs/>
+          <w:b/>
+        </w:rPr>
+        <w:t xml:space="preserve">Delivery line</w:t>
+      </w:r>
+      <w:r>
+        <w:t xml:space="preserve"> </w:t>
+      </w:r>
+      <w:r>
+        <w:t xml:space="preserve">under the button:</w:t>
+      </w:r>
+      <w:r>
+        <w:t xml:space="preserve"> </w:t>
+      </w:r>
+      <w:r>
+        <w:t xml:space="preserve">“</w:t>
+      </w:r>
+      <w:r>
+        <w:t xml:space="preserve">● Ready to ship — arrives by</w:t>
+      </w:r>
+      <w:r>
+        <w:t xml:space="preserve"> </w:t>
+      </w:r>
+      <w:r>
+        <w:rPr>
+          <w:bCs/>
+          <w:b/>
+        </w:rPr>
+        <w:t xml:space="preserve">Thu 29th Oct</w:t>
+      </w:r>
+      <w:r>
+        <w:t xml:space="preserve"> </w:t>
+      </w:r>
+      <w:r>
+        <w:t xml:space="preserve">| [Royal Mail logo] Tracked 24hr delivery</w:t>
+      </w:r>
+      <w:r>
+        <w:t xml:space="preserve">”</w:t>
+      </w:r>
+      <w:r>
+        <w:t xml:space="preserve">. The date is the next calendar day in UK time, or the day after from the</w:t>
+      </w:r>
+      <w:r>
+        <w:t xml:space="preserve"> </w:t>
+      </w:r>
+      <w:r>
+        <w:rPr>
+          <w:bCs/>
+          <w:b/>
+        </w:rPr>
+        <w:t xml:space="preserve">9pm cut-off</w:t>
+      </w:r>
+      <w:r>
+        <w:t xml:space="preserve">, set by a script that updates while the page is open. Before the script runs it says</w:t>
+      </w:r>
+      <w:r>
+        <w:t xml:space="preserve"> </w:t>
+      </w:r>
+      <w:r>
+        <w:t xml:space="preserve">“</w:t>
+      </w:r>
+      <w:r>
+        <w:t xml:space="preserve">arrives tomorrow</w:t>
+      </w:r>
+      <w:r>
+        <w:t xml:space="preserve">”</w:t>
+      </w:r>
+      <w:r>
+        <w:t xml:space="preserve">. The logo is</w:t>
+      </w:r>
+      <w:r>
+        <w:t xml:space="preserve"> </w:t>
+      </w:r>
+      <w:r>
+        <w:rPr>
+          <w:rStyle w:val="VerbatimChar"/>
+        </w:rPr>
+        <w:t xml:space="preserve">theme/assets/royal-mail-logo.png</w:t>
+      </w:r>
+      <w:r>
+        <w:t xml:space="preserve">, embedded in the template (nothing to upload).</w:t>
+      </w:r>
+    </w:p>
+    <w:p>
+      <w:pPr>
+        <w:numPr>
+          <w:ilvl w:val="0"/>
+          <w:numId w:val="1006"/>
+        </w:numPr>
+        <w:pStyle w:val="Compact"/>
+      </w:pPr>
+      <w:r>
+        <w:rPr>
+          <w:bCs/>
+          <w:b/>
+        </w:rPr>
+        <w:t xml:space="preserve">“</w:t>
+      </w:r>
+      <w:r>
+        <w:rPr>
+          <w:bCs/>
+          <w:b/>
+        </w:rPr>
+        <w:t xml:space="preserve">How it helps</w:t>
+      </w:r>
+      <w:r>
+        <w:rPr>
+          <w:bCs/>
+          <w:b/>
+        </w:rPr>
+        <w:t xml:space="preserve">”</w:t>
+      </w:r>
+      <w:r>
+        <w:rPr>
+          <w:bCs/>
+          <w:b/>
+        </w:rPr>
+        <w:t xml:space="preserve"> </w:t>
+      </w:r>
+      <w:r>
+        <w:rPr>
+          <w:bCs/>
+          <w:b/>
+        </w:rPr>
+        <w:t xml:space="preserve">list</w:t>
+      </w:r>
+      <w:r>
+        <w:t xml:space="preserve"> </w:t>
+      </w:r>
+      <w:r>
+        <w:t xml:space="preserve">in the buy box is hidden on phones as well as desktop.</w:t>
+      </w:r>
+    </w:p>
+    <w:p>
+      <w:pPr>
+        <w:numPr>
+          <w:ilvl w:val="0"/>
+          <w:numId w:val="1006"/>
+        </w:numPr>
+        <w:pStyle w:val="Compact"/>
+      </w:pPr>
+      <w:r>
+        <w:rPr>
+          <w:bCs/>
+          <w:b/>
+        </w:rPr>
+        <w:t xml:space="preserve">Phones:</w:t>
+      </w:r>
+      <w:r>
+        <w:t xml:space="preserve"> </w:t>
+      </w:r>
+      <w:r>
+        <w:t xml:space="preserve">the billing line under each plan name is smaller (12px) so it fits, and the delivery line is centred.</w:t>
+      </w:r>
+    </w:p>
+    <w:p>
+      <w:pPr>
+        <w:numPr>
+          <w:ilvl w:val="0"/>
+          <w:numId w:val="1006"/>
+        </w:numPr>
+        <w:pStyle w:val="Compact"/>
+      </w:pPr>
+      <w:r>
+        <w:rPr>
+          <w:bCs/>
+          <w:b/>
+        </w:rPr>
+        <w:t xml:space="preserve">Phones, whole page:</w:t>
+      </w:r>
+      <w:r>
+        <w:t xml:space="preserve"> </w:t>
+      </w:r>
+      <w:r>
+        <w:t xml:space="preserve">a smaller, tighter scale below 750px. Headings 28px (the statement 32px), lines under headings 15px, body 14-15px, smaller cards with less padding, benefit cards narrower, problem stats two by two, section spacing 40px. The new bands’ sizes are in</w:t>
+      </w:r>
+      <w:r>
+        <w:t xml:space="preserve"> </w:t>
+      </w:r>
+      <w:r>
+        <w:rPr>
+          <w:rStyle w:val="VerbatimChar"/>
+        </w:rPr>
+        <w:t xml:space="preserve">muto-crea-trust.css</w:t>
+      </w:r>
+      <w:r>
+        <w:t xml:space="preserve">. The live sections’ sizes are in the template’s</w:t>
+      </w:r>
+      <w:r>
+        <w:t xml:space="preserve"> </w:t>
+      </w:r>
+      <w:r>
+        <w:rPr>
+          <w:rStyle w:val="VerbatimChar"/>
+        </w:rPr>
+        <w:t xml:space="preserve">head_styles</w:t>
+      </w:r>
+      <w:r>
+        <w:t xml:space="preserve"> </w:t>
+      </w:r>
+      <w:r>
+        <w:t xml:space="preserve">block, so they only change on this page.</w:t>
+      </w:r>
+    </w:p>
+    <w:p>
+      <w:pPr>
+        <w:numPr>
+          <w:ilvl w:val="0"/>
+          <w:numId w:val="1006"/>
+        </w:numPr>
+        <w:pStyle w:val="Compact"/>
+      </w:pPr>
+      <w:r>
+        <w:rPr>
+          <w:bCs/>
+          <w:b/>
+        </w:rPr>
+        <w:t xml:space="preserve">No sticky add-to-cart bar.</w:t>
+      </w:r>
+      <w:r>
+        <w:t xml:space="preserve"> </w:t>
+      </w:r>
+      <w:r>
+        <w:t xml:space="preserve">The</w:t>
+      </w:r>
+      <w:r>
+        <w:t xml:space="preserve"> </w:t>
+      </w:r>
+      <w:r>
+        <w:rPr>
+          <w:rStyle w:val="VerbatimChar"/>
+        </w:rPr>
+        <w:t xml:space="preserve">sticky</w:t>
+      </w:r>
+      <w:r>
+        <w:t xml:space="preserve"> </w:t>
+      </w:r>
+      <w:r>
+        <w:t xml:space="preserve">section isn’t in this template, so nothing slides in at the top or bottom of the page as you scroll.</w:t>
+      </w:r>
+    </w:p>
+    <w:p>
+      <w:pPr>
+        <w:numPr>
+          <w:ilvl w:val="0"/>
+          <w:numId w:val="1006"/>
+        </w:numPr>
+        <w:pStyle w:val="Compact"/>
+      </w:pPr>
+      <w:r>
+        <w:rPr>
+          <w:bCs/>
+          <w:b/>
+        </w:rPr>
+        <w:t xml:space="preserve">Backgrounds:</w:t>
+      </w:r>
+      <w:r>
+        <w:t xml:space="preserve"> </w:t>
+      </w:r>
+      <w:r>
+        <w:t xml:space="preserve">no gradient washes. Almost every band is flat white. Brand sage grey (#C8D2CF) is used only on</w:t>
+      </w:r>
+      <w:r>
+        <w:t xml:space="preserve"> </w:t>
+      </w:r>
+      <w:r>
+        <w:t xml:space="preserve">“</w:t>
+      </w:r>
+      <w:r>
+        <w:t xml:space="preserve">What our community say</w:t>
+      </w:r>
+      <w:r>
+        <w:t xml:space="preserve">”</w:t>
+      </w:r>
+      <w:r>
+        <w:t xml:space="preserve"> </w:t>
+      </w:r>
+      <w:r>
+        <w:t xml:space="preserve">and the comparison (as on live).</w:t>
+      </w:r>
+      <w:r>
+        <w:t xml:space="preserve"> </w:t>
+      </w:r>
+      <w:r>
+        <w:t xml:space="preserve">“</w:t>
+      </w:r>
+      <w:r>
+        <w:t xml:space="preserve">How to take it</w:t>
+      </w:r>
+      <w:r>
+        <w:t xml:space="preserve">”</w:t>
+      </w:r>
+      <w:r>
+        <w:t xml:space="preserve"> </w:t>
+      </w:r>
+      <w:r>
+        <w:t xml:space="preserve">and the ingredient library are white too. Set in the</w:t>
+      </w:r>
+      <w:r>
+        <w:t xml:space="preserve"> </w:t>
+      </w:r>
+      <w:r>
+        <w:rPr>
+          <w:rStyle w:val="VerbatimChar"/>
+        </w:rPr>
+        <w:t xml:space="preserve">head_styles</w:t>
+      </w:r>
+      <w:r>
+        <w:t xml:space="preserve"> </w:t>
+      </w:r>
+      <w:r>
+        <w:t xml:space="preserve">block at the top of the template.</w:t>
+      </w:r>
+    </w:p>
+    <w:bookmarkStart w:id="27" w:name="how-its-built"/>
+    <w:p>
+      <w:pPr>
+        <w:pStyle w:val="Heading2"/>
+      </w:pPr>
+      <w:r>
+        <w:t xml:space="preserve">How it’s built</w:t>
       </w:r>
     </w:p>
     <w:p>
@@ -3074,29 +3225,101 @@
           <w:bCs/>
           <w:b/>
         </w:rPr>
-        <w:t xml:space="preserve">Main URL and -2:</w:t>
-      </w:r>
-      <w:r>
-        <w:t xml:space="preserve"> </w:t>
-      </w:r>
-      <w:r>
-        <w:t xml:space="preserve">the buy box and every section from today’s page are there (menu, Five jobs, ingredient library, comparison, timeline, How to take it, FAQs), with</w:t>
-      </w:r>
-      <w:r>
-        <w:t xml:space="preserve"> </w:t>
-      </w:r>
-      <w:r>
-        <w:rPr>
-          <w:bCs/>
-          <w:b/>
-        </w:rPr>
-        <w:t xml:space="preserve">no</w:t>
-      </w:r>
-      <w:r>
-        <w:t xml:space="preserve"> </w:t>
-      </w:r>
-      <w:r>
-        <w:t xml:space="preserve">dark Black Friday box above the plans.</w:t>
+        <w:t xml:space="preserve">Template-only</w:t>
+      </w:r>
+      <w:r>
+        <w:t xml:space="preserve"> </w:t>
+      </w:r>
+      <w:r>
+        <w:t xml:space="preserve">apart from the five new sections and their stylesheet. The page’s own styles are in a Custom Liquid block called</w:t>
+      </w:r>
+      <w:r>
+        <w:t xml:space="preserve"> </w:t>
+      </w:r>
+      <w:r>
+        <w:rPr>
+          <w:rStyle w:val="VerbatimChar"/>
+        </w:rPr>
+        <w:t xml:space="preserve">head_styles</w:t>
+      </w:r>
+      <w:r>
+        <w:t xml:space="preserve"> </w:t>
+      </w:r>
+      <w:r>
+        <w:t xml:space="preserve">at the</w:t>
+      </w:r>
+      <w:r>
+        <w:t xml:space="preserve"> </w:t>
+      </w:r>
+      <w:r>
+        <w:rPr>
+          <w:bCs/>
+          <w:b/>
+        </w:rPr>
+        <w:t xml:space="preserve">top</w:t>
+      </w:r>
+      <w:r>
+        <w:t xml:space="preserve"> </w:t>
+      </w:r>
+      <w:r>
+        <w:t xml:space="preserve">of the template, so the buy box is styled from the first paint (with them at the bottom, the old design flashed on load). Its scripts stay in</w:t>
+      </w:r>
+      <w:r>
+        <w:t xml:space="preserve"> </w:t>
+      </w:r>
+      <w:r>
+        <w:rPr>
+          <w:rStyle w:val="VerbatimChar"/>
+        </w:rPr>
+        <w:t xml:space="preserve">easy_read</w:t>
+      </w:r>
+      <w:r>
+        <w:t xml:space="preserve"> </w:t>
+      </w:r>
+      <w:r>
+        <w:t xml:space="preserve">and</w:t>
+      </w:r>
+      <w:r>
+        <w:t xml:space="preserve"> </w:t>
+      </w:r>
+      <w:r>
+        <w:rPr>
+          <w:rStyle w:val="VerbatimChar"/>
+        </w:rPr>
+        <w:t xml:space="preserve">bands</w:t>
+      </w:r>
+      <w:r>
+        <w:t xml:space="preserve"> </w:t>
+      </w:r>
+      <w:r>
+        <w:t xml:space="preserve">at the bottom. The</w:t>
+      </w:r>
+      <w:r>
+        <w:t xml:space="preserve"> </w:t>
+      </w:r>
+      <w:r>
+        <w:rPr>
+          <w:rStyle w:val="VerbatimChar"/>
+        </w:rPr>
+        <w:t xml:space="preserve">bands</w:t>
+      </w:r>
+      <w:r>
+        <w:t xml:space="preserve"> </w:t>
+      </w:r>
+      <w:r>
+        <w:t xml:space="preserve">scripts (delivery line, rotating stats, collaboration line, video drag) run again after</w:t>
+      </w:r>
+      <w:r>
+        <w:t xml:space="preserve"> </w:t>
+      </w:r>
+      <w:r>
+        <w:rPr>
+          <w:rStyle w:val="VerbatimChar"/>
+        </w:rPr>
+        <w:t xml:space="preserve">shopify:section:load</w:t>
+      </w:r>
+      <w:r>
+        <w:t xml:space="preserve">, so they survive the theme editor re-drawing the buy box.</w:t>
       </w:r>
     </w:p>
     <w:p>
@@ -3112,139 +3335,241 @@
           <w:bCs/>
           <w:b/>
         </w:rPr>
-        <w:t xml:space="preserve">Add to cart</w:t>
-      </w:r>
-      <w:r>
-        <w:t xml:space="preserve"> </w:t>
-      </w:r>
-      <w:r>
-        <w:t xml:space="preserve">on the Quarterly plan, the Monthly plan and one-time purchase. Each lands in the cart at the full price, with</w:t>
-      </w:r>
-      <w:r>
-        <w:t xml:space="preserve"> </w:t>
-      </w:r>
-      <w:r>
-        <w:rPr>
-          <w:bCs/>
-          <w:b/>
-        </w:rPr>
-        <w:t xml:space="preserve">no MUTO10</w:t>
-      </w:r>
-      <w:r>
-        <w:t xml:space="preserve">.</w:t>
+        <w:t xml:space="preserve">Source:</w:t>
+      </w:r>
+      <w:r>
+        <w:t xml:space="preserve"> </w:t>
+      </w:r>
+      <w:r>
+        <w:rPr>
+          <w:rStyle w:val="VerbatimChar"/>
+        </w:rPr>
+        <w:t xml:space="preserve">shopify/pdp-trust/make_trust.py</w:t>
+      </w:r>
+      <w:r>
+        <w:t xml:space="preserve"> </w:t>
+      </w:r>
+      <w:r>
+        <w:t xml:space="preserve">builds the template. Change copy there and rebuild rather than editing by hand, or tell Richie about manual edits so they aren’t lost on the next rebuild.</w:t>
+      </w:r>
+    </w:p>
+    <w:bookmarkEnd w:id="27"/>
+    <w:bookmarkEnd w:id="28"/>
+    <w:bookmarkStart w:id="29" w:name="check-after-publishing"/>
+    <w:p>
+      <w:pPr>
+        <w:pStyle w:val="Heading1"/>
+      </w:pPr>
+      <w:r>
+        <w:t xml:space="preserve">Check after publishing</w:t>
       </w:r>
     </w:p>
     <w:p>
       <w:pPr>
         <w:numPr>
           <w:ilvl w:val="0"/>
-          <w:numId w:val="1007"/>
-        </w:numPr>
-        <w:pStyle w:val="Compact"/>
-      </w:pPr>
-      <w:r>
-        <w:rPr>
-          <w:bCs/>
-          <w:b/>
-        </w:rPr>
-        <w:t xml:space="preserve">Clicks:</w:t>
-      </w:r>
-    </w:p>
-    <w:p>
-      <w:pPr>
-        <w:numPr>
-          <w:ilvl w:val="1"/>
           <w:numId w:val="1008"/>
         </w:numPr>
         <w:pStyle w:val="Compact"/>
       </w:pPr>
       <w:r>
-        <w:t xml:space="preserve">The stars scroll to the reviews widget.</w:t>
+        <w:rPr>
+          <w:bCs/>
+          <w:b/>
+        </w:rPr>
+        <w:t xml:space="preserve">Main URL and -2:</w:t>
+      </w:r>
+      <w:r>
+        <w:t xml:space="preserve"> </w:t>
+      </w:r>
+      <w:r>
+        <w:t xml:space="preserve">the buy box and every section from today’s page are there (menu, Five jobs, ingredient library, comparison, timeline, How to take it, FAQs), with</w:t>
+      </w:r>
+      <w:r>
+        <w:t xml:space="preserve"> </w:t>
+      </w:r>
+      <w:r>
+        <w:rPr>
+          <w:bCs/>
+          <w:b/>
+        </w:rPr>
+        <w:t xml:space="preserve">no</w:t>
+      </w:r>
+      <w:r>
+        <w:t xml:space="preserve"> </w:t>
+      </w:r>
+      <w:r>
+        <w:t xml:space="preserve">dark Black Friday box above the plans.</w:t>
       </w:r>
     </w:p>
     <w:p>
       <w:pPr>
         <w:numPr>
-          <w:ilvl w:val="1"/>
+          <w:ilvl w:val="0"/>
           <w:numId w:val="1008"/>
         </w:numPr>
         <w:pStyle w:val="Compact"/>
       </w:pPr>
       <w:r>
-        <w:t xml:space="preserve">“</w:t>
-      </w:r>
-      <w:r>
-        <w:t xml:space="preserve">Scientific board</w:t>
-      </w:r>
-      <w:r>
-        <w:t xml:space="preserve">”</w:t>
-      </w:r>
-      <w:r>
-        <w:t xml:space="preserve"> </w:t>
-      </w:r>
-      <w:r>
-        <w:t xml:space="preserve">scrolls to the board.</w:t>
+        <w:rPr>
+          <w:bCs/>
+          <w:b/>
+        </w:rPr>
+        <w:t xml:space="preserve">Add to cart</w:t>
+      </w:r>
+      <w:r>
+        <w:t xml:space="preserve"> </w:t>
+      </w:r>
+      <w:r>
+        <w:t xml:space="preserve">on the Quarterly plan, the Monthly plan and one-time purchase. Each lands in the cart at the full price, with</w:t>
+      </w:r>
+      <w:r>
+        <w:t xml:space="preserve"> </w:t>
+      </w:r>
+      <w:r>
+        <w:rPr>
+          <w:bCs/>
+          <w:b/>
+        </w:rPr>
+        <w:t xml:space="preserve">no MUTO10</w:t>
+      </w:r>
+      <w:r>
+        <w:t xml:space="preserve">.</w:t>
       </w:r>
     </w:p>
     <w:p>
       <w:pPr>
         <w:numPr>
-          <w:ilvl w:val="1"/>
+          <w:ilvl w:val="0"/>
           <w:numId w:val="1008"/>
         </w:numPr>
         <w:pStyle w:val="Compact"/>
       </w:pPr>
       <w:r>
-        <w:t xml:space="preserve">Each</w:t>
-      </w:r>
-      <w:r>
-        <w:t xml:space="preserve"> </w:t>
-      </w:r>
-      <w:r>
-        <w:t xml:space="preserve">“</w:t>
-      </w:r>
-      <w:r>
-        <w:t xml:space="preserve">On this page</w:t>
-      </w:r>
-      <w:r>
-        <w:t xml:space="preserve">”</w:t>
-      </w:r>
-      <w:r>
-        <w:t xml:space="preserve"> </w:t>
-      </w:r>
-      <w:r>
-        <w:t xml:space="preserve">menu link scrolls to its section.</w:t>
+        <w:rPr>
+          <w:bCs/>
+          <w:b/>
+        </w:rPr>
+        <w:t xml:space="preserve">Clicks:</w:t>
       </w:r>
     </w:p>
     <w:p>
       <w:pPr>
         <w:numPr>
           <w:ilvl w:val="1"/>
+          <w:numId w:val="1009"/>
+        </w:numPr>
+        <w:pStyle w:val="Compact"/>
+      </w:pPr>
+      <w:r>
+        <w:t xml:space="preserve">The stars scroll to the reviews widget.</w:t>
+      </w:r>
+    </w:p>
+    <w:p>
+      <w:pPr>
+        <w:numPr>
+          <w:ilvl w:val="1"/>
+          <w:numId w:val="1009"/>
+        </w:numPr>
+        <w:pStyle w:val="Compact"/>
+      </w:pPr>
+      <w:r>
+        <w:t xml:space="preserve">“</w:t>
+      </w:r>
+      <w:r>
+        <w:t xml:space="preserve">Scientific board</w:t>
+      </w:r>
+      <w:r>
+        <w:t xml:space="preserve">”</w:t>
+      </w:r>
+      <w:r>
+        <w:t xml:space="preserve"> </w:t>
+      </w:r>
+      <w:r>
+        <w:t xml:space="preserve">scrolls to the board.</w:t>
+      </w:r>
+    </w:p>
+    <w:p>
+      <w:pPr>
+        <w:numPr>
+          <w:ilvl w:val="1"/>
+          <w:numId w:val="1009"/>
+        </w:numPr>
+        <w:pStyle w:val="Compact"/>
+      </w:pPr>
+      <w:r>
+        <w:t xml:space="preserve">Each</w:t>
+      </w:r>
+      <w:r>
+        <w:t xml:space="preserve"> </w:t>
+      </w:r>
+      <w:r>
+        <w:t xml:space="preserve">“</w:t>
+      </w:r>
+      <w:r>
+        <w:t xml:space="preserve">On this page</w:t>
+      </w:r>
+      <w:r>
+        <w:t xml:space="preserve">”</w:t>
+      </w:r>
+      <w:r>
+        <w:t xml:space="preserve"> </w:t>
+      </w:r>
+      <w:r>
+        <w:t xml:space="preserve">menu link scrolls to its section.</w:t>
+      </w:r>
+    </w:p>
+    <w:p>
+      <w:pPr>
+        <w:numPr>
+          <w:ilvl w:val="1"/>
+          <w:numId w:val="1009"/>
+        </w:numPr>
+        <w:pStyle w:val="Compact"/>
+      </w:pPr>
+      <w:r>
+        <w:t xml:space="preserve">“</w:t>
+      </w:r>
+      <w:r>
+        <w:t xml:space="preserve">View third-party testing results</w:t>
+      </w:r>
+      <w:r>
+        <w:t xml:space="preserve">”</w:t>
+      </w:r>
+      <w:r>
+        <w:t xml:space="preserve"> </w:t>
+      </w:r>
+      <w:r>
+        <w:t xml:space="preserve">(under the images, and on standards card 1) opens the certificate panel.</w:t>
+      </w:r>
+    </w:p>
+    <w:p>
+      <w:pPr>
+        <w:numPr>
+          <w:ilvl w:val="0"/>
           <w:numId w:val="1008"/>
         </w:numPr>
         <w:pStyle w:val="Compact"/>
       </w:pPr>
       <w:r>
-        <w:t xml:space="preserve">“</w:t>
-      </w:r>
-      <w:r>
-        <w:t xml:space="preserve">View third-party testing results</w:t>
-      </w:r>
-      <w:r>
-        <w:t xml:space="preserve">”</w:t>
-      </w:r>
-      <w:r>
-        <w:t xml:space="preserve"> </w:t>
-      </w:r>
-      <w:r>
-        <w:t xml:space="preserve">(under the images, and on standards card 1) opens the certificate panel.</w:t>
+        <w:rPr>
+          <w:bCs/>
+          <w:b/>
+        </w:rPr>
+        <w:t xml:space="preserve">Videos:</w:t>
+      </w:r>
+      <w:r>
+        <w:t xml:space="preserve"> </w:t>
+      </w:r>
+      <w:r>
+        <w:t xml:space="preserve">all 8 play. The row scrolls sideways (trackpad, drag, or swipe on a phone).</w:t>
       </w:r>
     </w:p>
     <w:p>
       <w:pPr>
         <w:numPr>
           <w:ilvl w:val="0"/>
-          <w:numId w:val="1007"/>
+          <w:numId w:val="1008"/>
         </w:numPr>
         <w:pStyle w:val="Compact"/>
       </w:pPr>
@@ -3253,20 +3578,20 @@
           <w:bCs/>
           <w:b/>
         </w:rPr>
-        <w:t xml:space="preserve">Videos:</w:t>
-      </w:r>
-      <w:r>
-        <w:t xml:space="preserve"> </w:t>
-      </w:r>
-      <w:r>
-        <w:t xml:space="preserve">all 8 play. The row scrolls sideways (trackpad, drag, or swipe on a phone).</w:t>
+        <w:t xml:space="preserve">Reviews:</w:t>
+      </w:r>
+      <w:r>
+        <w:t xml:space="preserve"> </w:t>
+      </w:r>
+      <w:r>
+        <w:t xml:space="preserve">the cards move on every 6 seconds, and the arrows work.</w:t>
       </w:r>
     </w:p>
     <w:p>
       <w:pPr>
         <w:numPr>
           <w:ilvl w:val="0"/>
-          <w:numId w:val="1007"/>
+          <w:numId w:val="1008"/>
         </w:numPr>
         <w:pStyle w:val="Compact"/>
       </w:pPr>
@@ -3275,20 +3600,20 @@
           <w:bCs/>
           <w:b/>
         </w:rPr>
-        <w:t xml:space="preserve">Reviews:</w:t>
-      </w:r>
-      <w:r>
-        <w:t xml:space="preserve"> </w:t>
-      </w:r>
-      <w:r>
-        <w:t xml:space="preserve">the cards move on every 6 seconds, and the arrows work.</w:t>
+        <w:t xml:space="preserve">On a phone:</w:t>
+      </w:r>
+      <w:r>
+        <w:t xml:space="preserve"> </w:t>
+      </w:r>
+      <w:r>
+        <w:t xml:space="preserve">nothing runs off the side; the statement tag wraps onto two lines.</w:t>
       </w:r>
     </w:p>
     <w:p>
       <w:pPr>
         <w:numPr>
           <w:ilvl w:val="0"/>
-          <w:numId w:val="1007"/>
+          <w:numId w:val="1008"/>
         </w:numPr>
         <w:pStyle w:val="Compact"/>
       </w:pPr>
@@ -3297,20 +3622,20 @@
           <w:bCs/>
           <w:b/>
         </w:rPr>
-        <w:t xml:space="preserve">On a phone:</w:t>
-      </w:r>
-      <w:r>
-        <w:t xml:space="preserve"> </w:t>
-      </w:r>
-      <w:r>
-        <w:t xml:space="preserve">nothing runs off the side; the statement tag wraps onto two lines.</w:t>
+        <w:t xml:space="preserve">No sticky bar</w:t>
+      </w:r>
+      <w:r>
+        <w:t xml:space="preserve"> </w:t>
+      </w:r>
+      <w:r>
+        <w:t xml:space="preserve">appears as you scroll the page.</w:t>
       </w:r>
     </w:p>
     <w:p>
       <w:pPr>
         <w:numPr>
           <w:ilvl w:val="0"/>
-          <w:numId w:val="1007"/>
+          <w:numId w:val="1008"/>
         </w:numPr>
         <w:pStyle w:val="Compact"/>
       </w:pPr>
@@ -3319,20 +3644,42 @@
           <w:bCs/>
           <w:b/>
         </w:rPr>
-        <w:t xml:space="preserve">No sticky bar</w:t>
-      </w:r>
-      <w:r>
-        <w:t xml:space="preserve"> </w:t>
-      </w:r>
-      <w:r>
-        <w:t xml:space="preserve">appears as you scroll the page.</w:t>
+        <w:t xml:space="preserve">-3 and any page on</w:t>
+      </w:r>
+      <w:r>
+        <w:rPr>
+          <w:bCs/>
+          <w:b/>
+        </w:rPr>
+        <w:t xml:space="preserve"> </w:t>
+      </w:r>
+      <w:r>
+        <w:rPr>
+          <w:rStyle w:val="VerbatimChar"/>
+          <w:bCs/>
+          <w:b/>
+        </w:rPr>
+        <w:t xml:space="preserve">muto-nad-performance</w:t>
+      </w:r>
+      <w:r>
+        <w:rPr>
+          <w:bCs/>
+          <w:b/>
+        </w:rPr>
+        <w:t xml:space="preserve">:</w:t>
+      </w:r>
+      <w:r>
+        <w:t xml:space="preserve"> </w:t>
+      </w:r>
+      <w:r>
+        <w:t xml:space="preserve">no Black Friday box (step 3).</w:t>
       </w:r>
     </w:p>
     <w:p>
       <w:pPr>
         <w:numPr>
           <w:ilvl w:val="0"/>
-          <w:numId w:val="1007"/>
+          <w:numId w:val="1008"/>
         </w:numPr>
         <w:pStyle w:val="Compact"/>
       </w:pPr>
@@ -3341,42 +3688,20 @@
           <w:bCs/>
           <w:b/>
         </w:rPr>
-        <w:t xml:space="preserve">-3 and any page on</w:t>
-      </w:r>
-      <w:r>
-        <w:rPr>
-          <w:bCs/>
-          <w:b/>
-        </w:rPr>
-        <w:t xml:space="preserve"> </w:t>
-      </w:r>
-      <w:r>
-        <w:rPr>
-          <w:rStyle w:val="VerbatimChar"/>
-          <w:bCs/>
-          <w:b/>
-        </w:rPr>
-        <w:t xml:space="preserve">muto-nad-performance</w:t>
-      </w:r>
-      <w:r>
-        <w:rPr>
-          <w:bCs/>
-          <w:b/>
-        </w:rPr>
-        <w:t xml:space="preserve">:</w:t>
-      </w:r>
-      <w:r>
-        <w:t xml:space="preserve"> </w:t>
-      </w:r>
-      <w:r>
-        <w:t xml:space="preserve">no Black Friday box (step 3).</w:t>
+        <w:t xml:space="preserve">Travel vial:</w:t>
+      </w:r>
+      <w:r>
+        <w:t xml:space="preserve"> </w:t>
+      </w:r>
+      <w:r>
+        <w:t xml:space="preserve">add the 3-month plan to the cart. The drawer’s gift list shows Travel Vial, £10 struck through, Free. The monthly plan doesn’t get it.</w:t>
       </w:r>
     </w:p>
     <w:p>
       <w:pPr>
         <w:numPr>
           <w:ilvl w:val="0"/>
-          <w:numId w:val="1007"/>
+          <w:numId w:val="1008"/>
         </w:numPr>
         <w:pStyle w:val="Compact"/>
       </w:pPr>
@@ -3427,10 +3752,10 @@
         <w:t xml:space="preserve"> </w:t>
       </w:r>
       <w:r>
-        <w:t xml:space="preserve">(step 4).</w:t>
-      </w:r>
-    </w:p>
-    <w:bookmarkEnd w:id="28"/>
+        <w:t xml:space="preserve">(step 5).</w:t>
+      </w:r>
+    </w:p>
+    <w:bookmarkEnd w:id="29"/>
     <w:sectPr/>
   </w:body>
 </w:document>
@@ -3738,6 +4063,9 @@
     </w:lvlOverride>
   </w:num>
   <w:num w:numId="1004">
+    <w:abstractNumId w:val="991"/>
+  </w:num>
+  <w:num w:numId="1005">
     <w:abstractNumId w:val="99411"/>
     <w:lvlOverride w:ilvl="0">
       <w:startOverride w:val="1"/>
@@ -3767,13 +4095,13 @@
       <w:startOverride w:val="1"/>
     </w:lvlOverride>
   </w:num>
-  <w:num w:numId="1005">
-    <w:abstractNumId w:val="991"/>
-  </w:num>
   <w:num w:numId="1006">
     <w:abstractNumId w:val="991"/>
   </w:num>
   <w:num w:numId="1007">
+    <w:abstractNumId w:val="991"/>
+  </w:num>
+  <w:num w:numId="1008">
     <w:abstractNumId w:val="99411"/>
     <w:lvlOverride w:ilvl="0">
       <w:startOverride w:val="1"/>
@@ -3803,7 +4131,7 @@
       <w:startOverride w:val="1"/>
     </w:lvlOverride>
   </w:num>
-  <w:num w:numId="1008">
+  <w:num w:numId="1009">
     <w:abstractNumId w:val="991"/>
   </w:num>
 </w:numbering>

</xml_diff>

<commit_message>
PDPs: no layout jump on load — Quarterly preselected and buy-box additions run straight after the buy box
Co-Authored-By: Claude Opus 5.5 <noreply@anthropic.com>
Claude-Session: https://claude.ai/code/session_01VYMABjkorQn2QmgJS9ckGR
</commit_message>
<xml_diff>
--- a/handoff/MUTO_Dev_Handoff_Main_PDP_28Oct2026.docx
+++ b/handoff/MUTO_Dev_Handoff_Main_PDP_28Oct2026.docx
@@ -3292,7 +3292,19 @@
         <w:t xml:space="preserve"> </w:t>
       </w:r>
       <w:r>
-        <w:t xml:space="preserve">at the bottom. The</w:t>
+        <w:t xml:space="preserve">at the bottom. A Custom Liquid block called</w:t>
+      </w:r>
+      <w:r>
+        <w:t xml:space="preserve"> </w:t>
+      </w:r>
+      <w:r>
+        <w:rPr>
+          <w:rStyle w:val="VerbatimChar"/>
+        </w:rPr>
+        <w:t xml:space="preserve">early</w:t>
+      </w:r>
+      <w:r>
+        <w:t xml:space="preserve">, straight after the buy box, opens the page on the Quarterly plan and adds the subhead, the testing-results button, the collaboration line, the rotating stats and the delivery line before the first paint, so nothing jumps on load (it used to flip from Monthly to Quarterly once the page had loaded). The same scripts at the bottom stay as a safety net. The</w:t>
       </w:r>
       <w:r>
         <w:t xml:space="preserve"> </w:t>

</xml_diff>

<commit_message>
PDPs: lazy-load the REVIEWS.io widget, preload the buy-box fonts; theme-wide speed list in the handover
Co-Authored-By: Claude Opus 5.5 <noreply@anthropic.com>
Claude-Session: https://claude.ai/code/session_01VYMABjkorQn2QmgJS9ckGR
</commit_message>
<xml_diff>
--- a/handoff/MUTO_Dev_Handoff_Main_PDP_28Oct2026.docx
+++ b/handoff/MUTO_Dev_Handoff_Main_PDP_28Oct2026.docx
@@ -3367,13 +3367,36 @@
     </w:p>
     <w:bookmarkEnd w:id="27"/>
     <w:bookmarkEnd w:id="28"/>
-    <w:bookmarkStart w:id="29" w:name="check-after-publishing"/>
+    <w:bookmarkStart w:id="29" w:name="page-speed-theme-wide-for-you-to-do"/>
     <w:p>
       <w:pPr>
         <w:pStyle w:val="Heading1"/>
       </w:pPr>
       <w:r>
-        <w:t xml:space="preserve">Check after publishing</w:t>
+        <w:t xml:space="preserve">Page speed (theme-wide, for you to do)</w:t>
+      </w:r>
+    </w:p>
+    <w:p>
+      <w:pPr>
+        <w:pStyle w:val="FirstParagraph"/>
+      </w:pPr>
+      <w:r>
+        <w:t xml:space="preserve">The template now does its part: the REVIEWS.io widget loads only when the reader nears it (or once the page is idle), the two Neue Haas weights are preloaded, and nothing in the buy box moves after first paint. What’s left is in</w:t>
+      </w:r>
+      <w:r>
+        <w:t xml:space="preserve"> </w:t>
+      </w:r>
+      <w:r>
+        <w:rPr>
+          <w:rStyle w:val="VerbatimChar"/>
+        </w:rPr>
+        <w:t xml:space="preserve">layout/theme.liquid</w:t>
+      </w:r>
+      <w:r>
+        <w:t xml:space="preserve"> </w:t>
+      </w:r>
+      <w:r>
+        <w:t xml:space="preserve">and the app embeds, which every page shares, so it’s yours to change and test:</w:t>
       </w:r>
     </w:p>
     <w:p>
@@ -3389,29 +3412,140 @@
           <w:bCs/>
           <w:b/>
         </w:rPr>
-        <w:t xml:space="preserve">Main URL and -2:</w:t>
-      </w:r>
-      <w:r>
-        <w:t xml:space="preserve"> </w:t>
-      </w:r>
-      <w:r>
-        <w:t xml:space="preserve">the buy box and every section from today’s page are there (menu, Five jobs, ingredient library, comparison, timeline, How to take it, FAQs), with</w:t>
-      </w:r>
-      <w:r>
-        <w:t xml:space="preserve"> </w:t>
-      </w:r>
-      <w:r>
-        <w:rPr>
-          <w:bCs/>
-          <w:b/>
-        </w:rPr>
-        <w:t xml:space="preserve">no</w:t>
-      </w:r>
-      <w:r>
-        <w:t xml:space="preserve"> </w:t>
-      </w:r>
-      <w:r>
-        <w:t xml:space="preserve">dark Black Friday box above the plans.</w:t>
+        <w:t xml:space="preserve">Render-blocking scripts in</w:t>
+      </w:r>
+      <w:r>
+        <w:rPr>
+          <w:bCs/>
+          <w:b/>
+        </w:rPr>
+        <w:t xml:space="preserve"> </w:t>
+      </w:r>
+      <w:r>
+        <w:rPr>
+          <w:rStyle w:val="VerbatimChar"/>
+          <w:bCs/>
+          <w:b/>
+        </w:rPr>
+        <w:t xml:space="preserve">&lt;head&gt;</w:t>
+      </w:r>
+      <w:r>
+        <w:rPr>
+          <w:bCs/>
+          <w:b/>
+        </w:rPr>
+        <w:t xml:space="preserve">.</w:t>
+      </w:r>
+      <w:r>
+        <w:t xml:space="preserve"> </w:t>
+      </w:r>
+      <w:r>
+        <w:rPr>
+          <w:rStyle w:val="VerbatimChar"/>
+        </w:rPr>
+        <w:t xml:space="preserve">jquery-min.js</w:t>
+      </w:r>
+      <w:r>
+        <w:t xml:space="preserve">,</w:t>
+      </w:r>
+      <w:r>
+        <w:t xml:space="preserve"> </w:t>
+      </w:r>
+      <w:r>
+        <w:rPr>
+          <w:rStyle w:val="VerbatimChar"/>
+        </w:rPr>
+        <w:t xml:space="preserve">slick-min.js</w:t>
+      </w:r>
+      <w:r>
+        <w:t xml:space="preserve"> </w:t>
+      </w:r>
+      <w:r>
+        <w:t xml:space="preserve">and</w:t>
+      </w:r>
+      <w:r>
+        <w:t xml:space="preserve"> </w:t>
+      </w:r>
+      <w:r>
+        <w:rPr>
+          <w:rStyle w:val="VerbatimChar"/>
+        </w:rPr>
+        <w:t xml:space="preserve">custom.js</w:t>
+      </w:r>
+      <w:r>
+        <w:t xml:space="preserve"> </w:t>
+      </w:r>
+      <w:r>
+        <w:t xml:space="preserve">load with no</w:t>
+      </w:r>
+      <w:r>
+        <w:t xml:space="preserve"> </w:t>
+      </w:r>
+      <w:r>
+        <w:rPr>
+          <w:rStyle w:val="VerbatimChar"/>
+        </w:rPr>
+        <w:t xml:space="preserve">defer</w:t>
+      </w:r>
+      <w:r>
+        <w:t xml:space="preserve">, so a phone downloads and runs ~130 KB of script before it can draw anything. Add</w:t>
+      </w:r>
+      <w:r>
+        <w:t xml:space="preserve"> </w:t>
+      </w:r>
+      <w:r>
+        <w:rPr>
+          <w:rStyle w:val="VerbatimChar"/>
+        </w:rPr>
+        <w:t xml:space="preserve">defer</w:t>
+      </w:r>
+      <w:r>
+        <w:t xml:space="preserve"> </w:t>
+      </w:r>
+      <w:r>
+        <w:t xml:space="preserve">to all three (they keep their order). First search the theme for inline scripts that call</w:t>
+      </w:r>
+      <w:r>
+        <w:t xml:space="preserve"> </w:t>
+      </w:r>
+      <w:r>
+        <w:rPr>
+          <w:rStyle w:val="VerbatimChar"/>
+        </w:rPr>
+        <w:t xml:space="preserve">$(</w:t>
+      </w:r>
+      <w:r>
+        <w:t xml:space="preserve"> </w:t>
+      </w:r>
+      <w:r>
+        <w:t xml:space="preserve">or</w:t>
+      </w:r>
+      <w:r>
+        <w:t xml:space="preserve"> </w:t>
+      </w:r>
+      <w:r>
+        <w:rPr>
+          <w:rStyle w:val="VerbatimChar"/>
+        </w:rPr>
+        <w:t xml:space="preserve">jQuery(</w:t>
+      </w:r>
+      <w:r>
+        <w:t xml:space="preserve"> </w:t>
+      </w:r>
+      <w:r>
+        <w:t xml:space="preserve">straight away rather than on</w:t>
+      </w:r>
+      <w:r>
+        <w:t xml:space="preserve"> </w:t>
+      </w:r>
+      <w:r>
+        <w:rPr>
+          <w:rStyle w:val="VerbatimChar"/>
+        </w:rPr>
+        <w:t xml:space="preserve">DOMContentLoaded</w:t>
+      </w:r>
+      <w:r>
+        <w:t xml:space="preserve">. Those would break, so wrap them first.</w:t>
       </w:r>
     </w:p>
     <w:p>
@@ -3427,23 +3561,34 @@
           <w:bCs/>
           <w:b/>
         </w:rPr>
-        <w:t xml:space="preserve">Add to cart</w:t>
-      </w:r>
-      <w:r>
-        <w:t xml:space="preserve"> </w:t>
-      </w:r>
-      <w:r>
-        <w:t xml:space="preserve">on the Quarterly plan, the Monthly plan and one-time purchase. Each lands in the cart at the full price, with</w:t>
-      </w:r>
-      <w:r>
-        <w:t xml:space="preserve"> </w:t>
-      </w:r>
-      <w:r>
-        <w:rPr>
-          <w:bCs/>
-          <w:b/>
-        </w:rPr>
-        <w:t xml:space="preserve">no MUTO10</w:t>
+        <w:t xml:space="preserve">The OpenAI pixel</w:t>
+      </w:r>
+      <w:r>
+        <w:t xml:space="preserve"> </w:t>
+      </w:r>
+      <w:r>
+        <w:t xml:space="preserve">is initialised with</w:t>
+      </w:r>
+      <w:r>
+        <w:t xml:space="preserve"> </w:t>
+      </w:r>
+      <w:r>
+        <w:rPr>
+          <w:rStyle w:val="VerbatimChar"/>
+        </w:rPr>
+        <w:t xml:space="preserve">debug: true</w:t>
+      </w:r>
+      <w:r>
+        <w:t xml:space="preserve">. Set it to</w:t>
+      </w:r>
+      <w:r>
+        <w:t xml:space="preserve"> </w:t>
+      </w:r>
+      <w:r>
+        <w:rPr>
+          <w:rStyle w:val="VerbatimChar"/>
+        </w:rPr>
+        <w:t xml:space="preserve">false</w:t>
       </w:r>
       <w:r>
         <w:t xml:space="preserve">.</w:t>
@@ -3462,97 +3607,40 @@
           <w:bCs/>
           <w:b/>
         </w:rPr>
-        <w:t xml:space="preserve">Clicks:</w:t>
-      </w:r>
-    </w:p>
-    <w:p>
-      <w:pPr>
-        <w:numPr>
-          <w:ilvl w:val="1"/>
-          <w:numId w:val="1009"/>
-        </w:numPr>
-        <w:pStyle w:val="Compact"/>
-      </w:pPr>
-      <w:r>
-        <w:t xml:space="preserve">The stars scroll to the reviews widget.</w:t>
-      </w:r>
-    </w:p>
-    <w:p>
-      <w:pPr>
-        <w:numPr>
-          <w:ilvl w:val="1"/>
-          <w:numId w:val="1009"/>
-        </w:numPr>
-        <w:pStyle w:val="Compact"/>
-      </w:pPr>
-      <w:r>
-        <w:t xml:space="preserve">“</w:t>
-      </w:r>
-      <w:r>
-        <w:t xml:space="preserve">Scientific board</w:t>
-      </w:r>
-      <w:r>
-        <w:t xml:space="preserve">”</w:t>
-      </w:r>
-      <w:r>
-        <w:t xml:space="preserve"> </w:t>
-      </w:r>
-      <w:r>
-        <w:t xml:space="preserve">scrolls to the board.</w:t>
-      </w:r>
-    </w:p>
-    <w:p>
-      <w:pPr>
-        <w:numPr>
-          <w:ilvl w:val="1"/>
-          <w:numId w:val="1009"/>
-        </w:numPr>
-        <w:pStyle w:val="Compact"/>
-      </w:pPr>
-      <w:r>
-        <w:t xml:space="preserve">Each</w:t>
-      </w:r>
-      <w:r>
-        <w:t xml:space="preserve"> </w:t>
-      </w:r>
-      <w:r>
-        <w:t xml:space="preserve">“</w:t>
-      </w:r>
-      <w:r>
-        <w:t xml:space="preserve">On this page</w:t>
-      </w:r>
-      <w:r>
-        <w:t xml:space="preserve">”</w:t>
-      </w:r>
-      <w:r>
-        <w:t xml:space="preserve"> </w:t>
-      </w:r>
-      <w:r>
-        <w:t xml:space="preserve">menu link scrolls to its section.</w:t>
-      </w:r>
-    </w:p>
-    <w:p>
-      <w:pPr>
-        <w:numPr>
-          <w:ilvl w:val="1"/>
-          <w:numId w:val="1009"/>
-        </w:numPr>
-        <w:pStyle w:val="Compact"/>
-      </w:pPr>
-      <w:r>
-        <w:t xml:space="preserve">“</w:t>
-      </w:r>
-      <w:r>
-        <w:t xml:space="preserve">View third-party testing results</w:t>
-      </w:r>
-      <w:r>
-        <w:t xml:space="preserve">”</w:t>
-      </w:r>
-      <w:r>
-        <w:t xml:space="preserve"> </w:t>
-      </w:r>
-      <w:r>
-        <w:t xml:space="preserve">(under the images, and on standards card 1) opens the certificate panel.</w:t>
+        <w:t xml:space="preserve">The Usermaven script</w:t>
+      </w:r>
+      <w:r>
+        <w:t xml:space="preserve"> </w:t>
+      </w:r>
+      <w:r>
+        <w:t xml:space="preserve">sits before</w:t>
+      </w:r>
+      <w:r>
+        <w:t xml:space="preserve"> </w:t>
+      </w:r>
+      <w:r>
+        <w:rPr>
+          <w:rStyle w:val="VerbatimChar"/>
+        </w:rPr>
+        <w:t xml:space="preserve">&lt;head&gt;</w:t>
+      </w:r>
+      <w:r>
+        <w:t xml:space="preserve">. Move it inside</w:t>
+      </w:r>
+      <w:r>
+        <w:t xml:space="preserve"> </w:t>
+      </w:r>
+      <w:r>
+        <w:rPr>
+          <w:rStyle w:val="VerbatimChar"/>
+        </w:rPr>
+        <w:t xml:space="preserve">&lt;head&gt;</w:t>
+      </w:r>
+      <w:r>
+        <w:t xml:space="preserve"> </w:t>
+      </w:r>
+      <w:r>
+        <w:t xml:space="preserve">(it already loads deferred).</w:t>
       </w:r>
     </w:p>
     <w:p>
@@ -3568,13 +3656,13 @@
           <w:bCs/>
           <w:b/>
         </w:rPr>
-        <w:t xml:space="preserve">Videos:</w:t>
-      </w:r>
-      <w:r>
-        <w:t xml:space="preserve"> </w:t>
-      </w:r>
-      <w:r>
-        <w:t xml:space="preserve">all 8 play. The row scrolls sideways (trackpad, drag, or swipe on a phone).</w:t>
+        <w:t xml:space="preserve">App embeds</w:t>
+      </w:r>
+      <w:r>
+        <w:t xml:space="preserve"> </w:t>
+      </w:r>
+      <w:r>
+        <w:t xml:space="preserve">(Online Store → Customize → App embeds). REVIEWS.io core and rating snippet, Klaviyo, Elevar, Triple Whale, Microsoft Clarity, Alia and Pandectes all load on every page. Turn off any that aren’t used. Clarity and Alia are the usual candidates to load only on key pages.</w:t>
       </w:r>
     </w:p>
     <w:p>
@@ -3590,13 +3678,70 @@
           <w:bCs/>
           <w:b/>
         </w:rPr>
-        <w:t xml:space="preserve">Reviews:</w:t>
-      </w:r>
-      <w:r>
-        <w:t xml:space="preserve"> </w:t>
-      </w:r>
-      <w:r>
-        <w:t xml:space="preserve">the cards move on every 6 seconds, and the arrows work.</w:t>
+        <w:t xml:space="preserve">Preload the page’s stylesheets.</w:t>
+      </w:r>
+      <w:r>
+        <w:t xml:space="preserve"> </w:t>
+      </w:r>
+      <w:r>
+        <w:t xml:space="preserve">On product pages, add</w:t>
+      </w:r>
+      <w:r>
+        <w:t xml:space="preserve"> </w:t>
+      </w:r>
+      <w:r>
+        <w:rPr>
+          <w:rStyle w:val="VerbatimChar"/>
+        </w:rPr>
+        <w:t xml:space="preserve">&lt;link rel="preload" as="style"&gt;</w:t>
+      </w:r>
+      <w:r>
+        <w:t xml:space="preserve"> </w:t>
+      </w:r>
+      <w:r>
+        <w:t xml:space="preserve">in</w:t>
+      </w:r>
+      <w:r>
+        <w:t xml:space="preserve"> </w:t>
+      </w:r>
+      <w:r>
+        <w:rPr>
+          <w:rStyle w:val="VerbatimChar"/>
+        </w:rPr>
+        <w:t xml:space="preserve">&lt;head&gt;</w:t>
+      </w:r>
+      <w:r>
+        <w:t xml:space="preserve"> </w:t>
+      </w:r>
+      <w:r>
+        <w:t xml:space="preserve">for</w:t>
+      </w:r>
+      <w:r>
+        <w:t xml:space="preserve"> </w:t>
+      </w:r>
+      <w:r>
+        <w:rPr>
+          <w:rStyle w:val="VerbatimChar"/>
+        </w:rPr>
+        <w:t xml:space="preserve">muto-crea.css</w:t>
+      </w:r>
+      <w:r>
+        <w:t xml:space="preserve"> </w:t>
+      </w:r>
+      <w:r>
+        <w:t xml:space="preserve">and</w:t>
+      </w:r>
+      <w:r>
+        <w:t xml:space="preserve"> </w:t>
+      </w:r>
+      <w:r>
+        <w:rPr>
+          <w:rStyle w:val="VerbatimChar"/>
+        </w:rPr>
+        <w:t xml:space="preserve">muto-home.css</w:t>
+      </w:r>
+      <w:r>
+        <w:t xml:space="preserve">. The buy box links them from the body, so the browser finds them late.</w:t>
       </w:r>
     </w:p>
     <w:p>
@@ -3612,20 +3757,30 @@
           <w:bCs/>
           <w:b/>
         </w:rPr>
-        <w:t xml:space="preserve">On a phone:</w:t>
-      </w:r>
-      <w:r>
-        <w:t xml:space="preserve"> </w:t>
-      </w:r>
-      <w:r>
-        <w:t xml:space="preserve">nothing runs off the side; the statement tag wraps onto two lines.</w:t>
+        <w:t xml:space="preserve">Measure before and after</w:t>
+      </w:r>
+      <w:r>
+        <w:t xml:space="preserve"> </w:t>
+      </w:r>
+      <w:r>
+        <w:t xml:space="preserve">with PageSpeed Insights (mobile) on the main URL. Watch LCP (the first product photo, already marked high priority) and Total Blocking Time.</w:t>
+      </w:r>
+    </w:p>
+    <w:bookmarkEnd w:id="29"/>
+    <w:bookmarkStart w:id="30" w:name="check-after-publishing"/>
+    <w:p>
+      <w:pPr>
+        <w:pStyle w:val="Heading1"/>
+      </w:pPr>
+      <w:r>
+        <w:t xml:space="preserve">Check after publishing</w:t>
       </w:r>
     </w:p>
     <w:p>
       <w:pPr>
         <w:numPr>
           <w:ilvl w:val="0"/>
-          <w:numId w:val="1008"/>
+          <w:numId w:val="1009"/>
         </w:numPr>
         <w:pStyle w:val="Compact"/>
       </w:pPr>
@@ -3634,20 +3789,36 @@
           <w:bCs/>
           <w:b/>
         </w:rPr>
-        <w:t xml:space="preserve">No sticky bar</w:t>
-      </w:r>
-      <w:r>
-        <w:t xml:space="preserve"> </w:t>
-      </w:r>
-      <w:r>
-        <w:t xml:space="preserve">appears as you scroll the page.</w:t>
+        <w:t xml:space="preserve">Main URL and -2:</w:t>
+      </w:r>
+      <w:r>
+        <w:t xml:space="preserve"> </w:t>
+      </w:r>
+      <w:r>
+        <w:t xml:space="preserve">the buy box and every section from today’s page are there (menu, Five jobs, ingredient library, comparison, timeline, How to take it, FAQs), with</w:t>
+      </w:r>
+      <w:r>
+        <w:t xml:space="preserve"> </w:t>
+      </w:r>
+      <w:r>
+        <w:rPr>
+          <w:bCs/>
+          <w:b/>
+        </w:rPr>
+        <w:t xml:space="preserve">no</w:t>
+      </w:r>
+      <w:r>
+        <w:t xml:space="preserve"> </w:t>
+      </w:r>
+      <w:r>
+        <w:t xml:space="preserve">dark Black Friday box above the plans.</w:t>
       </w:r>
     </w:p>
     <w:p>
       <w:pPr>
         <w:numPr>
           <w:ilvl w:val="0"/>
-          <w:numId w:val="1008"/>
+          <w:numId w:val="1009"/>
         </w:numPr>
         <w:pStyle w:val="Compact"/>
       </w:pPr>
@@ -3656,42 +3827,33 @@
           <w:bCs/>
           <w:b/>
         </w:rPr>
-        <w:t xml:space="preserve">-3 and any page on</w:t>
-      </w:r>
-      <w:r>
-        <w:rPr>
-          <w:bCs/>
-          <w:b/>
-        </w:rPr>
-        <w:t xml:space="preserve"> </w:t>
-      </w:r>
-      <w:r>
-        <w:rPr>
-          <w:rStyle w:val="VerbatimChar"/>
-          <w:bCs/>
-          <w:b/>
-        </w:rPr>
-        <w:t xml:space="preserve">muto-nad-performance</w:t>
-      </w:r>
-      <w:r>
-        <w:rPr>
-          <w:bCs/>
-          <w:b/>
-        </w:rPr>
-        <w:t xml:space="preserve">:</w:t>
-      </w:r>
-      <w:r>
-        <w:t xml:space="preserve"> </w:t>
-      </w:r>
-      <w:r>
-        <w:t xml:space="preserve">no Black Friday box (step 3).</w:t>
+        <w:t xml:space="preserve">Add to cart</w:t>
+      </w:r>
+      <w:r>
+        <w:t xml:space="preserve"> </w:t>
+      </w:r>
+      <w:r>
+        <w:t xml:space="preserve">on the Quarterly plan, the Monthly plan and one-time purchase. Each lands in the cart at the full price, with</w:t>
+      </w:r>
+      <w:r>
+        <w:t xml:space="preserve"> </w:t>
+      </w:r>
+      <w:r>
+        <w:rPr>
+          <w:bCs/>
+          <w:b/>
+        </w:rPr>
+        <w:t xml:space="preserve">no MUTO10</w:t>
+      </w:r>
+      <w:r>
+        <w:t xml:space="preserve">.</w:t>
       </w:r>
     </w:p>
     <w:p>
       <w:pPr>
         <w:numPr>
           <w:ilvl w:val="0"/>
-          <w:numId w:val="1008"/>
+          <w:numId w:val="1009"/>
         </w:numPr>
         <w:pStyle w:val="Compact"/>
       </w:pPr>
@@ -3700,20 +3862,104 @@
           <w:bCs/>
           <w:b/>
         </w:rPr>
-        <w:t xml:space="preserve">Travel vial:</w:t>
-      </w:r>
-      <w:r>
-        <w:t xml:space="preserve"> </w:t>
-      </w:r>
-      <w:r>
-        <w:t xml:space="preserve">add the 3-month plan to the cart. The drawer’s gift list shows Travel Vial, £10 struck through, Free. The monthly plan doesn’t get it.</w:t>
+        <w:t xml:space="preserve">Clicks:</w:t>
+      </w:r>
+    </w:p>
+    <w:p>
+      <w:pPr>
+        <w:numPr>
+          <w:ilvl w:val="1"/>
+          <w:numId w:val="1010"/>
+        </w:numPr>
+        <w:pStyle w:val="Compact"/>
+      </w:pPr>
+      <w:r>
+        <w:t xml:space="preserve">The stars scroll to the reviews widget.</w:t>
+      </w:r>
+    </w:p>
+    <w:p>
+      <w:pPr>
+        <w:numPr>
+          <w:ilvl w:val="1"/>
+          <w:numId w:val="1010"/>
+        </w:numPr>
+        <w:pStyle w:val="Compact"/>
+      </w:pPr>
+      <w:r>
+        <w:t xml:space="preserve">“</w:t>
+      </w:r>
+      <w:r>
+        <w:t xml:space="preserve">Scientific board</w:t>
+      </w:r>
+      <w:r>
+        <w:t xml:space="preserve">”</w:t>
+      </w:r>
+      <w:r>
+        <w:t xml:space="preserve"> </w:t>
+      </w:r>
+      <w:r>
+        <w:t xml:space="preserve">scrolls to the board.</w:t>
+      </w:r>
+    </w:p>
+    <w:p>
+      <w:pPr>
+        <w:numPr>
+          <w:ilvl w:val="1"/>
+          <w:numId w:val="1010"/>
+        </w:numPr>
+        <w:pStyle w:val="Compact"/>
+      </w:pPr>
+      <w:r>
+        <w:t xml:space="preserve">Each</w:t>
+      </w:r>
+      <w:r>
+        <w:t xml:space="preserve"> </w:t>
+      </w:r>
+      <w:r>
+        <w:t xml:space="preserve">“</w:t>
+      </w:r>
+      <w:r>
+        <w:t xml:space="preserve">On this page</w:t>
+      </w:r>
+      <w:r>
+        <w:t xml:space="preserve">”</w:t>
+      </w:r>
+      <w:r>
+        <w:t xml:space="preserve"> </w:t>
+      </w:r>
+      <w:r>
+        <w:t xml:space="preserve">menu link scrolls to its section.</w:t>
+      </w:r>
+    </w:p>
+    <w:p>
+      <w:pPr>
+        <w:numPr>
+          <w:ilvl w:val="1"/>
+          <w:numId w:val="1010"/>
+        </w:numPr>
+        <w:pStyle w:val="Compact"/>
+      </w:pPr>
+      <w:r>
+        <w:t xml:space="preserve">“</w:t>
+      </w:r>
+      <w:r>
+        <w:t xml:space="preserve">View third-party testing results</w:t>
+      </w:r>
+      <w:r>
+        <w:t xml:space="preserve">”</w:t>
+      </w:r>
+      <w:r>
+        <w:t xml:space="preserve"> </w:t>
+      </w:r>
+      <w:r>
+        <w:t xml:space="preserve">(under the images, and on standards card 1) opens the certificate panel.</w:t>
       </w:r>
     </w:p>
     <w:p>
       <w:pPr>
         <w:numPr>
           <w:ilvl w:val="0"/>
-          <w:numId w:val="1008"/>
+          <w:numId w:val="1009"/>
         </w:numPr>
         <w:pStyle w:val="Compact"/>
       </w:pPr>
@@ -3722,6 +3968,160 @@
           <w:bCs/>
           <w:b/>
         </w:rPr>
+        <w:t xml:space="preserve">Videos:</w:t>
+      </w:r>
+      <w:r>
+        <w:t xml:space="preserve"> </w:t>
+      </w:r>
+      <w:r>
+        <w:t xml:space="preserve">all 8 play. The row scrolls sideways (trackpad, drag, or swipe on a phone).</w:t>
+      </w:r>
+    </w:p>
+    <w:p>
+      <w:pPr>
+        <w:numPr>
+          <w:ilvl w:val="0"/>
+          <w:numId w:val="1009"/>
+        </w:numPr>
+        <w:pStyle w:val="Compact"/>
+      </w:pPr>
+      <w:r>
+        <w:rPr>
+          <w:bCs/>
+          <w:b/>
+        </w:rPr>
+        <w:t xml:space="preserve">Reviews:</w:t>
+      </w:r>
+      <w:r>
+        <w:t xml:space="preserve"> </w:t>
+      </w:r>
+      <w:r>
+        <w:t xml:space="preserve">the cards move on every 6 seconds, and the arrows work.</w:t>
+      </w:r>
+    </w:p>
+    <w:p>
+      <w:pPr>
+        <w:numPr>
+          <w:ilvl w:val="0"/>
+          <w:numId w:val="1009"/>
+        </w:numPr>
+        <w:pStyle w:val="Compact"/>
+      </w:pPr>
+      <w:r>
+        <w:rPr>
+          <w:bCs/>
+          <w:b/>
+        </w:rPr>
+        <w:t xml:space="preserve">On a phone:</w:t>
+      </w:r>
+      <w:r>
+        <w:t xml:space="preserve"> </w:t>
+      </w:r>
+      <w:r>
+        <w:t xml:space="preserve">nothing runs off the side; the statement tag wraps onto two lines.</w:t>
+      </w:r>
+    </w:p>
+    <w:p>
+      <w:pPr>
+        <w:numPr>
+          <w:ilvl w:val="0"/>
+          <w:numId w:val="1009"/>
+        </w:numPr>
+        <w:pStyle w:val="Compact"/>
+      </w:pPr>
+      <w:r>
+        <w:rPr>
+          <w:bCs/>
+          <w:b/>
+        </w:rPr>
+        <w:t xml:space="preserve">No sticky bar</w:t>
+      </w:r>
+      <w:r>
+        <w:t xml:space="preserve"> </w:t>
+      </w:r>
+      <w:r>
+        <w:t xml:space="preserve">appears as you scroll the page.</w:t>
+      </w:r>
+    </w:p>
+    <w:p>
+      <w:pPr>
+        <w:numPr>
+          <w:ilvl w:val="0"/>
+          <w:numId w:val="1009"/>
+        </w:numPr>
+        <w:pStyle w:val="Compact"/>
+      </w:pPr>
+      <w:r>
+        <w:rPr>
+          <w:bCs/>
+          <w:b/>
+        </w:rPr>
+        <w:t xml:space="preserve">-3 and any page on</w:t>
+      </w:r>
+      <w:r>
+        <w:rPr>
+          <w:bCs/>
+          <w:b/>
+        </w:rPr>
+        <w:t xml:space="preserve"> </w:t>
+      </w:r>
+      <w:r>
+        <w:rPr>
+          <w:rStyle w:val="VerbatimChar"/>
+          <w:bCs/>
+          <w:b/>
+        </w:rPr>
+        <w:t xml:space="preserve">muto-nad-performance</w:t>
+      </w:r>
+      <w:r>
+        <w:rPr>
+          <w:bCs/>
+          <w:b/>
+        </w:rPr>
+        <w:t xml:space="preserve">:</w:t>
+      </w:r>
+      <w:r>
+        <w:t xml:space="preserve"> </w:t>
+      </w:r>
+      <w:r>
+        <w:t xml:space="preserve">no Black Friday box (step 3).</w:t>
+      </w:r>
+    </w:p>
+    <w:p>
+      <w:pPr>
+        <w:numPr>
+          <w:ilvl w:val="0"/>
+          <w:numId w:val="1009"/>
+        </w:numPr>
+        <w:pStyle w:val="Compact"/>
+      </w:pPr>
+      <w:r>
+        <w:rPr>
+          <w:bCs/>
+          <w:b/>
+        </w:rPr>
+        <w:t xml:space="preserve">Travel vial:</w:t>
+      </w:r>
+      <w:r>
+        <w:t xml:space="preserve"> </w:t>
+      </w:r>
+      <w:r>
+        <w:t xml:space="preserve">add the 3-month plan to the cart. The drawer’s gift list shows Travel Vial, £10 struck through, Free. The monthly plan doesn’t get it.</w:t>
+      </w:r>
+    </w:p>
+    <w:p>
+      <w:pPr>
+        <w:numPr>
+          <w:ilvl w:val="0"/>
+          <w:numId w:val="1009"/>
+        </w:numPr>
+        <w:pStyle w:val="Compact"/>
+      </w:pPr>
+      <w:r>
+        <w:rPr>
+          <w:bCs/>
+          <w:b/>
+        </w:rPr>
         <w:t xml:space="preserve">Announcement bar:</w:t>
       </w:r>
       <w:r>
@@ -3767,7 +4167,7 @@
         <w:t xml:space="preserve">(step 5).</w:t>
       </w:r>
     </w:p>
-    <w:bookmarkEnd w:id="29"/>
+    <w:bookmarkEnd w:id="30"/>
     <w:sectPr/>
   </w:body>
 </w:document>
@@ -4144,6 +4544,36 @@
     </w:lvlOverride>
   </w:num>
   <w:num w:numId="1009">
+    <w:abstractNumId w:val="99411"/>
+    <w:lvlOverride w:ilvl="0">
+      <w:startOverride w:val="1"/>
+    </w:lvlOverride>
+    <w:lvlOverride w:ilvl="1">
+      <w:startOverride w:val="1"/>
+    </w:lvlOverride>
+    <w:lvlOverride w:ilvl="2">
+      <w:startOverride w:val="1"/>
+    </w:lvlOverride>
+    <w:lvlOverride w:ilvl="3">
+      <w:startOverride w:val="1"/>
+    </w:lvlOverride>
+    <w:lvlOverride w:ilvl="4">
+      <w:startOverride w:val="1"/>
+    </w:lvlOverride>
+    <w:lvlOverride w:ilvl="5">
+      <w:startOverride w:val="1"/>
+    </w:lvlOverride>
+    <w:lvlOverride w:ilvl="6">
+      <w:startOverride w:val="1"/>
+    </w:lvlOverride>
+    <w:lvlOverride w:ilvl="7">
+      <w:startOverride w:val="1"/>
+    </w:lvlOverride>
+    <w:lvlOverride w:ilvl="8">
+      <w:startOverride w:val="1"/>
+    </w:lvlOverride>
+  </w:num>
+  <w:num w:numId="1010">
     <w:abstractNumId w:val="991"/>
   </w:num>
 </w:numbering>

</xml_diff>

<commit_message>
Problem stats: muscle loss (Volpi 2004) replaces inflammation; NAD+ 'by middle age'; mitochondria line updated
Co-Authored-By: Claude Opus 5.5 <noreply@anthropic.com>
Claude-Session: https://claude.ai/code/session_01VYMABjkorQn2QmgJS9ckGR
</commit_message>
<xml_diff>
--- a/handoff/MUTO_Dev_Handoff_Main_PDP_28Oct2026.docx
+++ b/handoff/MUTO_Dev_Handoff_Main_PDP_28Oct2026.docx
@@ -2285,13 +2285,13 @@
           <w:bCs/>
           <w:b/>
         </w:rPr>
-        <w:t xml:space="preserve">1 in 2</w:t>
-      </w:r>
-      <w:r>
-        <w:t xml:space="preserve"> </w:t>
-      </w:r>
-      <w:r>
-        <w:t xml:space="preserve">deaths are linked to chronic inflammation (Furman et al., Nature Medicine 2019) ·</w:t>
+        <w:t xml:space="preserve">3–8%</w:t>
+      </w:r>
+      <w:r>
+        <w:t xml:space="preserve"> </w:t>
+      </w:r>
+      <w:r>
+        <w:t xml:space="preserve">muscle lost every decade after 30 (Volpi et al., Curr Opin Clin Nutr Metab Care 2004) ·</w:t>
       </w:r>
       <w:r>
         <w:t xml:space="preserve"> </w:t>
@@ -2307,23 +2307,23 @@
         <w:t xml:space="preserve"> </w:t>
       </w:r>
       <w:r>
-        <w:t xml:space="preserve">less NAD+ in skin by middle age (Massudi et al., PLoS ONE 2012, analysed in Peluso et al., Nutrients 2022) ·</w:t>
-      </w:r>
-      <w:r>
-        <w:t xml:space="preserve"> </w:t>
-      </w:r>
-      <w:r>
-        <w:rPr>
-          <w:bCs/>
-          <w:b/>
-        </w:rPr>
-        <w:t xml:space="preserve">50%</w:t>
-      </w:r>
-      <w:r>
-        <w:t xml:space="preserve"> </w:t>
-      </w:r>
-      <w:r>
-        <w:t xml:space="preserve">lower muscle mitochondrial capacity by your late 60s (Conley et al., Journal of Physiology 2000). Sources in a small line underneath.</w:t>
+        <w:t xml:space="preserve">less NAD+ by middle age (Massudi et al., PLoS ONE 2012, analysed in Peluso et al., Nutrients 2022) ·</w:t>
+      </w:r>
+      <w:r>
+        <w:t xml:space="preserve"> </w:t>
+      </w:r>
+      <w:r>
+        <w:rPr>
+          <w:bCs/>
+          <w:b/>
+        </w:rPr>
+        <w:t xml:space="preserve">~50%</w:t>
+      </w:r>
+      <w:r>
+        <w:t xml:space="preserve"> </w:t>
+      </w:r>
+      <w:r>
+        <w:t xml:space="preserve">drop in muscle mitochondrial capacity and energy between your 40s and late 60s (Conley et al., Journal of Physiology 2000). Sources in a small line underneath.</w:t>
       </w:r>
     </w:p>
     <w:p>

</xml_diff>

<commit_message>
Statement: 'The best is still ahead.'
Co-Authored-By: Claude Opus 5.5 <noreply@anthropic.com>
Claude-Session: https://claude.ai/code/session_01VYMABjkorQn2QmgJS9ckGR
</commit_message>
<xml_diff>
--- a/handoff/MUTO_Dev_Handoff_Main_PDP_28Oct2026.docx
+++ b/handoff/MUTO_Dev_Handoff_Main_PDP_28Oct2026.docx
@@ -602,7 +602,7 @@
               <w:t xml:space="preserve">“</w:t>
             </w:r>
             <w:r>
-              <w:t xml:space="preserve">Not ready to slow down.</w:t>
+              <w:t xml:space="preserve">The best is still ahead.</w:t>
             </w:r>
             <w:r>
               <w:t xml:space="preserve">”</w:t>
@@ -2165,7 +2165,7 @@
         <w:t xml:space="preserve">“</w:t>
       </w:r>
       <w:r>
-        <w:t xml:space="preserve">Not ready to slow down.</w:t>
+        <w:t xml:space="preserve">The best is still ahead.</w:t>
       </w:r>
       <w:r>
         <w:t xml:space="preserve">”</w:t>
@@ -2183,7 +2183,7 @@
         <w:t xml:space="preserve">“</w:t>
       </w:r>
       <w:r>
-        <w:t xml:space="preserve">The next-generation multi-nutrient, built for what your body needs in your 40s and 50s.</w:t>
+        <w:t xml:space="preserve">Built for your energy, recovery and sleep in your 40s and 50s. Five supplements in one daily jar.</w:t>
       </w:r>
       <w:r>
         <w:t xml:space="preserve">”</w:t>
@@ -2201,7 +2201,7 @@
         <w:t xml:space="preserve">“</w:t>
       </w:r>
       <w:r>
-        <w:t xml:space="preserve">Got a wearable? Track the shift over 90 days.</w:t>
+        <w:t xml:space="preserve">Track it on your wearable for 90 days, or your money back.</w:t>
       </w:r>
       <w:r>
         <w:t xml:space="preserve">”</w:t>

</xml_diff>

<commit_message>
Problem stats: energy, recovery, longevity, trust
Co-Authored-By: Claude Opus 5.5 <noreply@anthropic.com>
Claude-Session: https://claude.ai/code/session_01VYMABjkorQn2QmgJS9ckGR
</commit_message>
<xml_diff>
--- a/handoff/MUTO_Dev_Handoff_Main_PDP_28Oct2026.docx
+++ b/handoff/MUTO_Dev_Handoff_Main_PDP_28Oct2026.docx
@@ -2259,7 +2259,55 @@
         <w:t xml:space="preserve"> </w:t>
       </w:r>
       <w:r>
-        <w:t xml:space="preserve">Four cards in the standards style (number, lime topic tag, big figure, cyan rule, one line):</w:t>
+        <w:t xml:space="preserve">Four cards in the standards style (number, lime topic tag, big figure, cyan rule, one line): Energy</w:t>
+      </w:r>
+      <w:r>
+        <w:t xml:space="preserve"> </w:t>
+      </w:r>
+      <w:r>
+        <w:rPr>
+          <w:bCs/>
+          <w:b/>
+        </w:rPr>
+        <w:t xml:space="preserve">~50%</w:t>
+      </w:r>
+      <w:r>
+        <w:t xml:space="preserve"> </w:t>
+      </w:r>
+      <w:r>
+        <w:t xml:space="preserve">drop in your muscles’ energy-making capacity between your 40s and late 60s (Conley et al., 2000) · Recovery</w:t>
+      </w:r>
+      <w:r>
+        <w:t xml:space="preserve"> </w:t>
+      </w:r>
+      <w:r>
+        <w:rPr>
+          <w:bCs/>
+          <w:b/>
+        </w:rPr>
+        <w:t xml:space="preserve">~65%</w:t>
+      </w:r>
+      <w:r>
+        <w:t xml:space="preserve"> </w:t>
+      </w:r>
+      <w:r>
+        <w:t xml:space="preserve">more protein per meal needed to switch on muscle repair as you age (Moore et al., 2015) · Longevity</w:t>
+      </w:r>
+      <w:r>
+        <w:t xml:space="preserve"> </w:t>
+      </w:r>
+      <w:r>
+        <w:rPr>
+          <w:bCs/>
+          <w:b/>
+        </w:rPr>
+        <w:t xml:space="preserve">3–8%</w:t>
+      </w:r>
+      <w:r>
+        <w:t xml:space="preserve"> </w:t>
+      </w:r>
+      <w:r>
+        <w:t xml:space="preserve">of muscle lost every decade after 30 (Volpi et al., 2004) · Trust</w:t>
       </w:r>
       <w:r>
         <w:t xml:space="preserve"> </w:t>
@@ -2275,55 +2323,7 @@
         <w:t xml:space="preserve"> </w:t>
       </w:r>
       <w:r>
-        <w:t xml:space="preserve">of supplements tested didn’t match their label (Crawford et al., JAMA Network Open 2022) ·</w:t>
-      </w:r>
-      <w:r>
-        <w:t xml:space="preserve"> </w:t>
-      </w:r>
-      <w:r>
-        <w:rPr>
-          <w:bCs/>
-          <w:b/>
-        </w:rPr>
-        <w:t xml:space="preserve">3–8%</w:t>
-      </w:r>
-      <w:r>
-        <w:t xml:space="preserve"> </w:t>
-      </w:r>
-      <w:r>
-        <w:t xml:space="preserve">muscle lost every decade after 30 (Volpi et al., Curr Opin Clin Nutr Metab Care 2004) ·</w:t>
-      </w:r>
-      <w:r>
-        <w:t xml:space="preserve"> </w:t>
-      </w:r>
-      <w:r>
-        <w:rPr>
-          <w:bCs/>
-          <w:b/>
-        </w:rPr>
-        <w:t xml:space="preserve">50%</w:t>
-      </w:r>
-      <w:r>
-        <w:t xml:space="preserve"> </w:t>
-      </w:r>
-      <w:r>
-        <w:t xml:space="preserve">less NAD+ by middle age (Massudi et al., PLoS ONE 2012, analysed in Peluso et al., Nutrients 2022) ·</w:t>
-      </w:r>
-      <w:r>
-        <w:t xml:space="preserve"> </w:t>
-      </w:r>
-      <w:r>
-        <w:rPr>
-          <w:bCs/>
-          <w:b/>
-        </w:rPr>
-        <w:t xml:space="preserve">~50%</w:t>
-      </w:r>
-      <w:r>
-        <w:t xml:space="preserve"> </w:t>
-      </w:r>
-      <w:r>
-        <w:t xml:space="preserve">drop in muscle mitochondrial capacity and energy between your 40s and late 60s (Conley et al., Journal of Physiology 2000). Sources in a small line underneath.</w:t>
+        <w:t xml:space="preserve">of immune supplements tested didn’t match their label (Crawford et al., 2022). Sources in a small line underneath.</w:t>
       </w:r>
     </w:p>
     <w:p>

</xml_diff>

<commit_message>
Problem stats: recovery card on deep sleep (Van Cauter 2000)
Co-Authored-By: Claude Opus 5.5 <noreply@anthropic.com>
Claude-Session: https://claude.ai/code/session_01VYMABjkorQn2QmgJS9ckGR
</commit_message>
<xml_diff>
--- a/handoff/MUTO_Dev_Handoff_Main_PDP_28Oct2026.docx
+++ b/handoff/MUTO_Dev_Handoff_Main_PDP_28Oct2026.docx
@@ -2285,13 +2285,13 @@
           <w:bCs/>
           <w:b/>
         </w:rPr>
-        <w:t xml:space="preserve">~65%</w:t>
-      </w:r>
-      <w:r>
-        <w:t xml:space="preserve"> </w:t>
-      </w:r>
-      <w:r>
-        <w:t xml:space="preserve">more protein per meal needed to switch on muscle repair as you age (Moore et al., 2015) · Longevity</w:t>
+        <w:t xml:space="preserve">~80%</w:t>
+      </w:r>
+      <w:r>
+        <w:t xml:space="preserve"> </w:t>
+      </w:r>
+      <w:r>
+        <w:t xml:space="preserve">less deep, restorative sleep by midlife than in your early 20s (Van Cauter et al., JAMA 2000) · Longevity</w:t>
       </w:r>
       <w:r>
         <w:t xml:space="preserve"> </w:t>

</xml_diff>